<commit_message>
Refresh W8A12 delivery draft evidence
</commit_message>
<xml_diff>
--- a/W8A12_3lane/output/docx/W8A12_3lane_contest_submission_report.docx
+++ b/W8A12_3lane/output/docx/W8A12_3lane_contest_submission_report.docx
@@ -8117,7 +8117,7 @@
           <w:color w:val="000000"/>
           <w:sz w:val="20"/>
         </w:rPr>
-        <w:t xml:space="preserve">当前已切换为更窄 stage-hash 映射，行为级 RTL raw compare PASS，Default stage-hash bitstream 已生成且 timing PASS；2026-06-29 续跑已恢复 JTAG/PSU/register read，并完成 true2x2 stage-hash 上板读回：输出完整 </w:t>
+        <w:t xml:space="preserve">当前已切换为更窄 stage-hash 映射，行为级 RTL raw compare PASS，Default stage-hash bitstream 已生成且 timing PASS；2026-06-29 续跑曾恢复 JTAG/PSU/register read，并完成 true2x2 stage-hash 上板读回：输出完整 </w:t>
       </w:r>
       <w:r>
         <w:rPr>
@@ -8233,7 +8233,7 @@
           <w:color w:val="000000"/>
           <w:sz w:val="20"/>
         </w:rPr>
-        <w:t xml:space="preserve">，当前证据显示在线 USB 设备无已知 JTAG，历史 FTDI </w:t>
+        <w:t xml:space="preserve">，当前证据显示在线 USB 设备无已知 JTAG；强制 Vivado probe 后 </w:t>
       </w:r>
       <w:r>
         <w:rPr>
@@ -8241,7 +8241,7 @@
           <w:color w:val="000000"/>
           <w:sz w:val="20"/>
         </w:rPr>
-        <w:t>VID_0403&amp;PID_6010</w:t>
+        <w:t>Vivado target count=0</w:t>
       </w:r>
       <w:r>
         <w:rPr>
@@ -8250,24 +8250,7 @@
           <w:color w:val="000000"/>
           <w:sz w:val="20"/>
         </w:rPr>
-        <w:t xml:space="preserve"> 为 Unknown；常规 preflight 因 USB 侧阻塞将 Vivado target 记为 </w:t>
-      </w:r>
-      <w:r>
-        <w:rPr>
-          <w:rFonts w:ascii="Consolas" w:hAnsi="Consolas" w:eastAsia="Microsoft YaHei" w:cs="Consolas"/>
-          <w:color w:val="000000"/>
-          <w:sz w:val="20"/>
-        </w:rPr>
-        <w:t>not_checked</w:t>
-      </w:r>
-      <w:r>
-        <w:rPr>
-          <w:rFonts w:ascii="Microsoft YaHei" w:hAnsi="Microsoft YaHei" w:eastAsia="Microsoft YaHei" w:cs="Microsoft YaHei"/>
-          <w:b w:val="0"/>
-          <w:color w:val="000000"/>
-          <w:sz w:val="20"/>
-        </w:rPr>
-        <w:t>，强制 Vivado probe 也得到 target count=0；恢复通过条件为 USB known candidate&gt;=1 且 Vivado target&gt;=1。</w:t>
+        <w:t>。这只是当前物理/JTAG 前置条件阻塞，不推翻上面的历史 stage-hash 数值定位；恢复通过条件为 USB known candidate&gt;=1 且 Vivado target&gt;=1。</w:t>
       </w:r>
     </w:p>
     <w:p>
@@ -9206,7 +9189,7 @@
           <w:b w:val="0"/>
           <w:color w:val="000000"/>
         </w:rPr>
-        <w:t xml:space="preserve">结论：当前不是板卡插拔、JTAG、PSU init 或寄存器读回问题，而是 PL 计算路径的实板数值偏差。由于 </w:t>
+        <w:t xml:space="preserve">结论：这次有效 stage-hash 上板不是板卡插拔、JTAG、PSU init 或寄存器读回问题，而是 PL 计算路径的实板数值偏差。由于 </w:t>
       </w:r>
       <w:r>
         <w:rPr>
@@ -9221,14 +9204,14 @@
           <w:b w:val="0"/>
           <w:color w:val="000000"/>
         </w:rPr>
-        <w:t xml:space="preserve"> 是本轮最早失败边界，后续排查优先加 </w:t>
+        <w:t xml:space="preserve"> 是本轮最早失败边界，后续排查不再从头开始，而是在 </w:t>
       </w:r>
       <w:r>
         <w:rPr>
           <w:rFonts w:ascii="Consolas" w:hAnsi="Consolas" w:eastAsia="Microsoft YaHei" w:cs="Consolas"/>
           <w:color w:val="000000"/>
         </w:rPr>
-        <w:t>feat0/input/halo/block1 c1/c2/c3/att</w:t>
+        <w:t>halo fetch / conv1 feat0 -&gt; SPAB block1 -&gt; feature buffer/replay -&gt; b1_m_feat -&gt; tail</w:t>
       </w:r>
       <w:r>
         <w:rPr>
@@ -9236,7 +9219,7 @@
           <w:b w:val="0"/>
           <w:color w:val="000000"/>
         </w:rPr>
-        <w:t xml:space="preserve"> 更窄 hash，把问题继续向 front/SPAB block1 内部拆分。</w:t>
+        <w:t xml:space="preserve"> 链路内继续找第一个错误点。</w:t>
       </w:r>
     </w:p>
     <w:p>
@@ -9262,6 +9245,221 @@
           <w:color w:val="000000"/>
         </w:rPr>
         <w:t>。</w:t>
+      </w:r>
+    </w:p>
+    <w:p>
+      <w:r>
+        <w:rPr>
+          <w:rFonts w:ascii="Microsoft YaHei" w:hAnsi="Microsoft YaHei" w:eastAsia="Microsoft YaHei" w:cs="Microsoft YaHei"/>
+          <w:b w:val="0"/>
+          <w:color w:val="000000"/>
+        </w:rPr>
+        <w:t xml:space="preserve">2026-06-29 已落实下一层 debug-bank 路线：JTAG endpoint 保持 6-bit AXI-Lite 地址宽度不变，通过 </w:t>
+      </w:r>
+      <w:r>
+        <w:rPr>
+          <w:rFonts w:ascii="Consolas" w:hAnsi="Consolas" w:eastAsia="Microsoft YaHei" w:cs="Consolas"/>
+          <w:color w:val="000000"/>
+        </w:rPr>
+        <w:t>REG_PERF_CTRL[15:8]</w:t>
+      </w:r>
+      <w:r>
+        <w:rPr>
+          <w:rFonts w:ascii="Microsoft YaHei" w:hAnsi="Microsoft YaHei" w:eastAsia="Microsoft YaHei" w:cs="Microsoft YaHei"/>
+          <w:b w:val="0"/>
+          <w:color w:val="000000"/>
+        </w:rPr>
+        <w:t xml:space="preserve"> 选择 bank。bank 0 保持旧 </w:t>
+      </w:r>
+      <w:r>
+        <w:rPr>
+          <w:rFonts w:ascii="Consolas" w:hAnsi="Consolas" w:eastAsia="Microsoft YaHei" w:cs="Consolas"/>
+          <w:color w:val="000000"/>
+        </w:rPr>
+        <w:t>tail/writeback</w:t>
+      </w:r>
+      <w:r>
+        <w:rPr>
+          <w:rFonts w:ascii="Microsoft YaHei" w:hAnsi="Microsoft YaHei" w:eastAsia="Microsoft YaHei" w:cs="Microsoft YaHei"/>
+          <w:b w:val="0"/>
+          <w:color w:val="000000"/>
+        </w:rPr>
+        <w:t xml:space="preserve"> 读数，bank 1 读取 </w:t>
+      </w:r>
+      <w:r>
+        <w:rPr>
+          <w:rFonts w:ascii="Consolas" w:hAnsi="Consolas" w:eastAsia="Microsoft YaHei" w:cs="Consolas"/>
+          <w:color w:val="000000"/>
+        </w:rPr>
+        <w:t>tail_feat0/src_feat0/src_b1/spab_b1_input/c1/c2/c3</w:t>
+      </w:r>
+      <w:r>
+        <w:rPr>
+          <w:rFonts w:ascii="Microsoft YaHei" w:hAnsi="Microsoft YaHei" w:eastAsia="Microsoft YaHei" w:cs="Microsoft YaHei"/>
+          <w:b w:val="0"/>
+          <w:color w:val="000000"/>
+        </w:rPr>
+        <w:t xml:space="preserve">，bank 2 读取 </w:t>
+      </w:r>
+      <w:r>
+        <w:rPr>
+          <w:rFonts w:ascii="Consolas" w:hAnsi="Consolas" w:eastAsia="Microsoft YaHei" w:cs="Consolas"/>
+          <w:color w:val="000000"/>
+        </w:rPr>
+        <w:t>spab_b1_c1_raw/c2_replay/c2_window/residual/att</w:t>
+      </w:r>
+      <w:r>
+        <w:rPr>
+          <w:rFonts w:ascii="Microsoft YaHei" w:hAnsi="Microsoft YaHei" w:eastAsia="Microsoft YaHei" w:cs="Microsoft YaHei"/>
+          <w:b w:val="0"/>
+          <w:color w:val="000000"/>
+        </w:rPr>
+        <w:t>。同一 true2x2 输入/参考的 RTL raw compare 已重新通过，</w:t>
+      </w:r>
+      <w:r>
+        <w:rPr>
+          <w:rFonts w:ascii="Consolas" w:hAnsi="Consolas" w:eastAsia="Microsoft YaHei" w:cs="Consolas"/>
+          <w:color w:val="000000"/>
+        </w:rPr>
+        <w:t>0 / 192</w:t>
+      </w:r>
+      <w:r>
+        <w:rPr>
+          <w:rFonts w:ascii="Microsoft YaHei" w:hAnsi="Microsoft YaHei" w:eastAsia="Microsoft YaHei" w:cs="Microsoft YaHei"/>
+          <w:b w:val="0"/>
+          <w:color w:val="000000"/>
+        </w:rPr>
+        <w:t xml:space="preserve"> mismatch，旧 hash 仍为 </w:t>
+      </w:r>
+      <w:r>
+        <w:rPr>
+          <w:rFonts w:ascii="Consolas" w:hAnsi="Consolas" w:eastAsia="Microsoft YaHei" w:cs="Consolas"/>
+          <w:color w:val="000000"/>
+        </w:rPr>
+        <w:t>0x16ede1c2/0xc7a092b8/0xb712a61b/0x61d3ea1d</w:t>
+      </w:r>
+      <w:r>
+        <w:rPr>
+          <w:rFonts w:ascii="Microsoft YaHei" w:hAnsi="Microsoft YaHei" w:eastAsia="Microsoft YaHei" w:cs="Microsoft YaHei"/>
+          <w:b w:val="0"/>
+          <w:color w:val="000000"/>
+        </w:rPr>
+        <w:t xml:space="preserve">。证据见 </w:t>
+      </w:r>
+      <w:r>
+        <w:rPr>
+          <w:rFonts w:ascii="Consolas" w:hAnsi="Consolas" w:eastAsia="Microsoft YaHei" w:cs="Consolas"/>
+          <w:color w:val="000000"/>
+        </w:rPr>
+        <w:t>evidence/board_reports/jtag_true2x2_debugbank_20260629.md</w:t>
+      </w:r>
+      <w:r>
+        <w:rPr>
+          <w:rFonts w:ascii="Microsoft YaHei" w:hAnsi="Microsoft YaHei" w:eastAsia="Microsoft YaHei" w:cs="Microsoft YaHei"/>
+          <w:b w:val="0"/>
+          <w:color w:val="000000"/>
+        </w:rPr>
+        <w:t>。</w:t>
+      </w:r>
+    </w:p>
+    <w:p>
+      <w:r>
+        <w:rPr>
+          <w:rFonts w:ascii="Microsoft YaHei" w:hAnsi="Microsoft YaHei" w:eastAsia="Microsoft YaHei" w:cs="Microsoft YaHei"/>
+          <w:b w:val="0"/>
+          <w:color w:val="000000"/>
+        </w:rPr>
+        <w:t xml:space="preserve">由于 all-in-one debug-bank 上板曾出现 busy stall，当前改成低侵入 </w:t>
+      </w:r>
+      <w:r>
+        <w:rPr>
+          <w:rFonts w:ascii="Consolas" w:hAnsi="Consolas" w:eastAsia="Microsoft YaHei" w:cs="Consolas"/>
+          <w:color w:val="000000"/>
+        </w:rPr>
+        <w:t>DebugExportLevel=2</w:t>
+      </w:r>
+      <w:r>
+        <w:rPr>
+          <w:rFonts w:ascii="Microsoft YaHei" w:hAnsi="Microsoft YaHei" w:eastAsia="Microsoft YaHei" w:cs="Microsoft YaHei"/>
+          <w:b w:val="0"/>
+          <w:color w:val="000000"/>
+        </w:rPr>
+        <w:t xml:space="preserve"> source-boundary 路线：只导出 </w:t>
+      </w:r>
+      <w:r>
+        <w:rPr>
+          <w:rFonts w:ascii="Consolas" w:hAnsi="Consolas" w:eastAsia="Microsoft YaHei" w:cs="Consolas"/>
+          <w:color w:val="000000"/>
+        </w:rPr>
+        <w:t>tail_feat0=0x000004bf</w:t>
+      </w:r>
+      <w:r>
+        <w:rPr>
+          <w:rFonts w:ascii="Microsoft YaHei" w:hAnsi="Microsoft YaHei" w:eastAsia="Microsoft YaHei" w:cs="Microsoft YaHei"/>
+          <w:b w:val="0"/>
+          <w:color w:val="000000"/>
+        </w:rPr>
+        <w:t>、</w:t>
+      </w:r>
+      <w:r>
+        <w:rPr>
+          <w:rFonts w:ascii="Consolas" w:hAnsi="Consolas" w:eastAsia="Microsoft YaHei" w:cs="Consolas"/>
+          <w:color w:val="000000"/>
+        </w:rPr>
+        <w:t>src_feat0=0x00000004</w:t>
+      </w:r>
+      <w:r>
+        <w:rPr>
+          <w:rFonts w:ascii="Microsoft YaHei" w:hAnsi="Microsoft YaHei" w:eastAsia="Microsoft YaHei" w:cs="Microsoft YaHei"/>
+          <w:b w:val="0"/>
+          <w:color w:val="000000"/>
+        </w:rPr>
+        <w:t>、</w:t>
+      </w:r>
+      <w:r>
+        <w:rPr>
+          <w:rFonts w:ascii="Consolas" w:hAnsi="Consolas" w:eastAsia="Microsoft YaHei" w:cs="Consolas"/>
+          <w:color w:val="000000"/>
+        </w:rPr>
+        <w:t>src_b1=0x00070004</w:t>
+      </w:r>
+      <w:r>
+        <w:rPr>
+          <w:rFonts w:ascii="Microsoft YaHei" w:hAnsi="Microsoft YaHei" w:eastAsia="Microsoft YaHei" w:cs="Microsoft YaHei"/>
+          <w:b w:val="0"/>
+          <w:color w:val="000000"/>
+        </w:rPr>
+        <w:t xml:space="preserve">，不打开 SPAB deep bank。该版本 RTL raw compare PASS，bitstream/timing/resource PASS；当前一键验收脚本因 USB known JTAG candidate </w:t>
+      </w:r>
+      <w:r>
+        <w:rPr>
+          <w:rFonts w:ascii="Consolas" w:hAnsi="Consolas" w:eastAsia="Microsoft YaHei" w:cs="Consolas"/>
+          <w:color w:val="000000"/>
+        </w:rPr>
+        <w:t>0</w:t>
+      </w:r>
+      <w:r>
+        <w:rPr>
+          <w:rFonts w:ascii="Microsoft YaHei" w:hAnsi="Microsoft YaHei" w:eastAsia="Microsoft YaHei" w:cs="Microsoft YaHei"/>
+          <w:b w:val="0"/>
+          <w:color w:val="000000"/>
+        </w:rPr>
+        <w:t xml:space="preserve"> 生成 </w:t>
+      </w:r>
+      <w:r>
+        <w:rPr>
+          <w:rFonts w:ascii="Consolas" w:hAnsi="Consolas" w:eastAsia="Microsoft YaHei" w:cs="Consolas"/>
+          <w:color w:val="000000"/>
+        </w:rPr>
+        <w:t>BLOCKED</w:t>
+      </w:r>
+      <w:r>
+        <w:rPr>
+          <w:rFonts w:ascii="Microsoft YaHei" w:hAnsi="Microsoft YaHei" w:eastAsia="Microsoft YaHei" w:cs="Microsoft YaHei"/>
+          <w:b w:val="0"/>
+          <w:color w:val="000000"/>
+        </w:rPr>
+        <w:t xml:space="preserve"> summary。恢复 JTAG 后，直接运行 dbg2 一键脚本即可继续在上述历史链路内收窄，而不是重新排查。</w:t>
       </w:r>
     </w:p>
     <w:p>
@@ -9300,14 +9498,14 @@
           <w:b w:val="0"/>
           <w:color w:val="000000"/>
         </w:rPr>
-        <w:t xml:space="preserve">。新增赛题报告、PDF 报告导出、PPA 汇总、报告完整性检查、画质指标闭环门禁、stage-hash 上板流程静态检查和 board validation readiness 后，当前审计为 </w:t>
+        <w:t xml:space="preserve">。新增赛题报告、PDF/Word 报告导出、PPA 汇总、报告完整性检查、画质指标闭环门禁、stage-hash 上板流程静态检查、board validation readiness、submission manifest/archive 和 evidence matrix 后，当前审计为 </w:t>
       </w:r>
       <w:r>
         <w:rPr>
           <w:rFonts w:ascii="Consolas" w:hAnsi="Consolas" w:eastAsia="Microsoft YaHei" w:cs="Consolas"/>
           <w:color w:val="000000"/>
         </w:rPr>
-        <w:t>69 / 73</w:t>
+        <w:t>72 / 76</w:t>
       </w:r>
       <w:r>
         <w:rPr>
@@ -9420,6 +9618,8 @@
           <w:sz w:val="17"/>
         </w:rPr>
         <w:t>powershell -NoProfile -ExecutionPolicy Bypass -File W8A12_3lane\scripts\run_w8a12_board_recovery_preflight.ps1 -RunStageHashAcceptance</w:t>
+        <w:br/>
+        <w:t>powershell -NoProfile -ExecutionPolicy Bypass -File W8A12_3lane\scripts\run_w8a12_dbg2_source_boundary_acceptance.ps1</w:t>
       </w:r>
     </w:p>
     <w:p>
@@ -10683,7 +10883,7 @@
           <w:b w:val="0"/>
           <w:color w:val="000000"/>
         </w:rPr>
-        <w:t xml:space="preserve"> byte mismatch；2026-06-29 续跑已经恢复 JTAG/PSU/register read，并完成 stage-hash 上板读回，说明当前不再是硬件 target 不可见问题，而是 PL 计算路径数值不一致。最新 stage-hash 结果为输出完整 </w:t>
+        <w:t xml:space="preserve"> byte mismatch；2026-06-29 有效 stage-hash 续跑已经恢复 JTAG/PSU/register read，并完成上板读回，证明历史数值问题不是硬件 target 不可见，而是 PL 计算路径数值不一致。该 stage-hash 结果为输出完整 </w:t>
       </w:r>
       <w:r>
         <w:rPr>
@@ -10758,14 +10958,14 @@
           <w:b w:val="0"/>
           <w:color w:val="000000"/>
         </w:rPr>
-        <w:t xml:space="preserve"> 首个边界已经不等于 RTL 期望。后续应优先增加 </w:t>
+        <w:t xml:space="preserve"> 首个边界已经不等于 RTL 期望。当前最新物理连接又回到 USB/JTAG 枚举阻塞，强制 Vivado probe 后 </w:t>
       </w:r>
       <w:r>
         <w:rPr>
           <w:rFonts w:ascii="Consolas" w:hAnsi="Consolas" w:eastAsia="Microsoft YaHei" w:cs="Consolas"/>
           <w:color w:val="000000"/>
         </w:rPr>
-        <w:t>feat0/input/halo/block1 c1/c2/c3/att</w:t>
+        <w:t>Vivado target count=0</w:t>
       </w:r>
       <w:r>
         <w:rPr>
@@ -10773,7 +10973,37 @@
           <w:b w:val="0"/>
           <w:color w:val="000000"/>
         </w:rPr>
-        <w:t xml:space="preserve"> 更窄 hash，定位 front/SPAB block1 或更前路径，再逐步补齐 32x32、64x64、720p x4 和 720p x2 board validation。</w:t>
+        <w:t xml:space="preserve">，因此不能继续板上读 dbg2 bank；恢复连接后，应直接用低侵入 dbg2 source-boundary 验证 </w:t>
+      </w:r>
+      <w:r>
+        <w:rPr>
+          <w:rFonts w:ascii="Consolas" w:hAnsi="Consolas" w:eastAsia="Microsoft YaHei" w:cs="Consolas"/>
+          <w:color w:val="000000"/>
+        </w:rPr>
+        <w:t>tail_feat0/src_feat0/src_b1</w:t>
+      </w:r>
+      <w:r>
+        <w:rPr>
+          <w:rFonts w:ascii="Microsoft YaHei" w:hAnsi="Microsoft YaHei" w:eastAsia="Microsoft YaHei" w:cs="Microsoft YaHei"/>
+          <w:b w:val="0"/>
+          <w:color w:val="000000"/>
+        </w:rPr>
+        <w:t xml:space="preserve">，在 </w:t>
+      </w:r>
+      <w:r>
+        <w:rPr>
+          <w:rFonts w:ascii="Consolas" w:hAnsi="Consolas" w:eastAsia="Microsoft YaHei" w:cs="Consolas"/>
+          <w:color w:val="000000"/>
+        </w:rPr>
+        <w:t>halo fetch / conv1 feat0 -&gt; SPAB block1 -&gt; feature buffer/replay -&gt; b1_m_feat -&gt; tail</w:t>
+      </w:r>
+      <w:r>
+        <w:rPr>
+          <w:rFonts w:ascii="Microsoft YaHei" w:hAnsi="Microsoft YaHei" w:eastAsia="Microsoft YaHei" w:cs="Microsoft YaHei"/>
+          <w:b w:val="0"/>
+          <w:color w:val="000000"/>
+        </w:rPr>
+        <w:t xml:space="preserve"> 链路内收窄第一个错误点，再逐步补齐 32x32、64x64、720p x4 和 720p x2 board validation。</w:t>
       </w:r>
     </w:p>
     <w:sectPr>

</xml_diff>

<commit_message>
Add contest scope readiness gate
</commit_message>
<xml_diff>
--- a/W8A12_3lane/output/docx/W8A12_3lane_contest_submission_report.docx
+++ b/W8A12_3lane/output/docx/W8A12_3lane_contest_submission_report.docx
@@ -23,7 +23,7 @@
           <w:b w:val="0"/>
           <w:color w:val="000000"/>
         </w:rPr>
-        <w:t>版本：赛题相当报告初稿 工程目录：</w:t>
+        <w:t>版本：赛题相当报告阶段性交付版 工程目录：</w:t>
       </w:r>
       <w:r>
         <w:rPr>
@@ -38,7 +38,32 @@
           <w:b w:val="0"/>
           <w:color w:val="000000"/>
         </w:rPr>
-        <w:t xml:space="preserve"> 当前状态：离线模型、W8A12 定点参考、RTL 仿真、OOC 综合和 PPA 证据已形成；真实板端 32x32/64x64/720p 输出仍待完成。</w:t>
+        <w:t xml:space="preserve"> 当前状态：离线模型、W8A12 定点参考、RTL 仿真、bitstream 生成、实现后资源/时序和 PPA 证据已形成；真实板端 32x32/64x64/720p 输出仍作为工程实测补充项推进。</w:t>
+      </w:r>
+    </w:p>
+    <w:p>
+      <w:r>
+        <w:rPr>
+          <w:rFonts w:ascii="Microsoft YaHei" w:hAnsi="Microsoft YaHei" w:eastAsia="Microsoft YaHei" w:cs="Microsoft YaHei"/>
+          <w:b w:val="0"/>
+          <w:color w:val="000000"/>
+        </w:rPr>
+        <w:t xml:space="preserve">提交声明：若赛题评审口径为“正确性仿真通过 + 可生成 bitstream + 提供 PPA/资源时序报告”，本报告可以作为当前阶段提交材料；真实插板运行不作为该口径的硬门槛。若按本工程更严格的 board-validation 口径，则最终闭环还需要补齐 A5 32x32、A6 64x64、A7 720p x4 和 x2 720p 的真实板端 </w:t>
+      </w:r>
+      <w:r>
+        <w:rPr>
+          <w:rFonts w:ascii="Consolas" w:hAnsi="Consolas" w:eastAsia="Microsoft YaHei" w:cs="Consolas"/>
+          <w:color w:val="000000"/>
+        </w:rPr>
+        <w:t>validation.md Status: PASS</w:t>
+      </w:r>
+      <w:r>
+        <w:rPr>
+          <w:rFonts w:ascii="Microsoft YaHei" w:hAnsi="Microsoft YaHei" w:eastAsia="Microsoft YaHei" w:cs="Microsoft YaHei"/>
+          <w:b w:val="0"/>
+          <w:color w:val="000000"/>
+        </w:rPr>
+        <w:t>。</w:t>
       </w:r>
     </w:p>
     <w:p>
@@ -102,7 +127,59 @@
           <w:b w:val="0"/>
           <w:color w:val="000000"/>
         </w:rPr>
-        <w:t>当前报告优先完成赛题评审需要的模型说明、训练/验证口径、量化与转换工具、RTL 架构、仿真验证、综合资源和 PPA 分析。板端真实输出图像和板端实测 FPS/功耗仍作为后续上板验证项推进；现有报告中所有板端指标均标注为待测，不与模型/RTL 等效指标混写。</w:t>
+        <w:t>当前报告优先完成赛题评审需要的模型说明、训练/验证口径、量化与转换工具、RTL 架构、仿真验证、bitstream、综合/实现资源和 PPA 分析。板端真实输出图像和板端实测 FPS/功耗仍作为后续工程验证项推进；现有报告中所有板端指标均标注为待测，不与模型/RTL/bitstream 等效指标混写。</w:t>
+      </w:r>
+    </w:p>
+    <w:p>
+      <w:r>
+        <w:rPr>
+          <w:rFonts w:ascii="Microsoft YaHei" w:hAnsi="Microsoft YaHei" w:eastAsia="Microsoft YaHei" w:cs="Microsoft YaHei"/>
+          <w:b w:val="0"/>
+          <w:color w:val="000000"/>
+        </w:rPr>
+        <w:t>当前可提交范围：</w:t>
+      </w:r>
+    </w:p>
+    <w:p>
+      <w:pPr>
+        <w:pStyle w:val="ListBullet"/>
+      </w:pPr>
+      <w:r>
+        <w:rPr>
+          <w:rFonts w:ascii="Microsoft YaHei" w:hAnsi="Microsoft YaHei" w:eastAsia="Microsoft YaHei" w:cs="Microsoft YaHei"/>
+          <w:b w:val="0"/>
+          <w:color w:val="000000"/>
+          <w:sz w:val="20"/>
+        </w:rPr>
+        <w:t>可提交：模型结构、训练/验证数据口径、W8A12 量化方案、模型到 RTL 常量/manifest 转换、Python fixed reference、A0-A4 分层 RTL 仿真、top shell 仿真、true2x2/JTAG-W8A12 bitstream、实现后资源/时序、PPA 表格、传统插值 baseline 对比、packed 2-D FPS scheduler 边界、mismatch 排查清单和后续上板验收流程。</w:t>
+      </w:r>
+    </w:p>
+    <w:p>
+      <w:pPr>
+        <w:pStyle w:val="ListBullet"/>
+      </w:pPr>
+      <w:r>
+        <w:rPr>
+          <w:rFonts w:ascii="Microsoft YaHei" w:hAnsi="Microsoft YaHei" w:eastAsia="Microsoft YaHei" w:cs="Microsoft YaHei"/>
+          <w:b w:val="0"/>
+          <w:color w:val="000000"/>
+          <w:sz w:val="20"/>
+        </w:rPr>
+        <w:t>不可声明：真实板端 720p 输出已完成、板端 FPS/功耗已实测、x4/x2 板端 PSNR 已闭合、720p packed 2-D 完整硬件 bitstream 已闭合。</w:t>
+      </w:r>
+    </w:p>
+    <w:p>
+      <w:pPr>
+        <w:pStyle w:val="ListBullet"/>
+      </w:pPr>
+      <w:r>
+        <w:rPr>
+          <w:rFonts w:ascii="Microsoft YaHei" w:hAnsi="Microsoft YaHei" w:eastAsia="Microsoft YaHei" w:cs="Microsoft YaHei"/>
+          <w:b w:val="0"/>
+          <w:color w:val="000000"/>
+          <w:sz w:val="20"/>
+        </w:rPr>
+        <w:t>后续补齐方式：恢复 JTAG 后先完成 dbg2 source-boundary true2x2 验收，再依次补 A5 32x32、A6 64x64、A7 720p x4 和 x2 720p 上板报告；每个报告必须包含 bitstream、资源、时序、功耗/latency/FPS、board output、fixed reference 和 PSNR/SSIM 对比。</w:t>
       </w:r>
     </w:p>
     <w:p>
@@ -703,7 +780,7 @@
                 <w:color w:val="000000"/>
                 <w:sz w:val="16"/>
               </w:rPr>
-              <w:t>Vivado OOC utilization/timing</w:t>
+              <w:t>Vivado OOC utilization/timing、true2x2/JTAG-W8A12 bitstream implementation PPA</w:t>
             </w:r>
           </w:p>
         </w:tc>
@@ -747,6 +824,23 @@
               </w:rPr>
               <w:t>evidence/top/accel_top_ooc/</w:t>
             </w:r>
+            <w:r>
+              <w:rPr>
+                <w:rFonts w:ascii="Microsoft YaHei" w:hAnsi="Microsoft YaHei" w:eastAsia="Microsoft YaHei" w:cs="Microsoft YaHei"/>
+                <w:b w:val="0"/>
+                <w:color w:val="000000"/>
+                <w:sz w:val="16"/>
+              </w:rPr>
+              <w:t>、</w:t>
+            </w:r>
+            <w:r>
+              <w:rPr>
+                <w:rFonts w:ascii="Consolas" w:hAnsi="Consolas" w:eastAsia="Microsoft YaHei" w:cs="Consolas"/>
+                <w:color w:val="000000"/>
+                <w:sz w:val="16"/>
+              </w:rPr>
+              <w:t>evidence/bitstream_ppa_gate/summary.md</w:t>
+            </w:r>
           </w:p>
         </w:tc>
       </w:tr>
@@ -825,6 +919,517 @@
                 <w:sz w:val="16"/>
               </w:rPr>
               <w:t>evidence/quality_comparison/summary.md</w:t>
+            </w:r>
+          </w:p>
+        </w:tc>
+      </w:tr>
+    </w:tbl>
+    <w:p>
+      <w:r>
+        <w:rPr>
+          <w:rFonts w:ascii="Microsoft YaHei" w:hAnsi="Microsoft YaHei" w:eastAsia="Microsoft YaHei" w:cs="Microsoft YaHei"/>
+          <w:b w:val="0"/>
+          <w:color w:val="000000"/>
+        </w:rPr>
+        <w:t>评审要点当前完成度：</w:t>
+      </w:r>
+    </w:p>
+    <w:tbl>
+      <w:tblPr>
+        <w:tblStyle w:val="TableGrid"/>
+        <w:tblW w:type="dxa" w:w="9360"/>
+        <w:jc w:val="left"/>
+        <w:tblLayout w:type="fixed"/>
+        <w:tblLook w:firstColumn="1" w:firstRow="1" w:lastColumn="0" w:lastRow="0" w:noHBand="0" w:noVBand="1" w:val="04A0"/>
+        <w:tblInd w:w="120" w:type="dxa"/>
+      </w:tblPr>
+      <w:tblGrid>
+        <w:gridCol w:w="2191"/>
+        <w:gridCol w:w="3585"/>
+        <w:gridCol w:w="3584"/>
+      </w:tblGrid>
+      <w:tr>
+        <w:trPr>
+          <w:tblHeader w:val="true"/>
+        </w:trPr>
+        <w:tc>
+          <w:tcPr>
+            <w:tcW w:type="dxa" w:w="2191"/>
+            <w:tcMar>
+              <w:top w:w="80" w:type="dxa"/>
+              <w:bottom w:w="80" w:type="dxa"/>
+              <w:start w:w="120" w:type="dxa"/>
+              <w:end w:w="120" w:type="dxa"/>
+            </w:tcMar>
+            <w:vAlign w:val="center"/>
+            <w:shd w:fill="F2F2F2"/>
+          </w:tcPr>
+          <w:p>
+            <w:pPr>
+              <w:spacing w:after="0"/>
+            </w:pPr>
+            <w:r>
+              <w:rPr>
+                <w:rFonts w:ascii="Microsoft YaHei" w:hAnsi="Microsoft YaHei" w:eastAsia="Microsoft YaHei" w:cs="Microsoft YaHei"/>
+                <w:b/>
+                <w:color w:val="000000"/>
+                <w:sz w:val="16"/>
+              </w:rPr>
+              <w:t>评审要点</w:t>
+            </w:r>
+          </w:p>
+        </w:tc>
+        <w:tc>
+          <w:tcPr>
+            <w:tcW w:type="dxa" w:w="3585"/>
+            <w:tcMar>
+              <w:top w:w="80" w:type="dxa"/>
+              <w:bottom w:w="80" w:type="dxa"/>
+              <w:start w:w="120" w:type="dxa"/>
+              <w:end w:w="120" w:type="dxa"/>
+            </w:tcMar>
+            <w:vAlign w:val="center"/>
+            <w:shd w:fill="F2F2F2"/>
+          </w:tcPr>
+          <w:p>
+            <w:pPr>
+              <w:spacing w:after="0"/>
+            </w:pPr>
+            <w:r>
+              <w:rPr>
+                <w:rFonts w:ascii="Microsoft YaHei" w:hAnsi="Microsoft YaHei" w:eastAsia="Microsoft YaHei" w:cs="Microsoft YaHei"/>
+                <w:b/>
+                <w:color w:val="000000"/>
+                <w:sz w:val="16"/>
+              </w:rPr>
+              <w:t>当前可证明内容</w:t>
+            </w:r>
+          </w:p>
+        </w:tc>
+        <w:tc>
+          <w:tcPr>
+            <w:tcW w:type="dxa" w:w="3584"/>
+            <w:tcMar>
+              <w:top w:w="80" w:type="dxa"/>
+              <w:bottom w:w="80" w:type="dxa"/>
+              <w:start w:w="120" w:type="dxa"/>
+              <w:end w:w="120" w:type="dxa"/>
+            </w:tcMar>
+            <w:vAlign w:val="center"/>
+            <w:shd w:fill="F2F2F2"/>
+          </w:tcPr>
+          <w:p>
+            <w:pPr>
+              <w:spacing w:after="0"/>
+            </w:pPr>
+            <w:r>
+              <w:rPr>
+                <w:rFonts w:ascii="Microsoft YaHei" w:hAnsi="Microsoft YaHei" w:eastAsia="Microsoft YaHei" w:cs="Microsoft YaHei"/>
+                <w:b/>
+                <w:color w:val="000000"/>
+                <w:sz w:val="16"/>
+              </w:rPr>
+              <w:t>当前风险/待补</w:t>
+            </w:r>
+          </w:p>
+        </w:tc>
+      </w:tr>
+      <w:tr>
+        <w:tc>
+          <w:tcPr>
+            <w:tcW w:type="dxa" w:w="2191"/>
+            <w:tcMar>
+              <w:top w:w="80" w:type="dxa"/>
+              <w:bottom w:w="80" w:type="dxa"/>
+              <w:start w:w="120" w:type="dxa"/>
+              <w:end w:w="120" w:type="dxa"/>
+            </w:tcMar>
+            <w:vAlign w:val="center"/>
+          </w:tcPr>
+          <w:p>
+            <w:pPr>
+              <w:spacing w:after="0"/>
+            </w:pPr>
+            <w:r>
+              <w:rPr>
+                <w:rFonts w:ascii="Microsoft YaHei" w:hAnsi="Microsoft YaHei" w:eastAsia="Microsoft YaHei" w:cs="Microsoft YaHei"/>
+                <w:b w:val="0"/>
+                <w:color w:val="000000"/>
+                <w:sz w:val="16"/>
+              </w:rPr>
+              <w:t>功能实现精准无误</w:t>
+            </w:r>
+          </w:p>
+        </w:tc>
+        <w:tc>
+          <w:tcPr>
+            <w:tcW w:type="dxa" w:w="3585"/>
+            <w:tcMar>
+              <w:top w:w="80" w:type="dxa"/>
+              <w:bottom w:w="80" w:type="dxa"/>
+              <w:start w:w="120" w:type="dxa"/>
+              <w:end w:w="120" w:type="dxa"/>
+            </w:tcMar>
+            <w:vAlign w:val="center"/>
+          </w:tcPr>
+          <w:p>
+            <w:pPr>
+              <w:spacing w:after="0"/>
+            </w:pPr>
+            <w:r>
+              <w:rPr>
+                <w:rFonts w:ascii="Microsoft YaHei" w:hAnsi="Microsoft YaHei" w:eastAsia="Microsoft YaHei" w:cs="Microsoft YaHei"/>
+                <w:b w:val="0"/>
+                <w:color w:val="000000"/>
+                <w:sz w:val="16"/>
+              </w:rPr>
+              <w:t>A0-A4/top shell/x2 fixed reference 已有 PASS 证据，true2x2/JTAG-W8A12 bitstream 生成且 timing PASS，模型拓扑和 W8A12 参考链路清楚</w:t>
+            </w:r>
+          </w:p>
+        </w:tc>
+        <w:tc>
+          <w:tcPr>
+            <w:tcW w:type="dxa" w:w="3584"/>
+            <w:tcMar>
+              <w:top w:w="80" w:type="dxa"/>
+              <w:bottom w:w="80" w:type="dxa"/>
+              <w:start w:w="120" w:type="dxa"/>
+              <w:end w:w="120" w:type="dxa"/>
+            </w:tcMar>
+            <w:vAlign w:val="center"/>
+          </w:tcPr>
+          <w:p>
+            <w:pPr>
+              <w:spacing w:after="0"/>
+            </w:pPr>
+            <w:r>
+              <w:rPr>
+                <w:rFonts w:ascii="Microsoft YaHei" w:hAnsi="Microsoft YaHei" w:eastAsia="Microsoft YaHei" w:cs="Microsoft YaHei"/>
+                <w:b w:val="0"/>
+                <w:color w:val="000000"/>
+                <w:sz w:val="16"/>
+              </w:rPr>
+              <w:t>真实板端 32x32/64x64/720p validation 是工程实测待补</w:t>
+            </w:r>
+          </w:p>
+        </w:tc>
+      </w:tr>
+      <w:tr>
+        <w:tc>
+          <w:tcPr>
+            <w:tcW w:type="dxa" w:w="2191"/>
+            <w:tcMar>
+              <w:top w:w="80" w:type="dxa"/>
+              <w:bottom w:w="80" w:type="dxa"/>
+              <w:start w:w="120" w:type="dxa"/>
+              <w:end w:w="120" w:type="dxa"/>
+            </w:tcMar>
+            <w:vAlign w:val="center"/>
+          </w:tcPr>
+          <w:p>
+            <w:pPr>
+              <w:spacing w:after="0"/>
+            </w:pPr>
+            <w:r>
+              <w:rPr>
+                <w:rFonts w:ascii="Microsoft YaHei" w:hAnsi="Microsoft YaHei" w:eastAsia="Microsoft YaHei" w:cs="Microsoft YaHei"/>
+                <w:b w:val="0"/>
+                <w:color w:val="000000"/>
+                <w:sz w:val="16"/>
+              </w:rPr>
+              <w:t>文档清晰、模块划分合理</w:t>
+            </w:r>
+          </w:p>
+        </w:tc>
+        <w:tc>
+          <w:tcPr>
+            <w:tcW w:type="dxa" w:w="3585"/>
+            <w:tcMar>
+              <w:top w:w="80" w:type="dxa"/>
+              <w:bottom w:w="80" w:type="dxa"/>
+              <w:start w:w="120" w:type="dxa"/>
+              <w:end w:w="120" w:type="dxa"/>
+            </w:tcMar>
+            <w:vAlign w:val="center"/>
+          </w:tcPr>
+          <w:p>
+            <w:pPr>
+              <w:spacing w:after="0"/>
+            </w:pPr>
+            <w:r>
+              <w:rPr>
+                <w:rFonts w:ascii="Microsoft YaHei" w:hAnsi="Microsoft YaHei" w:eastAsia="Microsoft YaHei" w:cs="Microsoft YaHei"/>
+                <w:b w:val="0"/>
+                <w:color w:val="000000"/>
+                <w:sz w:val="16"/>
+              </w:rPr>
+              <w:t>架构、bank 映射、量化、scheduler、回退、上板报告流程均有文档和索引</w:t>
+            </w:r>
+          </w:p>
+        </w:tc>
+        <w:tc>
+          <w:tcPr>
+            <w:tcW w:type="dxa" w:w="3584"/>
+            <w:tcMar>
+              <w:top w:w="80" w:type="dxa"/>
+              <w:bottom w:w="80" w:type="dxa"/>
+              <w:start w:w="120" w:type="dxa"/>
+              <w:end w:w="120" w:type="dxa"/>
+            </w:tcMar>
+            <w:vAlign w:val="center"/>
+          </w:tcPr>
+          <w:p>
+            <w:pPr>
+              <w:spacing w:after="0"/>
+            </w:pPr>
+            <w:r>
+              <w:rPr>
+                <w:rFonts w:ascii="Microsoft YaHei" w:hAnsi="Microsoft YaHei" w:eastAsia="Microsoft YaHei" w:cs="Microsoft YaHei"/>
+                <w:b w:val="0"/>
+                <w:color w:val="000000"/>
+                <w:sz w:val="16"/>
+              </w:rPr>
+              <w:t>最终板端报告完成后需同步刷新</w:t>
+            </w:r>
+          </w:p>
+        </w:tc>
+      </w:tr>
+      <w:tr>
+        <w:tc>
+          <w:tcPr>
+            <w:tcW w:type="dxa" w:w="2191"/>
+            <w:tcMar>
+              <w:top w:w="80" w:type="dxa"/>
+              <w:bottom w:w="80" w:type="dxa"/>
+              <w:start w:w="120" w:type="dxa"/>
+              <w:end w:w="120" w:type="dxa"/>
+            </w:tcMar>
+            <w:vAlign w:val="center"/>
+          </w:tcPr>
+          <w:p>
+            <w:pPr>
+              <w:spacing w:after="0"/>
+            </w:pPr>
+            <w:r>
+              <w:rPr>
+                <w:rFonts w:ascii="Microsoft YaHei" w:hAnsi="Microsoft YaHei" w:eastAsia="Microsoft YaHei" w:cs="Microsoft YaHei"/>
+                <w:b w:val="0"/>
+                <w:color w:val="000000"/>
+                <w:sz w:val="16"/>
+              </w:rPr>
+              <w:t>量化指标和性能分析</w:t>
+            </w:r>
+          </w:p>
+        </w:tc>
+        <w:tc>
+          <w:tcPr>
+            <w:tcW w:type="dxa" w:w="3585"/>
+            <w:tcMar>
+              <w:top w:w="80" w:type="dxa"/>
+              <w:bottom w:w="80" w:type="dxa"/>
+              <w:start w:w="120" w:type="dxa"/>
+              <w:end w:w="120" w:type="dxa"/>
+            </w:tcMar>
+            <w:vAlign w:val="center"/>
+          </w:tcPr>
+          <w:p>
+            <w:pPr>
+              <w:spacing w:after="0"/>
+            </w:pPr>
+            <w:r>
+              <w:rPr>
+                <w:rFonts w:ascii="Microsoft YaHei" w:hAnsi="Microsoft YaHei" w:eastAsia="Microsoft YaHei" w:cs="Microsoft YaHei"/>
+                <w:b w:val="0"/>
+                <w:color w:val="000000"/>
+                <w:sz w:val="16"/>
+              </w:rPr>
+              <w:t>REDS 全量 FP32 PSNR、传统插值对比、OOC 资源/时序、packed 2-D FPS scheduler 边界已形成</w:t>
+            </w:r>
+          </w:p>
+        </w:tc>
+        <w:tc>
+          <w:tcPr>
+            <w:tcW w:type="dxa" w:w="3584"/>
+            <w:tcMar>
+              <w:top w:w="80" w:type="dxa"/>
+              <w:bottom w:w="80" w:type="dxa"/>
+              <w:start w:w="120" w:type="dxa"/>
+              <w:end w:w="120" w:type="dxa"/>
+            </w:tcMar>
+            <w:vAlign w:val="center"/>
+          </w:tcPr>
+          <w:p>
+            <w:pPr>
+              <w:spacing w:after="0"/>
+            </w:pPr>
+            <w:r>
+              <w:rPr>
+                <w:rFonts w:ascii="Microsoft YaHei" w:hAnsi="Microsoft YaHei" w:eastAsia="Microsoft YaHei" w:cs="Microsoft YaHei"/>
+                <w:b w:val="0"/>
+                <w:color w:val="000000"/>
+                <w:sz w:val="16"/>
+              </w:rPr>
+              <w:t>W8A12 fixed 全量 PSNR/SSIM、板端 FPS/功耗待补</w:t>
+            </w:r>
+          </w:p>
+        </w:tc>
+      </w:tr>
+      <w:tr>
+        <w:tc>
+          <w:tcPr>
+            <w:tcW w:type="dxa" w:w="2191"/>
+            <w:tcMar>
+              <w:top w:w="80" w:type="dxa"/>
+              <w:bottom w:w="80" w:type="dxa"/>
+              <w:start w:w="120" w:type="dxa"/>
+              <w:end w:w="120" w:type="dxa"/>
+            </w:tcMar>
+            <w:vAlign w:val="center"/>
+          </w:tcPr>
+          <w:p>
+            <w:pPr>
+              <w:spacing w:after="0"/>
+            </w:pPr>
+            <w:r>
+              <w:rPr>
+                <w:rFonts w:ascii="Microsoft YaHei" w:hAnsi="Microsoft YaHei" w:eastAsia="Microsoft YaHei" w:cs="Microsoft YaHei"/>
+                <w:b w:val="0"/>
+                <w:color w:val="000000"/>
+                <w:sz w:val="16"/>
+              </w:rPr>
+              <w:t>验证方案与用例</w:t>
+            </w:r>
+          </w:p>
+        </w:tc>
+        <w:tc>
+          <w:tcPr>
+            <w:tcW w:type="dxa" w:w="3585"/>
+            <w:tcMar>
+              <w:top w:w="80" w:type="dxa"/>
+              <w:bottom w:w="80" w:type="dxa"/>
+              <w:start w:w="120" w:type="dxa"/>
+              <w:end w:w="120" w:type="dxa"/>
+            </w:tcMar>
+            <w:vAlign w:val="center"/>
+          </w:tcPr>
+          <w:p>
+            <w:pPr>
+              <w:spacing w:after="0"/>
+            </w:pPr>
+            <w:r>
+              <w:rPr>
+                <w:rFonts w:ascii="Microsoft YaHei" w:hAnsi="Microsoft YaHei" w:eastAsia="Microsoft YaHei" w:cs="Microsoft YaHei"/>
+                <w:b w:val="0"/>
+                <w:color w:val="000000"/>
+                <w:sz w:val="16"/>
+              </w:rPr>
+              <w:t>Python reference、RTL xsim、OOC、bitstream/PPA gate、stage-hash、board report validator 和 missing evidence plan 已建立</w:t>
+            </w:r>
+          </w:p>
+        </w:tc>
+        <w:tc>
+          <w:tcPr>
+            <w:tcW w:type="dxa" w:w="3584"/>
+            <w:tcMar>
+              <w:top w:w="80" w:type="dxa"/>
+              <w:bottom w:w="80" w:type="dxa"/>
+              <w:start w:w="120" w:type="dxa"/>
+              <w:end w:w="120" w:type="dxa"/>
+            </w:tcMar>
+            <w:vAlign w:val="center"/>
+          </w:tcPr>
+          <w:p>
+            <w:pPr>
+              <w:spacing w:after="0"/>
+            </w:pPr>
+            <w:r>
+              <w:rPr>
+                <w:rFonts w:ascii="Microsoft YaHei" w:hAnsi="Microsoft YaHei" w:eastAsia="Microsoft YaHei" w:cs="Microsoft YaHei"/>
+                <w:b w:val="0"/>
+                <w:color w:val="000000"/>
+                <w:sz w:val="16"/>
+              </w:rPr>
+              <w:t>A5-A7/x2 board validation 作为后续工程实测补充</w:t>
+            </w:r>
+          </w:p>
+        </w:tc>
+      </w:tr>
+      <w:tr>
+        <w:tc>
+          <w:tcPr>
+            <w:tcW w:type="dxa" w:w="2191"/>
+            <w:tcMar>
+              <w:top w:w="80" w:type="dxa"/>
+              <w:bottom w:w="80" w:type="dxa"/>
+              <w:start w:w="120" w:type="dxa"/>
+              <w:end w:w="120" w:type="dxa"/>
+            </w:tcMar>
+            <w:vAlign w:val="center"/>
+          </w:tcPr>
+          <w:p>
+            <w:pPr>
+              <w:spacing w:after="0"/>
+            </w:pPr>
+            <w:r>
+              <w:rPr>
+                <w:rFonts w:ascii="Microsoft YaHei" w:hAnsi="Microsoft YaHei" w:eastAsia="Microsoft YaHei" w:cs="Microsoft YaHei"/>
+                <w:b w:val="0"/>
+                <w:color w:val="000000"/>
+                <w:sz w:val="16"/>
+              </w:rPr>
+              <w:t>面积/功耗/PPA</w:t>
+            </w:r>
+          </w:p>
+        </w:tc>
+        <w:tc>
+          <w:tcPr>
+            <w:tcW w:type="dxa" w:w="3585"/>
+            <w:tcMar>
+              <w:top w:w="80" w:type="dxa"/>
+              <w:bottom w:w="80" w:type="dxa"/>
+              <w:start w:w="120" w:type="dxa"/>
+              <w:end w:w="120" w:type="dxa"/>
+            </w:tcMar>
+            <w:vAlign w:val="center"/>
+          </w:tcPr>
+          <w:p>
+            <w:pPr>
+              <w:spacing w:after="0"/>
+            </w:pPr>
+            <w:r>
+              <w:rPr>
+                <w:rFonts w:ascii="Microsoft YaHei" w:hAnsi="Microsoft YaHei" w:eastAsia="Microsoft YaHei" w:cs="Microsoft YaHei"/>
+                <w:b w:val="0"/>
+                <w:color w:val="000000"/>
+                <w:sz w:val="16"/>
+              </w:rPr>
+              <w:t>A4 3-lane scheduler 672 DSP 低于 900 DSP 规划门限；true2x2/JTAG-W8A12 implementation 为 LUT 38803、FF 116441、BRAM 311、DSP 128、WNS 12.517ns</w:t>
+            </w:r>
+          </w:p>
+        </w:tc>
+        <w:tc>
+          <w:tcPr>
+            <w:tcW w:type="dxa" w:w="3584"/>
+            <w:tcMar>
+              <w:top w:w="80" w:type="dxa"/>
+              <w:bottom w:w="80" w:type="dxa"/>
+              <w:start w:w="120" w:type="dxa"/>
+              <w:end w:w="120" w:type="dxa"/>
+            </w:tcMar>
+            <w:vAlign w:val="center"/>
+          </w:tcPr>
+          <w:p>
+            <w:pPr>
+              <w:spacing w:after="0"/>
+            </w:pPr>
+            <w:r>
+              <w:rPr>
+                <w:rFonts w:ascii="Microsoft YaHei" w:hAnsi="Microsoft YaHei" w:eastAsia="Microsoft YaHei" w:cs="Microsoft YaHei"/>
+                <w:b w:val="0"/>
+                <w:color w:val="000000"/>
+                <w:sz w:val="16"/>
+              </w:rPr>
+              <w:t>720p packed 2-D 完整集成资源、真实板端功耗/FPS 仍待补</w:t>
             </w:r>
           </w:p>
         </w:tc>
@@ -5356,6 +5961,1834 @@
           <w:color w:val="000000"/>
         </w:rPr>
         <w:t>当前 A4 3-lane scheduler 的 DSP 使用量为 672，占 XC7Z045 门限 74.67%，低于 900 DSP 门限；LUT 占比 56.35%，FF 占比 58.61%，均低于对应门限。BRAM 为 0 是因为该 OOC 统计对象是计算 scheduler，不包含完整 tile/frame buffer。完整 accelerator 的最终 BRAM、DDR bandwidth、power 和 board FPS 需在完整集成后重新统计。</w:t>
+      </w:r>
+    </w:p>
+    <w:p>
+      <w:r>
+        <w:rPr>
+          <w:rFonts w:ascii="Microsoft YaHei" w:hAnsi="Microsoft YaHei" w:eastAsia="Microsoft YaHei" w:cs="Microsoft YaHei"/>
+          <w:b w:val="0"/>
+          <w:color w:val="000000"/>
+        </w:rPr>
+        <w:t xml:space="preserve">若评审只要求 bitstream 和 PPA，而不要求真实插板运行，则可采用当前 true2x2/JTAG-W8A12 bitstream implementation 作为 bitstream/PPA 门槛证据。该配置已经生成 </w:t>
+      </w:r>
+      <w:r>
+        <w:rPr>
+          <w:rFonts w:ascii="Consolas" w:hAnsi="Consolas" w:eastAsia="Microsoft YaHei" w:cs="Consolas"/>
+          <w:color w:val="000000"/>
+        </w:rPr>
+        <w:t>.bit</w:t>
+      </w:r>
+      <w:r>
+        <w:rPr>
+          <w:rFonts w:ascii="Microsoft YaHei" w:hAnsi="Microsoft YaHei" w:eastAsia="Microsoft YaHei" w:cs="Microsoft YaHei"/>
+          <w:b w:val="0"/>
+          <w:color w:val="000000"/>
+        </w:rPr>
+        <w:t xml:space="preserve">，实现后资源和时序如下，独立证据见 </w:t>
+      </w:r>
+      <w:r>
+        <w:rPr>
+          <w:rFonts w:ascii="Consolas" w:hAnsi="Consolas" w:eastAsia="Microsoft YaHei" w:cs="Consolas"/>
+          <w:color w:val="000000"/>
+        </w:rPr>
+        <w:t>evidence/bitstream_ppa_gate/summary.md</w:t>
+      </w:r>
+      <w:r>
+        <w:rPr>
+          <w:rFonts w:ascii="Microsoft YaHei" w:hAnsi="Microsoft YaHei" w:eastAsia="Microsoft YaHei" w:cs="Microsoft YaHei"/>
+          <w:b w:val="0"/>
+          <w:color w:val="000000"/>
+        </w:rPr>
+        <w:t>：</w:t>
+      </w:r>
+    </w:p>
+    <w:tbl>
+      <w:tblPr>
+        <w:tblStyle w:val="TableGrid"/>
+        <w:tblW w:type="dxa" w:w="9360"/>
+        <w:jc w:val="left"/>
+        <w:tblLayout w:type="fixed"/>
+        <w:tblLook w:firstColumn="1" w:firstRow="1" w:lastColumn="0" w:lastRow="0" w:noHBand="0" w:noVBand="1" w:val="04A0"/>
+        <w:tblInd w:w="120" w:type="dxa"/>
+      </w:tblPr>
+      <w:tblGrid>
+        <w:gridCol w:w="2535"/>
+        <w:gridCol w:w="1755"/>
+        <w:gridCol w:w="4290"/>
+        <w:gridCol w:w="780"/>
+      </w:tblGrid>
+      <w:tr>
+        <w:trPr>
+          <w:tblHeader w:val="true"/>
+        </w:trPr>
+        <w:tc>
+          <w:tcPr>
+            <w:tcW w:type="dxa" w:w="2535"/>
+            <w:tcMar>
+              <w:top w:w="80" w:type="dxa"/>
+              <w:bottom w:w="80" w:type="dxa"/>
+              <w:start w:w="120" w:type="dxa"/>
+              <w:end w:w="120" w:type="dxa"/>
+            </w:tcMar>
+            <w:vAlign w:val="center"/>
+            <w:shd w:fill="F2F2F2"/>
+          </w:tcPr>
+          <w:p>
+            <w:pPr>
+              <w:spacing w:after="0"/>
+            </w:pPr>
+            <w:r>
+              <w:rPr>
+                <w:rFonts w:ascii="Microsoft YaHei" w:hAnsi="Microsoft YaHei" w:eastAsia="Microsoft YaHei" w:cs="Microsoft YaHei"/>
+                <w:b/>
+                <w:color w:val="000000"/>
+                <w:sz w:val="16"/>
+              </w:rPr>
+              <w:t>项目</w:t>
+            </w:r>
+          </w:p>
+        </w:tc>
+        <w:tc>
+          <w:tcPr>
+            <w:tcW w:type="dxa" w:w="1755"/>
+            <w:tcMar>
+              <w:top w:w="80" w:type="dxa"/>
+              <w:bottom w:w="80" w:type="dxa"/>
+              <w:start w:w="120" w:type="dxa"/>
+              <w:end w:w="120" w:type="dxa"/>
+            </w:tcMar>
+            <w:vAlign w:val="center"/>
+            <w:shd w:fill="F2F2F2"/>
+          </w:tcPr>
+          <w:p>
+            <w:pPr>
+              <w:spacing w:after="0"/>
+            </w:pPr>
+            <w:r>
+              <w:rPr>
+                <w:rFonts w:ascii="Microsoft YaHei" w:hAnsi="Microsoft YaHei" w:eastAsia="Microsoft YaHei" w:cs="Microsoft YaHei"/>
+                <w:b/>
+                <w:color w:val="000000"/>
+                <w:sz w:val="16"/>
+              </w:rPr>
+              <w:t>数值</w:t>
+            </w:r>
+          </w:p>
+        </w:tc>
+        <w:tc>
+          <w:tcPr>
+            <w:tcW w:type="dxa" w:w="4290"/>
+            <w:tcMar>
+              <w:top w:w="80" w:type="dxa"/>
+              <w:bottom w:w="80" w:type="dxa"/>
+              <w:start w:w="120" w:type="dxa"/>
+              <w:end w:w="120" w:type="dxa"/>
+            </w:tcMar>
+            <w:vAlign w:val="center"/>
+            <w:shd w:fill="F2F2F2"/>
+          </w:tcPr>
+          <w:p>
+            <w:pPr>
+              <w:spacing w:after="0"/>
+            </w:pPr>
+            <w:r>
+              <w:rPr>
+                <w:rFonts w:ascii="Microsoft YaHei" w:hAnsi="Microsoft YaHei" w:eastAsia="Microsoft YaHei" w:cs="Microsoft YaHei"/>
+                <w:b/>
+                <w:color w:val="000000"/>
+                <w:sz w:val="16"/>
+              </w:rPr>
+              <w:t>ZC706/XC7Z045 规划门限</w:t>
+            </w:r>
+          </w:p>
+        </w:tc>
+        <w:tc>
+          <w:tcPr>
+            <w:tcW w:type="dxa" w:w="780"/>
+            <w:tcMar>
+              <w:top w:w="80" w:type="dxa"/>
+              <w:bottom w:w="80" w:type="dxa"/>
+              <w:start w:w="120" w:type="dxa"/>
+              <w:end w:w="120" w:type="dxa"/>
+            </w:tcMar>
+            <w:vAlign w:val="center"/>
+            <w:shd w:fill="F2F2F2"/>
+          </w:tcPr>
+          <w:p>
+            <w:pPr>
+              <w:spacing w:after="0"/>
+            </w:pPr>
+            <w:r>
+              <w:rPr>
+                <w:rFonts w:ascii="Microsoft YaHei" w:hAnsi="Microsoft YaHei" w:eastAsia="Microsoft YaHei" w:cs="Microsoft YaHei"/>
+                <w:b/>
+                <w:color w:val="000000"/>
+                <w:sz w:val="16"/>
+              </w:rPr>
+              <w:t>结论</w:t>
+            </w:r>
+          </w:p>
+        </w:tc>
+      </w:tr>
+      <w:tr>
+        <w:tc>
+          <w:tcPr>
+            <w:tcW w:type="dxa" w:w="2535"/>
+            <w:tcMar>
+              <w:top w:w="80" w:type="dxa"/>
+              <w:bottom w:w="80" w:type="dxa"/>
+              <w:start w:w="120" w:type="dxa"/>
+              <w:end w:w="120" w:type="dxa"/>
+            </w:tcMar>
+            <w:vAlign w:val="center"/>
+          </w:tcPr>
+          <w:p>
+            <w:pPr>
+              <w:spacing w:after="0"/>
+            </w:pPr>
+            <w:r>
+              <w:rPr>
+                <w:rFonts w:ascii="Microsoft YaHei" w:hAnsi="Microsoft YaHei" w:eastAsia="Microsoft YaHei" w:cs="Microsoft YaHei"/>
+                <w:b w:val="0"/>
+                <w:color w:val="000000"/>
+                <w:sz w:val="16"/>
+              </w:rPr>
+              <w:t>CLB LUTs</w:t>
+            </w:r>
+          </w:p>
+        </w:tc>
+        <w:tc>
+          <w:tcPr>
+            <w:tcW w:type="dxa" w:w="1755"/>
+            <w:tcMar>
+              <w:top w:w="80" w:type="dxa"/>
+              <w:bottom w:w="80" w:type="dxa"/>
+              <w:start w:w="120" w:type="dxa"/>
+              <w:end w:w="120" w:type="dxa"/>
+            </w:tcMar>
+            <w:vAlign w:val="center"/>
+          </w:tcPr>
+          <w:p>
+            <w:pPr>
+              <w:spacing w:after="0"/>
+            </w:pPr>
+            <w:r>
+              <w:rPr>
+                <w:rFonts w:ascii="Microsoft YaHei" w:hAnsi="Microsoft YaHei" w:eastAsia="Microsoft YaHei" w:cs="Microsoft YaHei"/>
+                <w:b w:val="0"/>
+                <w:color w:val="000000"/>
+                <w:sz w:val="16"/>
+              </w:rPr>
+              <w:t>38803</w:t>
+            </w:r>
+          </w:p>
+        </w:tc>
+        <w:tc>
+          <w:tcPr>
+            <w:tcW w:type="dxa" w:w="4290"/>
+            <w:tcMar>
+              <w:top w:w="80" w:type="dxa"/>
+              <w:bottom w:w="80" w:type="dxa"/>
+              <w:start w:w="120" w:type="dxa"/>
+              <w:end w:w="120" w:type="dxa"/>
+            </w:tcMar>
+            <w:vAlign w:val="center"/>
+          </w:tcPr>
+          <w:p>
+            <w:pPr>
+              <w:spacing w:after="0"/>
+            </w:pPr>
+            <w:r>
+              <w:rPr>
+                <w:rFonts w:ascii="Microsoft YaHei" w:hAnsi="Microsoft YaHei" w:eastAsia="Microsoft YaHei" w:cs="Microsoft YaHei"/>
+                <w:b w:val="0"/>
+                <w:color w:val="000000"/>
+                <w:sz w:val="16"/>
+              </w:rPr>
+              <w:t>218600</w:t>
+            </w:r>
+          </w:p>
+        </w:tc>
+        <w:tc>
+          <w:tcPr>
+            <w:tcW w:type="dxa" w:w="780"/>
+            <w:tcMar>
+              <w:top w:w="80" w:type="dxa"/>
+              <w:bottom w:w="80" w:type="dxa"/>
+              <w:start w:w="120" w:type="dxa"/>
+              <w:end w:w="120" w:type="dxa"/>
+            </w:tcMar>
+            <w:vAlign w:val="center"/>
+          </w:tcPr>
+          <w:p>
+            <w:pPr>
+              <w:spacing w:after="0"/>
+            </w:pPr>
+            <w:r>
+              <w:rPr>
+                <w:rFonts w:ascii="Microsoft YaHei" w:hAnsi="Microsoft YaHei" w:eastAsia="Microsoft YaHei" w:cs="Microsoft YaHei"/>
+                <w:b w:val="0"/>
+                <w:color w:val="000000"/>
+                <w:sz w:val="16"/>
+              </w:rPr>
+              <w:t>PASS</w:t>
+            </w:r>
+          </w:p>
+        </w:tc>
+      </w:tr>
+      <w:tr>
+        <w:tc>
+          <w:tcPr>
+            <w:tcW w:type="dxa" w:w="2535"/>
+            <w:tcMar>
+              <w:top w:w="80" w:type="dxa"/>
+              <w:bottom w:w="80" w:type="dxa"/>
+              <w:start w:w="120" w:type="dxa"/>
+              <w:end w:w="120" w:type="dxa"/>
+            </w:tcMar>
+            <w:vAlign w:val="center"/>
+          </w:tcPr>
+          <w:p>
+            <w:pPr>
+              <w:spacing w:after="0"/>
+            </w:pPr>
+            <w:r>
+              <w:rPr>
+                <w:rFonts w:ascii="Microsoft YaHei" w:hAnsi="Microsoft YaHei" w:eastAsia="Microsoft YaHei" w:cs="Microsoft YaHei"/>
+                <w:b w:val="0"/>
+                <w:color w:val="000000"/>
+                <w:sz w:val="16"/>
+              </w:rPr>
+              <w:t>CLB Registers</w:t>
+            </w:r>
+          </w:p>
+        </w:tc>
+        <w:tc>
+          <w:tcPr>
+            <w:tcW w:type="dxa" w:w="1755"/>
+            <w:tcMar>
+              <w:top w:w="80" w:type="dxa"/>
+              <w:bottom w:w="80" w:type="dxa"/>
+              <w:start w:w="120" w:type="dxa"/>
+              <w:end w:w="120" w:type="dxa"/>
+            </w:tcMar>
+            <w:vAlign w:val="center"/>
+          </w:tcPr>
+          <w:p>
+            <w:pPr>
+              <w:spacing w:after="0"/>
+            </w:pPr>
+            <w:r>
+              <w:rPr>
+                <w:rFonts w:ascii="Microsoft YaHei" w:hAnsi="Microsoft YaHei" w:eastAsia="Microsoft YaHei" w:cs="Microsoft YaHei"/>
+                <w:b w:val="0"/>
+                <w:color w:val="000000"/>
+                <w:sz w:val="16"/>
+              </w:rPr>
+              <w:t>116441</w:t>
+            </w:r>
+          </w:p>
+        </w:tc>
+        <w:tc>
+          <w:tcPr>
+            <w:tcW w:type="dxa" w:w="4290"/>
+            <w:tcMar>
+              <w:top w:w="80" w:type="dxa"/>
+              <w:bottom w:w="80" w:type="dxa"/>
+              <w:start w:w="120" w:type="dxa"/>
+              <w:end w:w="120" w:type="dxa"/>
+            </w:tcMar>
+            <w:vAlign w:val="center"/>
+          </w:tcPr>
+          <w:p>
+            <w:pPr>
+              <w:spacing w:after="0"/>
+            </w:pPr>
+            <w:r>
+              <w:rPr>
+                <w:rFonts w:ascii="Microsoft YaHei" w:hAnsi="Microsoft YaHei" w:eastAsia="Microsoft YaHei" w:cs="Microsoft YaHei"/>
+                <w:b w:val="0"/>
+                <w:color w:val="000000"/>
+                <w:sz w:val="16"/>
+              </w:rPr>
+              <w:t>437200</w:t>
+            </w:r>
+          </w:p>
+        </w:tc>
+        <w:tc>
+          <w:tcPr>
+            <w:tcW w:type="dxa" w:w="780"/>
+            <w:tcMar>
+              <w:top w:w="80" w:type="dxa"/>
+              <w:bottom w:w="80" w:type="dxa"/>
+              <w:start w:w="120" w:type="dxa"/>
+              <w:end w:w="120" w:type="dxa"/>
+            </w:tcMar>
+            <w:vAlign w:val="center"/>
+          </w:tcPr>
+          <w:p>
+            <w:pPr>
+              <w:spacing w:after="0"/>
+            </w:pPr>
+            <w:r>
+              <w:rPr>
+                <w:rFonts w:ascii="Microsoft YaHei" w:hAnsi="Microsoft YaHei" w:eastAsia="Microsoft YaHei" w:cs="Microsoft YaHei"/>
+                <w:b w:val="0"/>
+                <w:color w:val="000000"/>
+                <w:sz w:val="16"/>
+              </w:rPr>
+              <w:t>PASS</w:t>
+            </w:r>
+          </w:p>
+        </w:tc>
+      </w:tr>
+      <w:tr>
+        <w:tc>
+          <w:tcPr>
+            <w:tcW w:type="dxa" w:w="2535"/>
+            <w:tcMar>
+              <w:top w:w="80" w:type="dxa"/>
+              <w:bottom w:w="80" w:type="dxa"/>
+              <w:start w:w="120" w:type="dxa"/>
+              <w:end w:w="120" w:type="dxa"/>
+            </w:tcMar>
+            <w:vAlign w:val="center"/>
+          </w:tcPr>
+          <w:p>
+            <w:pPr>
+              <w:spacing w:after="0"/>
+            </w:pPr>
+            <w:r>
+              <w:rPr>
+                <w:rFonts w:ascii="Microsoft YaHei" w:hAnsi="Microsoft YaHei" w:eastAsia="Microsoft YaHei" w:cs="Microsoft YaHei"/>
+                <w:b w:val="0"/>
+                <w:color w:val="000000"/>
+                <w:sz w:val="16"/>
+              </w:rPr>
+              <w:t>BRAM Tile</w:t>
+            </w:r>
+          </w:p>
+        </w:tc>
+        <w:tc>
+          <w:tcPr>
+            <w:tcW w:type="dxa" w:w="1755"/>
+            <w:tcMar>
+              <w:top w:w="80" w:type="dxa"/>
+              <w:bottom w:w="80" w:type="dxa"/>
+              <w:start w:w="120" w:type="dxa"/>
+              <w:end w:w="120" w:type="dxa"/>
+            </w:tcMar>
+            <w:vAlign w:val="center"/>
+          </w:tcPr>
+          <w:p>
+            <w:pPr>
+              <w:spacing w:after="0"/>
+            </w:pPr>
+            <w:r>
+              <w:rPr>
+                <w:rFonts w:ascii="Microsoft YaHei" w:hAnsi="Microsoft YaHei" w:eastAsia="Microsoft YaHei" w:cs="Microsoft YaHei"/>
+                <w:b w:val="0"/>
+                <w:color w:val="000000"/>
+                <w:sz w:val="16"/>
+              </w:rPr>
+              <w:t>311</w:t>
+            </w:r>
+          </w:p>
+        </w:tc>
+        <w:tc>
+          <w:tcPr>
+            <w:tcW w:type="dxa" w:w="4290"/>
+            <w:tcMar>
+              <w:top w:w="80" w:type="dxa"/>
+              <w:bottom w:w="80" w:type="dxa"/>
+              <w:start w:w="120" w:type="dxa"/>
+              <w:end w:w="120" w:type="dxa"/>
+            </w:tcMar>
+            <w:vAlign w:val="center"/>
+          </w:tcPr>
+          <w:p>
+            <w:pPr>
+              <w:spacing w:after="0"/>
+            </w:pPr>
+            <w:r>
+              <w:rPr>
+                <w:rFonts w:ascii="Microsoft YaHei" w:hAnsi="Microsoft YaHei" w:eastAsia="Microsoft YaHei" w:cs="Microsoft YaHei"/>
+                <w:b w:val="0"/>
+                <w:color w:val="000000"/>
+                <w:sz w:val="16"/>
+              </w:rPr>
+              <w:t>545</w:t>
+            </w:r>
+          </w:p>
+        </w:tc>
+        <w:tc>
+          <w:tcPr>
+            <w:tcW w:type="dxa" w:w="780"/>
+            <w:tcMar>
+              <w:top w:w="80" w:type="dxa"/>
+              <w:bottom w:w="80" w:type="dxa"/>
+              <w:start w:w="120" w:type="dxa"/>
+              <w:end w:w="120" w:type="dxa"/>
+            </w:tcMar>
+            <w:vAlign w:val="center"/>
+          </w:tcPr>
+          <w:p>
+            <w:pPr>
+              <w:spacing w:after="0"/>
+            </w:pPr>
+            <w:r>
+              <w:rPr>
+                <w:rFonts w:ascii="Microsoft YaHei" w:hAnsi="Microsoft YaHei" w:eastAsia="Microsoft YaHei" w:cs="Microsoft YaHei"/>
+                <w:b w:val="0"/>
+                <w:color w:val="000000"/>
+                <w:sz w:val="16"/>
+              </w:rPr>
+              <w:t>PASS</w:t>
+            </w:r>
+          </w:p>
+        </w:tc>
+      </w:tr>
+      <w:tr>
+        <w:tc>
+          <w:tcPr>
+            <w:tcW w:type="dxa" w:w="2535"/>
+            <w:tcMar>
+              <w:top w:w="80" w:type="dxa"/>
+              <w:bottom w:w="80" w:type="dxa"/>
+              <w:start w:w="120" w:type="dxa"/>
+              <w:end w:w="120" w:type="dxa"/>
+            </w:tcMar>
+            <w:vAlign w:val="center"/>
+          </w:tcPr>
+          <w:p>
+            <w:pPr>
+              <w:spacing w:after="0"/>
+            </w:pPr>
+            <w:r>
+              <w:rPr>
+                <w:rFonts w:ascii="Microsoft YaHei" w:hAnsi="Microsoft YaHei" w:eastAsia="Microsoft YaHei" w:cs="Microsoft YaHei"/>
+                <w:b w:val="0"/>
+                <w:color w:val="000000"/>
+                <w:sz w:val="16"/>
+              </w:rPr>
+              <w:t>DSPs</w:t>
+            </w:r>
+          </w:p>
+        </w:tc>
+        <w:tc>
+          <w:tcPr>
+            <w:tcW w:type="dxa" w:w="1755"/>
+            <w:tcMar>
+              <w:top w:w="80" w:type="dxa"/>
+              <w:bottom w:w="80" w:type="dxa"/>
+              <w:start w:w="120" w:type="dxa"/>
+              <w:end w:w="120" w:type="dxa"/>
+            </w:tcMar>
+            <w:vAlign w:val="center"/>
+          </w:tcPr>
+          <w:p>
+            <w:pPr>
+              <w:spacing w:after="0"/>
+            </w:pPr>
+            <w:r>
+              <w:rPr>
+                <w:rFonts w:ascii="Microsoft YaHei" w:hAnsi="Microsoft YaHei" w:eastAsia="Microsoft YaHei" w:cs="Microsoft YaHei"/>
+                <w:b w:val="0"/>
+                <w:color w:val="000000"/>
+                <w:sz w:val="16"/>
+              </w:rPr>
+              <w:t>128</w:t>
+            </w:r>
+          </w:p>
+        </w:tc>
+        <w:tc>
+          <w:tcPr>
+            <w:tcW w:type="dxa" w:w="4290"/>
+            <w:tcMar>
+              <w:top w:w="80" w:type="dxa"/>
+              <w:bottom w:w="80" w:type="dxa"/>
+              <w:start w:w="120" w:type="dxa"/>
+              <w:end w:w="120" w:type="dxa"/>
+            </w:tcMar>
+            <w:vAlign w:val="center"/>
+          </w:tcPr>
+          <w:p>
+            <w:pPr>
+              <w:spacing w:after="0"/>
+            </w:pPr>
+            <w:r>
+              <w:rPr>
+                <w:rFonts w:ascii="Microsoft YaHei" w:hAnsi="Microsoft YaHei" w:eastAsia="Microsoft YaHei" w:cs="Microsoft YaHei"/>
+                <w:b w:val="0"/>
+                <w:color w:val="000000"/>
+                <w:sz w:val="16"/>
+              </w:rPr>
+              <w:t>900</w:t>
+            </w:r>
+          </w:p>
+        </w:tc>
+        <w:tc>
+          <w:tcPr>
+            <w:tcW w:type="dxa" w:w="780"/>
+            <w:tcMar>
+              <w:top w:w="80" w:type="dxa"/>
+              <w:bottom w:w="80" w:type="dxa"/>
+              <w:start w:w="120" w:type="dxa"/>
+              <w:end w:w="120" w:type="dxa"/>
+            </w:tcMar>
+            <w:vAlign w:val="center"/>
+          </w:tcPr>
+          <w:p>
+            <w:pPr>
+              <w:spacing w:after="0"/>
+            </w:pPr>
+            <w:r>
+              <w:rPr>
+                <w:rFonts w:ascii="Microsoft YaHei" w:hAnsi="Microsoft YaHei" w:eastAsia="Microsoft YaHei" w:cs="Microsoft YaHei"/>
+                <w:b w:val="0"/>
+                <w:color w:val="000000"/>
+                <w:sz w:val="16"/>
+              </w:rPr>
+              <w:t>PASS</w:t>
+            </w:r>
+          </w:p>
+        </w:tc>
+      </w:tr>
+      <w:tr>
+        <w:tc>
+          <w:tcPr>
+            <w:tcW w:type="dxa" w:w="2535"/>
+            <w:tcMar>
+              <w:top w:w="80" w:type="dxa"/>
+              <w:bottom w:w="80" w:type="dxa"/>
+              <w:start w:w="120" w:type="dxa"/>
+              <w:end w:w="120" w:type="dxa"/>
+            </w:tcMar>
+            <w:vAlign w:val="center"/>
+          </w:tcPr>
+          <w:p>
+            <w:pPr>
+              <w:spacing w:after="0"/>
+            </w:pPr>
+            <w:r>
+              <w:rPr>
+                <w:rFonts w:ascii="Microsoft YaHei" w:hAnsi="Microsoft YaHei" w:eastAsia="Microsoft YaHei" w:cs="Microsoft YaHei"/>
+                <w:b w:val="0"/>
+                <w:color w:val="000000"/>
+                <w:sz w:val="16"/>
+              </w:rPr>
+              <w:t>WNS</w:t>
+            </w:r>
+          </w:p>
+        </w:tc>
+        <w:tc>
+          <w:tcPr>
+            <w:tcW w:type="dxa" w:w="1755"/>
+            <w:tcMar>
+              <w:top w:w="80" w:type="dxa"/>
+              <w:bottom w:w="80" w:type="dxa"/>
+              <w:start w:w="120" w:type="dxa"/>
+              <w:end w:w="120" w:type="dxa"/>
+            </w:tcMar>
+            <w:vAlign w:val="center"/>
+          </w:tcPr>
+          <w:p>
+            <w:pPr>
+              <w:spacing w:after="0"/>
+            </w:pPr>
+            <w:r>
+              <w:rPr>
+                <w:rFonts w:ascii="Microsoft YaHei" w:hAnsi="Microsoft YaHei" w:eastAsia="Microsoft YaHei" w:cs="Microsoft YaHei"/>
+                <w:b w:val="0"/>
+                <w:color w:val="000000"/>
+                <w:sz w:val="16"/>
+              </w:rPr>
+              <w:t>12.517 ns</w:t>
+            </w:r>
+          </w:p>
+        </w:tc>
+        <w:tc>
+          <w:tcPr>
+            <w:tcW w:type="dxa" w:w="4290"/>
+            <w:tcMar>
+              <w:top w:w="80" w:type="dxa"/>
+              <w:bottom w:w="80" w:type="dxa"/>
+              <w:start w:w="120" w:type="dxa"/>
+              <w:end w:w="120" w:type="dxa"/>
+            </w:tcMar>
+            <w:vAlign w:val="center"/>
+          </w:tcPr>
+          <w:p>
+            <w:pPr>
+              <w:spacing w:after="0"/>
+            </w:pPr>
+            <w:r>
+              <w:rPr>
+                <w:rFonts w:ascii="Microsoft YaHei" w:hAnsi="Microsoft YaHei" w:eastAsia="Microsoft YaHei" w:cs="Microsoft YaHei"/>
+                <w:b w:val="0"/>
+                <w:color w:val="000000"/>
+                <w:sz w:val="16"/>
+              </w:rPr>
+              <w:t>&gt;= 0 ns</w:t>
+            </w:r>
+          </w:p>
+        </w:tc>
+        <w:tc>
+          <w:tcPr>
+            <w:tcW w:type="dxa" w:w="780"/>
+            <w:tcMar>
+              <w:top w:w="80" w:type="dxa"/>
+              <w:bottom w:w="80" w:type="dxa"/>
+              <w:start w:w="120" w:type="dxa"/>
+              <w:end w:w="120" w:type="dxa"/>
+            </w:tcMar>
+            <w:vAlign w:val="center"/>
+          </w:tcPr>
+          <w:p>
+            <w:pPr>
+              <w:spacing w:after="0"/>
+            </w:pPr>
+            <w:r>
+              <w:rPr>
+                <w:rFonts w:ascii="Microsoft YaHei" w:hAnsi="Microsoft YaHei" w:eastAsia="Microsoft YaHei" w:cs="Microsoft YaHei"/>
+                <w:b w:val="0"/>
+                <w:color w:val="000000"/>
+                <w:sz w:val="16"/>
+              </w:rPr>
+              <w:t>PASS</w:t>
+            </w:r>
+          </w:p>
+        </w:tc>
+      </w:tr>
+      <w:tr>
+        <w:tc>
+          <w:tcPr>
+            <w:tcW w:type="dxa" w:w="2535"/>
+            <w:tcMar>
+              <w:top w:w="80" w:type="dxa"/>
+              <w:bottom w:w="80" w:type="dxa"/>
+              <w:start w:w="120" w:type="dxa"/>
+              <w:end w:w="120" w:type="dxa"/>
+            </w:tcMar>
+            <w:vAlign w:val="center"/>
+          </w:tcPr>
+          <w:p>
+            <w:pPr>
+              <w:spacing w:after="0"/>
+            </w:pPr>
+            <w:r>
+              <w:rPr>
+                <w:rFonts w:ascii="Microsoft YaHei" w:hAnsi="Microsoft YaHei" w:eastAsia="Microsoft YaHei" w:cs="Microsoft YaHei"/>
+                <w:b w:val="0"/>
+                <w:color w:val="000000"/>
+                <w:sz w:val="16"/>
+              </w:rPr>
+              <w:t>WHS</w:t>
+            </w:r>
+          </w:p>
+        </w:tc>
+        <w:tc>
+          <w:tcPr>
+            <w:tcW w:type="dxa" w:w="1755"/>
+            <w:tcMar>
+              <w:top w:w="80" w:type="dxa"/>
+              <w:bottom w:w="80" w:type="dxa"/>
+              <w:start w:w="120" w:type="dxa"/>
+              <w:end w:w="120" w:type="dxa"/>
+            </w:tcMar>
+            <w:vAlign w:val="center"/>
+          </w:tcPr>
+          <w:p>
+            <w:pPr>
+              <w:spacing w:after="0"/>
+            </w:pPr>
+            <w:r>
+              <w:rPr>
+                <w:rFonts w:ascii="Microsoft YaHei" w:hAnsi="Microsoft YaHei" w:eastAsia="Microsoft YaHei" w:cs="Microsoft YaHei"/>
+                <w:b w:val="0"/>
+                <w:color w:val="000000"/>
+                <w:sz w:val="16"/>
+              </w:rPr>
+              <w:t>0.010 ns</w:t>
+            </w:r>
+          </w:p>
+        </w:tc>
+        <w:tc>
+          <w:tcPr>
+            <w:tcW w:type="dxa" w:w="4290"/>
+            <w:tcMar>
+              <w:top w:w="80" w:type="dxa"/>
+              <w:bottom w:w="80" w:type="dxa"/>
+              <w:start w:w="120" w:type="dxa"/>
+              <w:end w:w="120" w:type="dxa"/>
+            </w:tcMar>
+            <w:vAlign w:val="center"/>
+          </w:tcPr>
+          <w:p>
+            <w:pPr>
+              <w:spacing w:after="0"/>
+            </w:pPr>
+            <w:r>
+              <w:rPr>
+                <w:rFonts w:ascii="Microsoft YaHei" w:hAnsi="Microsoft YaHei" w:eastAsia="Microsoft YaHei" w:cs="Microsoft YaHei"/>
+                <w:b w:val="0"/>
+                <w:color w:val="000000"/>
+                <w:sz w:val="16"/>
+              </w:rPr>
+              <w:t>&gt;= 0 ns</w:t>
+            </w:r>
+          </w:p>
+        </w:tc>
+        <w:tc>
+          <w:tcPr>
+            <w:tcW w:type="dxa" w:w="780"/>
+            <w:tcMar>
+              <w:top w:w="80" w:type="dxa"/>
+              <w:bottom w:w="80" w:type="dxa"/>
+              <w:start w:w="120" w:type="dxa"/>
+              <w:end w:w="120" w:type="dxa"/>
+            </w:tcMar>
+            <w:vAlign w:val="center"/>
+          </w:tcPr>
+          <w:p>
+            <w:pPr>
+              <w:spacing w:after="0"/>
+            </w:pPr>
+            <w:r>
+              <w:rPr>
+                <w:rFonts w:ascii="Microsoft YaHei" w:hAnsi="Microsoft YaHei" w:eastAsia="Microsoft YaHei" w:cs="Microsoft YaHei"/>
+                <w:b w:val="0"/>
+                <w:color w:val="000000"/>
+                <w:sz w:val="16"/>
+              </w:rPr>
+              <w:t>PASS</w:t>
+            </w:r>
+          </w:p>
+        </w:tc>
+      </w:tr>
+    </w:tbl>
+    <w:p>
+      <w:r>
+        <w:rPr>
+          <w:rFonts w:ascii="Microsoft YaHei" w:hAnsi="Microsoft YaHei" w:eastAsia="Microsoft YaHei" w:cs="Microsoft YaHei"/>
+          <w:b w:val="0"/>
+          <w:color w:val="000000"/>
+        </w:rPr>
+        <w:t xml:space="preserve">该 bitstream 对应 </w:t>
+      </w:r>
+      <w:r>
+        <w:rPr>
+          <w:rFonts w:ascii="Consolas" w:hAnsi="Consolas" w:eastAsia="Microsoft YaHei" w:cs="Consolas"/>
+          <w:color w:val="000000"/>
+        </w:rPr>
+        <w:t>ImgW=2 / TileW=2 / TileH=2 / Halo=21</w:t>
+      </w:r>
+      <w:r>
+        <w:rPr>
+          <w:rFonts w:ascii="Microsoft YaHei" w:hAnsi="Microsoft YaHei" w:eastAsia="Microsoft YaHei" w:cs="Microsoft YaHei"/>
+          <w:b w:val="0"/>
+          <w:color w:val="000000"/>
+        </w:rPr>
+        <w:t xml:space="preserve"> 的 JTAG-W8A12 x4 tile-writer/debug source-boundary 配置，行为级 RTL raw compare 为 </w:t>
+      </w:r>
+      <w:r>
+        <w:rPr>
+          <w:rFonts w:ascii="Consolas" w:hAnsi="Consolas" w:eastAsia="Microsoft YaHei" w:cs="Consolas"/>
+          <w:color w:val="000000"/>
+        </w:rPr>
+        <w:t>0 / 192</w:t>
+      </w:r>
+      <w:r>
+        <w:rPr>
+          <w:rFonts w:ascii="Microsoft YaHei" w:hAnsi="Microsoft YaHei" w:eastAsia="Microsoft YaHei" w:cs="Microsoft YaHei"/>
+          <w:b w:val="0"/>
+          <w:color w:val="000000"/>
+        </w:rPr>
+        <w:t xml:space="preserve"> mismatch。它证明当前 W8A12 tile 计算和写回配置能够生成 bitstream 并满足资源/时序门限；但不声明 720p packed 2-D 完整硬件 bitstream 已闭合。</w:t>
+      </w:r>
+    </w:p>
+    <w:p>
+      <w:r>
+        <w:rPr>
+          <w:rFonts w:ascii="Microsoft YaHei" w:hAnsi="Microsoft YaHei" w:eastAsia="Microsoft YaHei" w:cs="Microsoft YaHei"/>
+          <w:b w:val="0"/>
+          <w:color w:val="000000"/>
+        </w:rPr>
+        <w:t xml:space="preserve">性能 scheduler 侧已补充 packed 2-D 规划证据，并新增独立 </w:t>
+      </w:r>
+      <w:r>
+        <w:rPr>
+          <w:rFonts w:ascii="Consolas" w:hAnsi="Consolas" w:eastAsia="Microsoft YaHei" w:cs="Consolas"/>
+          <w:color w:val="000000"/>
+        </w:rPr>
+        <w:t>x4_720p15_fps_closure</w:t>
+      </w:r>
+      <w:r>
+        <w:rPr>
+          <w:rFonts w:ascii="Microsoft YaHei" w:hAnsi="Microsoft YaHei" w:eastAsia="Microsoft YaHei" w:cs="Microsoft YaHei"/>
+          <w:b w:val="0"/>
+          <w:color w:val="000000"/>
+        </w:rPr>
+        <w:t xml:space="preserve"> 门禁。该门禁明确输出分辨率为 </w:t>
+      </w:r>
+      <w:r>
+        <w:rPr>
+          <w:rFonts w:ascii="Consolas" w:hAnsi="Consolas" w:eastAsia="Microsoft YaHei" w:cs="Consolas"/>
+          <w:color w:val="000000"/>
+        </w:rPr>
+        <w:t>1280x720</w:t>
+      </w:r>
+      <w:r>
+        <w:rPr>
+          <w:rFonts w:ascii="Microsoft YaHei" w:hAnsi="Microsoft YaHei" w:eastAsia="Microsoft YaHei" w:cs="Microsoft YaHei"/>
+          <w:b w:val="0"/>
+          <w:color w:val="000000"/>
+        </w:rPr>
+        <w:t xml:space="preserve">，输入为 </w:t>
+      </w:r>
+      <w:r>
+        <w:rPr>
+          <w:rFonts w:ascii="Consolas" w:hAnsi="Consolas" w:eastAsia="Microsoft YaHei" w:cs="Consolas"/>
+          <w:color w:val="000000"/>
+        </w:rPr>
+        <w:t>320x180 LR</w:t>
+      </w:r>
+      <w:r>
+        <w:rPr>
+          <w:rFonts w:ascii="Microsoft YaHei" w:hAnsi="Microsoft YaHei" w:eastAsia="Microsoft YaHei" w:cs="Microsoft YaHei"/>
+          <w:b w:val="0"/>
+          <w:color w:val="000000"/>
+        </w:rPr>
+        <w:t xml:space="preserve">，闭合层级为 scheduler/performance-model，不声明板端实测 FPS 或完整 packed 2-D 像素 RTL bit-exact 闭合。证据见 </w:t>
+      </w:r>
+      <w:r>
+        <w:rPr>
+          <w:rFonts w:ascii="Consolas" w:hAnsi="Consolas" w:eastAsia="Microsoft YaHei" w:cs="Consolas"/>
+          <w:color w:val="000000"/>
+        </w:rPr>
+        <w:t>evidence/sim_fps_design_space/x4_720p15_fps_closure/summary.md</w:t>
+      </w:r>
+      <w:r>
+        <w:rPr>
+          <w:rFonts w:ascii="Microsoft YaHei" w:hAnsi="Microsoft YaHei" w:eastAsia="Microsoft YaHei" w:cs="Microsoft YaHei"/>
+          <w:b w:val="0"/>
+          <w:color w:val="000000"/>
+        </w:rPr>
+        <w:t>。</w:t>
+      </w:r>
+    </w:p>
+    <w:tbl>
+      <w:tblPr>
+        <w:tblStyle w:val="TableGrid"/>
+        <w:tblW w:type="dxa" w:w="9360"/>
+        <w:jc w:val="left"/>
+        <w:tblLayout w:type="fixed"/>
+        <w:tblLook w:firstColumn="1" w:firstRow="1" w:lastColumn="0" w:lastRow="0" w:noHBand="0" w:noVBand="1" w:val="04A0"/>
+        <w:tblInd w:w="120" w:type="dxa"/>
+      </w:tblPr>
+      <w:tblGrid>
+        <w:gridCol w:w="2069"/>
+        <w:gridCol w:w="1281"/>
+        <w:gridCol w:w="900"/>
+        <w:gridCol w:w="1084"/>
+        <w:gridCol w:w="985"/>
+        <w:gridCol w:w="3041"/>
+      </w:tblGrid>
+      <w:tr>
+        <w:trPr>
+          <w:tblHeader w:val="true"/>
+        </w:trPr>
+        <w:tc>
+          <w:tcPr>
+            <w:tcW w:type="dxa" w:w="2069"/>
+            <w:tcMar>
+              <w:top w:w="80" w:type="dxa"/>
+              <w:bottom w:w="80" w:type="dxa"/>
+              <w:start w:w="120" w:type="dxa"/>
+              <w:end w:w="120" w:type="dxa"/>
+            </w:tcMar>
+            <w:vAlign w:val="center"/>
+            <w:shd w:fill="F2F2F2"/>
+          </w:tcPr>
+          <w:p>
+            <w:pPr>
+              <w:spacing w:after="0"/>
+            </w:pPr>
+            <w:r>
+              <w:rPr>
+                <w:rFonts w:ascii="Microsoft YaHei" w:hAnsi="Microsoft YaHei" w:eastAsia="Microsoft YaHei" w:cs="Microsoft YaHei"/>
+                <w:b/>
+                <w:color w:val="000000"/>
+                <w:sz w:val="16"/>
+              </w:rPr>
+              <w:t>目标</w:t>
+            </w:r>
+          </w:p>
+        </w:tc>
+        <w:tc>
+          <w:tcPr>
+            <w:tcW w:type="dxa" w:w="1281"/>
+            <w:tcMar>
+              <w:top w:w="80" w:type="dxa"/>
+              <w:bottom w:w="80" w:type="dxa"/>
+              <w:start w:w="120" w:type="dxa"/>
+              <w:end w:w="120" w:type="dxa"/>
+            </w:tcMar>
+            <w:vAlign w:val="center"/>
+            <w:shd w:fill="F2F2F2"/>
+          </w:tcPr>
+          <w:p>
+            <w:pPr>
+              <w:spacing w:after="0"/>
+            </w:pPr>
+            <w:r>
+              <w:rPr>
+                <w:rFonts w:ascii="Microsoft YaHei" w:hAnsi="Microsoft YaHei" w:eastAsia="Microsoft YaHei" w:cs="Microsoft YaHei"/>
+                <w:b/>
+                <w:color w:val="000000"/>
+                <w:sz w:val="16"/>
+              </w:rPr>
+              <w:t>Candidate</w:t>
+            </w:r>
+          </w:p>
+        </w:tc>
+        <w:tc>
+          <w:tcPr>
+            <w:tcW w:type="dxa" w:w="900"/>
+            <w:tcMar>
+              <w:top w:w="80" w:type="dxa"/>
+              <w:bottom w:w="80" w:type="dxa"/>
+              <w:start w:w="120" w:type="dxa"/>
+              <w:end w:w="120" w:type="dxa"/>
+            </w:tcMar>
+            <w:vAlign w:val="center"/>
+            <w:shd w:fill="F2F2F2"/>
+          </w:tcPr>
+          <w:p>
+            <w:pPr>
+              <w:spacing w:after="0"/>
+            </w:pPr>
+            <w:r>
+              <w:rPr>
+                <w:rFonts w:ascii="Microsoft YaHei" w:hAnsi="Microsoft YaHei" w:eastAsia="Microsoft YaHei" w:cs="Microsoft YaHei"/>
+                <w:b/>
+                <w:color w:val="000000"/>
+                <w:sz w:val="16"/>
+              </w:rPr>
+              <w:t>DSP</w:t>
+            </w:r>
+          </w:p>
+        </w:tc>
+        <w:tc>
+          <w:tcPr>
+            <w:tcW w:type="dxa" w:w="1084"/>
+            <w:tcMar>
+              <w:top w:w="80" w:type="dxa"/>
+              <w:bottom w:w="80" w:type="dxa"/>
+              <w:start w:w="120" w:type="dxa"/>
+              <w:end w:w="120" w:type="dxa"/>
+            </w:tcMar>
+            <w:vAlign w:val="center"/>
+            <w:shd w:fill="F2F2F2"/>
+          </w:tcPr>
+          <w:p>
+            <w:pPr>
+              <w:spacing w:after="0"/>
+            </w:pPr>
+            <w:r>
+              <w:rPr>
+                <w:rFonts w:ascii="Microsoft YaHei" w:hAnsi="Microsoft YaHei" w:eastAsia="Microsoft YaHei" w:cs="Microsoft YaHei"/>
+                <w:b/>
+                <w:color w:val="000000"/>
+                <w:sz w:val="16"/>
+              </w:rPr>
+              <w:t>FPS @250MHz</w:t>
+            </w:r>
+          </w:p>
+        </w:tc>
+        <w:tc>
+          <w:tcPr>
+            <w:tcW w:type="dxa" w:w="985"/>
+            <w:tcMar>
+              <w:top w:w="80" w:type="dxa"/>
+              <w:bottom w:w="80" w:type="dxa"/>
+              <w:start w:w="120" w:type="dxa"/>
+              <w:end w:w="120" w:type="dxa"/>
+            </w:tcMar>
+            <w:vAlign w:val="center"/>
+            <w:shd w:fill="F2F2F2"/>
+          </w:tcPr>
+          <w:p>
+            <w:pPr>
+              <w:spacing w:after="0"/>
+            </w:pPr>
+            <w:r>
+              <w:rPr>
+                <w:rFonts w:ascii="Microsoft YaHei" w:hAnsi="Microsoft YaHei" w:eastAsia="Microsoft YaHei" w:cs="Microsoft YaHei"/>
+                <w:b/>
+                <w:color w:val="000000"/>
+                <w:sz w:val="16"/>
+              </w:rPr>
+              <w:t>15fps 余量</w:t>
+            </w:r>
+          </w:p>
+        </w:tc>
+        <w:tc>
+          <w:tcPr>
+            <w:tcW w:type="dxa" w:w="3041"/>
+            <w:tcMar>
+              <w:top w:w="80" w:type="dxa"/>
+              <w:bottom w:w="80" w:type="dxa"/>
+              <w:start w:w="120" w:type="dxa"/>
+              <w:end w:w="120" w:type="dxa"/>
+            </w:tcMar>
+            <w:vAlign w:val="center"/>
+            <w:shd w:fill="F2F2F2"/>
+          </w:tcPr>
+          <w:p>
+            <w:pPr>
+              <w:spacing w:after="0"/>
+            </w:pPr>
+            <w:r>
+              <w:rPr>
+                <w:rFonts w:ascii="Microsoft YaHei" w:hAnsi="Microsoft YaHei" w:eastAsia="Microsoft YaHei" w:cs="Microsoft YaHei"/>
+                <w:b/>
+                <w:color w:val="000000"/>
+                <w:sz w:val="16"/>
+              </w:rPr>
+              <w:t>当前结论</w:t>
+            </w:r>
+          </w:p>
+        </w:tc>
+      </w:tr>
+      <w:tr>
+        <w:tc>
+          <w:tcPr>
+            <w:tcW w:type="dxa" w:w="2069"/>
+            <w:tcMar>
+              <w:top w:w="80" w:type="dxa"/>
+              <w:bottom w:w="80" w:type="dxa"/>
+              <w:start w:w="120" w:type="dxa"/>
+              <w:end w:w="120" w:type="dxa"/>
+            </w:tcMar>
+            <w:vAlign w:val="center"/>
+          </w:tcPr>
+          <w:p>
+            <w:pPr>
+              <w:spacing w:after="0"/>
+            </w:pPr>
+            <w:r>
+              <w:rPr>
+                <w:rFonts w:ascii="Microsoft YaHei" w:hAnsi="Microsoft YaHei" w:eastAsia="Microsoft YaHei" w:cs="Microsoft YaHei"/>
+                <w:b w:val="0"/>
+                <w:color w:val="000000"/>
+                <w:sz w:val="16"/>
+              </w:rPr>
+              <w:t>x4 720p15 最低资源点</w:t>
+            </w:r>
+          </w:p>
+        </w:tc>
+        <w:tc>
+          <w:tcPr>
+            <w:tcW w:type="dxa" w:w="1281"/>
+            <w:tcMar>
+              <w:top w:w="80" w:type="dxa"/>
+              <w:bottom w:w="80" w:type="dxa"/>
+              <w:start w:w="120" w:type="dxa"/>
+              <w:end w:w="120" w:type="dxa"/>
+            </w:tcMar>
+            <w:vAlign w:val="center"/>
+          </w:tcPr>
+          <w:p>
+            <w:pPr>
+              <w:spacing w:after="0"/>
+            </w:pPr>
+            <w:r>
+              <w:rPr>
+                <w:rFonts w:ascii="Consolas" w:hAnsi="Consolas" w:eastAsia="Microsoft YaHei" w:cs="Consolas"/>
+                <w:color w:val="000000"/>
+                <w:sz w:val="16"/>
+              </w:rPr>
+              <w:t>24x64</w:t>
+            </w:r>
+          </w:p>
+        </w:tc>
+        <w:tc>
+          <w:tcPr>
+            <w:tcW w:type="dxa" w:w="900"/>
+            <w:tcMar>
+              <w:top w:w="80" w:type="dxa"/>
+              <w:bottom w:w="80" w:type="dxa"/>
+              <w:start w:w="120" w:type="dxa"/>
+              <w:end w:w="120" w:type="dxa"/>
+            </w:tcMar>
+            <w:vAlign w:val="center"/>
+          </w:tcPr>
+          <w:p>
+            <w:pPr>
+              <w:spacing w:after="0"/>
+            </w:pPr>
+            <w:r>
+              <w:rPr>
+                <w:rFonts w:ascii="Microsoft YaHei" w:hAnsi="Microsoft YaHei" w:eastAsia="Microsoft YaHei" w:cs="Microsoft YaHei"/>
+                <w:b w:val="0"/>
+                <w:color w:val="000000"/>
+                <w:sz w:val="16"/>
+              </w:rPr>
+              <w:t>792</w:t>
+            </w:r>
+          </w:p>
+        </w:tc>
+        <w:tc>
+          <w:tcPr>
+            <w:tcW w:type="dxa" w:w="1084"/>
+            <w:tcMar>
+              <w:top w:w="80" w:type="dxa"/>
+              <w:bottom w:w="80" w:type="dxa"/>
+              <w:start w:w="120" w:type="dxa"/>
+              <w:end w:w="120" w:type="dxa"/>
+            </w:tcMar>
+            <w:vAlign w:val="center"/>
+          </w:tcPr>
+          <w:p>
+            <w:pPr>
+              <w:spacing w:after="0"/>
+            </w:pPr>
+            <w:r>
+              <w:rPr>
+                <w:rFonts w:ascii="Microsoft YaHei" w:hAnsi="Microsoft YaHei" w:eastAsia="Microsoft YaHei" w:cs="Microsoft YaHei"/>
+                <w:b w:val="0"/>
+                <w:color w:val="000000"/>
+                <w:sz w:val="16"/>
+              </w:rPr>
+              <w:t>15.070</w:t>
+            </w:r>
+          </w:p>
+        </w:tc>
+        <w:tc>
+          <w:tcPr>
+            <w:tcW w:type="dxa" w:w="985"/>
+            <w:tcMar>
+              <w:top w:w="80" w:type="dxa"/>
+              <w:bottom w:w="80" w:type="dxa"/>
+              <w:start w:w="120" w:type="dxa"/>
+              <w:end w:w="120" w:type="dxa"/>
+            </w:tcMar>
+            <w:vAlign w:val="center"/>
+          </w:tcPr>
+          <w:p>
+            <w:pPr>
+              <w:spacing w:after="0"/>
+            </w:pPr>
+            <w:r>
+              <w:rPr>
+                <w:rFonts w:ascii="Microsoft YaHei" w:hAnsi="Microsoft YaHei" w:eastAsia="Microsoft YaHei" w:cs="Microsoft YaHei"/>
+                <w:b w:val="0"/>
+                <w:color w:val="000000"/>
+                <w:sz w:val="16"/>
+              </w:rPr>
+              <w:t>0.467%</w:t>
+            </w:r>
+          </w:p>
+        </w:tc>
+        <w:tc>
+          <w:tcPr>
+            <w:tcW w:type="dxa" w:w="3041"/>
+            <w:tcMar>
+              <w:top w:w="80" w:type="dxa"/>
+              <w:bottom w:w="80" w:type="dxa"/>
+              <w:start w:w="120" w:type="dxa"/>
+              <w:end w:w="120" w:type="dxa"/>
+            </w:tcMar>
+            <w:vAlign w:val="center"/>
+          </w:tcPr>
+          <w:p>
+            <w:pPr>
+              <w:spacing w:after="0"/>
+            </w:pPr>
+            <w:r>
+              <w:rPr>
+                <w:rFonts w:ascii="Microsoft YaHei" w:hAnsi="Microsoft YaHei" w:eastAsia="Microsoft YaHei" w:cs="Microsoft YaHei"/>
+                <w:b w:val="0"/>
+                <w:color w:val="000000"/>
+                <w:sz w:val="16"/>
+              </w:rPr>
+              <w:t>PASS，但余量很小</w:t>
+            </w:r>
+          </w:p>
+        </w:tc>
+      </w:tr>
+      <w:tr>
+        <w:tc>
+          <w:tcPr>
+            <w:tcW w:type="dxa" w:w="2069"/>
+            <w:tcMar>
+              <w:top w:w="80" w:type="dxa"/>
+              <w:bottom w:w="80" w:type="dxa"/>
+              <w:start w:w="120" w:type="dxa"/>
+              <w:end w:w="120" w:type="dxa"/>
+            </w:tcMar>
+            <w:vAlign w:val="center"/>
+          </w:tcPr>
+          <w:p>
+            <w:pPr>
+              <w:spacing w:after="0"/>
+            </w:pPr>
+            <w:r>
+              <w:rPr>
+                <w:rFonts w:ascii="Microsoft YaHei" w:hAnsi="Microsoft YaHei" w:eastAsia="Microsoft YaHei" w:cs="Microsoft YaHei"/>
+                <w:b w:val="0"/>
+                <w:color w:val="000000"/>
+                <w:sz w:val="16"/>
+              </w:rPr>
+              <w:t>x4 720p15 推荐闭合点</w:t>
+            </w:r>
+          </w:p>
+        </w:tc>
+        <w:tc>
+          <w:tcPr>
+            <w:tcW w:type="dxa" w:w="1281"/>
+            <w:tcMar>
+              <w:top w:w="80" w:type="dxa"/>
+              <w:bottom w:w="80" w:type="dxa"/>
+              <w:start w:w="120" w:type="dxa"/>
+              <w:end w:w="120" w:type="dxa"/>
+            </w:tcMar>
+            <w:vAlign w:val="center"/>
+          </w:tcPr>
+          <w:p>
+            <w:pPr>
+              <w:spacing w:after="0"/>
+            </w:pPr>
+            <w:r>
+              <w:rPr>
+                <w:rFonts w:ascii="Consolas" w:hAnsi="Consolas" w:eastAsia="Microsoft YaHei" w:cs="Consolas"/>
+                <w:color w:val="000000"/>
+                <w:sz w:val="16"/>
+              </w:rPr>
+              <w:t>24x72</w:t>
+            </w:r>
+          </w:p>
+        </w:tc>
+        <w:tc>
+          <w:tcPr>
+            <w:tcW w:type="dxa" w:w="900"/>
+            <w:tcMar>
+              <w:top w:w="80" w:type="dxa"/>
+              <w:bottom w:w="80" w:type="dxa"/>
+              <w:start w:w="120" w:type="dxa"/>
+              <w:end w:w="120" w:type="dxa"/>
+            </w:tcMar>
+            <w:vAlign w:val="center"/>
+          </w:tcPr>
+          <w:p>
+            <w:pPr>
+              <w:spacing w:after="0"/>
+            </w:pPr>
+            <w:r>
+              <w:rPr>
+                <w:rFonts w:ascii="Microsoft YaHei" w:hAnsi="Microsoft YaHei" w:eastAsia="Microsoft YaHei" w:cs="Microsoft YaHei"/>
+                <w:b w:val="0"/>
+                <w:color w:val="000000"/>
+                <w:sz w:val="16"/>
+              </w:rPr>
+              <w:t>888</w:t>
+            </w:r>
+          </w:p>
+        </w:tc>
+        <w:tc>
+          <w:tcPr>
+            <w:tcW w:type="dxa" w:w="1084"/>
+            <w:tcMar>
+              <w:top w:w="80" w:type="dxa"/>
+              <w:bottom w:w="80" w:type="dxa"/>
+              <w:start w:w="120" w:type="dxa"/>
+              <w:end w:w="120" w:type="dxa"/>
+            </w:tcMar>
+            <w:vAlign w:val="center"/>
+          </w:tcPr>
+          <w:p>
+            <w:pPr>
+              <w:spacing w:after="0"/>
+            </w:pPr>
+            <w:r>
+              <w:rPr>
+                <w:rFonts w:ascii="Microsoft YaHei" w:hAnsi="Microsoft YaHei" w:eastAsia="Microsoft YaHei" w:cs="Microsoft YaHei"/>
+                <w:b w:val="0"/>
+                <w:color w:val="000000"/>
+                <w:sz w:val="16"/>
+              </w:rPr>
+              <w:t>17.501</w:t>
+            </w:r>
+          </w:p>
+        </w:tc>
+        <w:tc>
+          <w:tcPr>
+            <w:tcW w:type="dxa" w:w="985"/>
+            <w:tcMar>
+              <w:top w:w="80" w:type="dxa"/>
+              <w:bottom w:w="80" w:type="dxa"/>
+              <w:start w:w="120" w:type="dxa"/>
+              <w:end w:w="120" w:type="dxa"/>
+            </w:tcMar>
+            <w:vAlign w:val="center"/>
+          </w:tcPr>
+          <w:p>
+            <w:pPr>
+              <w:spacing w:after="0"/>
+            </w:pPr>
+            <w:r>
+              <w:rPr>
+                <w:rFonts w:ascii="Microsoft YaHei" w:hAnsi="Microsoft YaHei" w:eastAsia="Microsoft YaHei" w:cs="Microsoft YaHei"/>
+                <w:b w:val="0"/>
+                <w:color w:val="000000"/>
+                <w:sz w:val="16"/>
+              </w:rPr>
+              <w:t>14.291%</w:t>
+            </w:r>
+          </w:p>
+        </w:tc>
+        <w:tc>
+          <w:tcPr>
+            <w:tcW w:type="dxa" w:w="3041"/>
+            <w:tcMar>
+              <w:top w:w="80" w:type="dxa"/>
+              <w:bottom w:w="80" w:type="dxa"/>
+              <w:start w:w="120" w:type="dxa"/>
+              <w:end w:w="120" w:type="dxa"/>
+            </w:tcMar>
+            <w:vAlign w:val="center"/>
+          </w:tcPr>
+          <w:p>
+            <w:pPr>
+              <w:spacing w:after="0"/>
+            </w:pPr>
+            <w:r>
+              <w:rPr>
+                <w:rFonts w:ascii="Microsoft YaHei" w:hAnsi="Microsoft YaHei" w:eastAsia="Microsoft YaHei" w:cs="Microsoft YaHei"/>
+                <w:b w:val="0"/>
+                <w:color w:val="000000"/>
+                <w:sz w:val="16"/>
+              </w:rPr>
+              <w:t>PASS，作为本报告推荐 FPS 闭合配置</w:t>
+            </w:r>
+          </w:p>
+        </w:tc>
+      </w:tr>
+      <w:tr>
+        <w:tc>
+          <w:tcPr>
+            <w:tcW w:type="dxa" w:w="2069"/>
+            <w:tcMar>
+              <w:top w:w="80" w:type="dxa"/>
+              <w:bottom w:w="80" w:type="dxa"/>
+              <w:start w:w="120" w:type="dxa"/>
+              <w:end w:w="120" w:type="dxa"/>
+            </w:tcMar>
+            <w:vAlign w:val="center"/>
+          </w:tcPr>
+          <w:p>
+            <w:pPr>
+              <w:spacing w:after="0"/>
+            </w:pPr>
+            <w:r>
+              <w:rPr>
+                <w:rFonts w:ascii="Microsoft YaHei" w:hAnsi="Microsoft YaHei" w:eastAsia="Microsoft YaHei" w:cs="Microsoft YaHei"/>
+                <w:b w:val="0"/>
+                <w:color w:val="000000"/>
+                <w:sz w:val="16"/>
+              </w:rPr>
+              <w:t>x2 720p4 降目标闭合点</w:t>
+            </w:r>
+          </w:p>
+        </w:tc>
+        <w:tc>
+          <w:tcPr>
+            <w:tcW w:type="dxa" w:w="1281"/>
+            <w:tcMar>
+              <w:top w:w="80" w:type="dxa"/>
+              <w:bottom w:w="80" w:type="dxa"/>
+              <w:start w:w="120" w:type="dxa"/>
+              <w:end w:w="120" w:type="dxa"/>
+            </w:tcMar>
+            <w:vAlign w:val="center"/>
+          </w:tcPr>
+          <w:p>
+            <w:pPr>
+              <w:spacing w:after="0"/>
+            </w:pPr>
+            <w:r>
+              <w:rPr>
+                <w:rFonts w:ascii="Consolas" w:hAnsi="Consolas" w:eastAsia="Microsoft YaHei" w:cs="Consolas"/>
+                <w:color w:val="000000"/>
+                <w:sz w:val="16"/>
+              </w:rPr>
+              <w:t>24x72</w:t>
+            </w:r>
+          </w:p>
+        </w:tc>
+        <w:tc>
+          <w:tcPr>
+            <w:tcW w:type="dxa" w:w="900"/>
+            <w:tcMar>
+              <w:top w:w="80" w:type="dxa"/>
+              <w:bottom w:w="80" w:type="dxa"/>
+              <w:start w:w="120" w:type="dxa"/>
+              <w:end w:w="120" w:type="dxa"/>
+            </w:tcMar>
+            <w:vAlign w:val="center"/>
+          </w:tcPr>
+          <w:p>
+            <w:pPr>
+              <w:spacing w:after="0"/>
+            </w:pPr>
+            <w:r>
+              <w:rPr>
+                <w:rFonts w:ascii="Microsoft YaHei" w:hAnsi="Microsoft YaHei" w:eastAsia="Microsoft YaHei" w:cs="Microsoft YaHei"/>
+                <w:b w:val="0"/>
+                <w:color w:val="000000"/>
+                <w:sz w:val="16"/>
+              </w:rPr>
+              <w:t>888</w:t>
+            </w:r>
+          </w:p>
+        </w:tc>
+        <w:tc>
+          <w:tcPr>
+            <w:tcW w:type="dxa" w:w="1084"/>
+            <w:tcMar>
+              <w:top w:w="80" w:type="dxa"/>
+              <w:bottom w:w="80" w:type="dxa"/>
+              <w:start w:w="120" w:type="dxa"/>
+              <w:end w:w="120" w:type="dxa"/>
+            </w:tcMar>
+            <w:vAlign w:val="center"/>
+          </w:tcPr>
+          <w:p>
+            <w:pPr>
+              <w:spacing w:after="0"/>
+            </w:pPr>
+            <w:r>
+              <w:rPr>
+                <w:rFonts w:ascii="Microsoft YaHei" w:hAnsi="Microsoft YaHei" w:eastAsia="Microsoft YaHei" w:cs="Microsoft YaHei"/>
+                <w:b w:val="0"/>
+                <w:color w:val="000000"/>
+                <w:sz w:val="16"/>
+              </w:rPr>
+              <w:t>4.483</w:t>
+            </w:r>
+          </w:p>
+        </w:tc>
+        <w:tc>
+          <w:tcPr>
+            <w:tcW w:type="dxa" w:w="985"/>
+            <w:tcMar>
+              <w:top w:w="80" w:type="dxa"/>
+              <w:bottom w:w="80" w:type="dxa"/>
+              <w:start w:w="120" w:type="dxa"/>
+              <w:end w:w="120" w:type="dxa"/>
+            </w:tcMar>
+            <w:vAlign w:val="center"/>
+          </w:tcPr>
+          <w:p>
+            <w:pPr>
+              <w:spacing w:after="0"/>
+            </w:pPr>
+            <w:r>
+              <w:rPr>
+                <w:rFonts w:ascii="Microsoft YaHei" w:hAnsi="Microsoft YaHei" w:eastAsia="Microsoft YaHei" w:cs="Microsoft YaHei"/>
+                <w:b w:val="0"/>
+                <w:color w:val="000000"/>
+                <w:sz w:val="16"/>
+              </w:rPr>
+              <w:t>10.789%</w:t>
+            </w:r>
+          </w:p>
+        </w:tc>
+        <w:tc>
+          <w:tcPr>
+            <w:tcW w:type="dxa" w:w="3041"/>
+            <w:tcMar>
+              <w:top w:w="80" w:type="dxa"/>
+              <w:bottom w:w="80" w:type="dxa"/>
+              <w:start w:w="120" w:type="dxa"/>
+              <w:end w:w="120" w:type="dxa"/>
+            </w:tcMar>
+            <w:vAlign w:val="center"/>
+          </w:tcPr>
+          <w:p>
+            <w:pPr>
+              <w:spacing w:after="0"/>
+            </w:pPr>
+            <w:r>
+              <w:rPr>
+                <w:rFonts w:ascii="Microsoft YaHei" w:hAnsi="Microsoft YaHei" w:eastAsia="Microsoft YaHei" w:cs="Microsoft YaHei"/>
+                <w:b w:val="0"/>
+                <w:color w:val="000000"/>
+                <w:sz w:val="16"/>
+              </w:rPr>
+              <w:t>PASS，作为 x2 降目标 FPS 闭合配置</w:t>
+            </w:r>
+          </w:p>
+        </w:tc>
+      </w:tr>
+      <w:tr>
+        <w:tc>
+          <w:tcPr>
+            <w:tcW w:type="dxa" w:w="2069"/>
+            <w:tcMar>
+              <w:top w:w="80" w:type="dxa"/>
+              <w:bottom w:w="80" w:type="dxa"/>
+              <w:start w:w="120" w:type="dxa"/>
+              <w:end w:w="120" w:type="dxa"/>
+            </w:tcMar>
+            <w:vAlign w:val="center"/>
+          </w:tcPr>
+          <w:p>
+            <w:pPr>
+              <w:spacing w:after="0"/>
+            </w:pPr>
+            <w:r>
+              <w:rPr>
+                <w:rFonts w:ascii="Microsoft YaHei" w:hAnsi="Microsoft YaHei" w:eastAsia="Microsoft YaHei" w:cs="Microsoft YaHei"/>
+                <w:b w:val="0"/>
+                <w:color w:val="000000"/>
+                <w:sz w:val="16"/>
+              </w:rPr>
+              <w:t>x2 720p20 资源门限内</w:t>
+            </w:r>
+          </w:p>
+        </w:tc>
+        <w:tc>
+          <w:tcPr>
+            <w:tcW w:type="dxa" w:w="1281"/>
+            <w:tcMar>
+              <w:top w:w="80" w:type="dxa"/>
+              <w:bottom w:w="80" w:type="dxa"/>
+              <w:start w:w="120" w:type="dxa"/>
+              <w:end w:w="120" w:type="dxa"/>
+            </w:tcMar>
+            <w:vAlign w:val="center"/>
+          </w:tcPr>
+          <w:p>
+            <w:pPr>
+              <w:spacing w:after="0"/>
+            </w:pPr>
+            <w:r>
+              <w:rPr>
+                <w:rFonts w:ascii="Consolas" w:hAnsi="Consolas" w:eastAsia="Microsoft YaHei" w:cs="Consolas"/>
+                <w:color w:val="000000"/>
+                <w:sz w:val="16"/>
+              </w:rPr>
+              <w:t>24x64/24x72</w:t>
+            </w:r>
+          </w:p>
+        </w:tc>
+        <w:tc>
+          <w:tcPr>
+            <w:tcW w:type="dxa" w:w="900"/>
+            <w:tcMar>
+              <w:top w:w="80" w:type="dxa"/>
+              <w:bottom w:w="80" w:type="dxa"/>
+              <w:start w:w="120" w:type="dxa"/>
+              <w:end w:w="120" w:type="dxa"/>
+            </w:tcMar>
+            <w:vAlign w:val="center"/>
+          </w:tcPr>
+          <w:p>
+            <w:pPr>
+              <w:spacing w:after="0"/>
+            </w:pPr>
+            <w:r>
+              <w:rPr>
+                <w:rFonts w:ascii="Microsoft YaHei" w:hAnsi="Microsoft YaHei" w:eastAsia="Microsoft YaHei" w:cs="Microsoft YaHei"/>
+                <w:b w:val="0"/>
+                <w:color w:val="000000"/>
+                <w:sz w:val="16"/>
+              </w:rPr>
+              <w:t>792/888</w:t>
+            </w:r>
+          </w:p>
+        </w:tc>
+        <w:tc>
+          <w:tcPr>
+            <w:tcW w:type="dxa" w:w="1084"/>
+            <w:tcMar>
+              <w:top w:w="80" w:type="dxa"/>
+              <w:bottom w:w="80" w:type="dxa"/>
+              <w:start w:w="120" w:type="dxa"/>
+              <w:end w:w="120" w:type="dxa"/>
+            </w:tcMar>
+            <w:vAlign w:val="center"/>
+          </w:tcPr>
+          <w:p>
+            <w:pPr>
+              <w:spacing w:after="0"/>
+            </w:pPr>
+            <w:r>
+              <w:rPr>
+                <w:rFonts w:ascii="Microsoft YaHei" w:hAnsi="Microsoft YaHei" w:eastAsia="Microsoft YaHei" w:cs="Microsoft YaHei"/>
+                <w:b w:val="0"/>
+                <w:color w:val="000000"/>
+                <w:sz w:val="16"/>
+              </w:rPr>
+              <w:t>3.861/4.483</w:t>
+            </w:r>
+          </w:p>
+        </w:tc>
+        <w:tc>
+          <w:tcPr>
+            <w:tcW w:type="dxa" w:w="985"/>
+            <w:tcMar>
+              <w:top w:w="80" w:type="dxa"/>
+              <w:bottom w:w="80" w:type="dxa"/>
+              <w:start w:w="120" w:type="dxa"/>
+              <w:end w:w="120" w:type="dxa"/>
+            </w:tcMar>
+            <w:vAlign w:val="center"/>
+          </w:tcPr>
+          <w:p>
+            <w:pPr>
+              <w:spacing w:after="0"/>
+            </w:pPr>
+            <w:r>
+              <w:rPr>
+                <w:rFonts w:ascii="Microsoft YaHei" w:hAnsi="Microsoft YaHei" w:eastAsia="Microsoft YaHei" w:cs="Microsoft YaHei"/>
+                <w:b w:val="0"/>
+                <w:color w:val="000000"/>
+                <w:sz w:val="16"/>
+              </w:rPr>
+              <w:t>不达标</w:t>
+            </w:r>
+          </w:p>
+        </w:tc>
+        <w:tc>
+          <w:tcPr>
+            <w:tcW w:type="dxa" w:w="3041"/>
+            <w:tcMar>
+              <w:top w:w="80" w:type="dxa"/>
+              <w:bottom w:w="80" w:type="dxa"/>
+              <w:start w:w="120" w:type="dxa"/>
+              <w:end w:w="120" w:type="dxa"/>
+            </w:tcMar>
+            <w:vAlign w:val="center"/>
+          </w:tcPr>
+          <w:p>
+            <w:pPr>
+              <w:spacing w:after="0"/>
+            </w:pPr>
+            <w:r>
+              <w:rPr>
+                <w:rFonts w:ascii="Microsoft YaHei" w:hAnsi="Microsoft YaHei" w:eastAsia="Microsoft YaHei" w:cs="Microsoft YaHei"/>
+                <w:b w:val="0"/>
+                <w:color w:val="000000"/>
+                <w:sz w:val="16"/>
+              </w:rPr>
+              <w:t>FAIL，不能声明 x2 720p20</w:t>
+            </w:r>
+          </w:p>
+        </w:tc>
+      </w:tr>
+    </w:tbl>
+    <w:p>
+      <w:r>
+        <w:rPr>
+          <w:rFonts w:ascii="Microsoft YaHei" w:hAnsi="Microsoft YaHei" w:eastAsia="Microsoft YaHei" w:cs="Microsoft YaHei"/>
+          <w:b w:val="0"/>
+          <w:color w:val="000000"/>
+        </w:rPr>
+        <w:t xml:space="preserve">x2 720p20 已新增独立 xsim 证据，但 900-DSP 门限内 </w:t>
+      </w:r>
+      <w:r>
+        <w:rPr>
+          <w:rFonts w:ascii="Consolas" w:hAnsi="Consolas" w:eastAsia="Microsoft YaHei" w:cs="Consolas"/>
+          <w:color w:val="000000"/>
+        </w:rPr>
+        <w:t>24x64/24x72</w:t>
+      </w:r>
+      <w:r>
+        <w:rPr>
+          <w:rFonts w:ascii="Microsoft YaHei" w:hAnsi="Microsoft YaHei" w:eastAsia="Microsoft YaHei" w:cs="Microsoft YaHei"/>
+          <w:b w:val="0"/>
+          <w:color w:val="000000"/>
+        </w:rPr>
+        <w:t xml:space="preserve"> 仅为 3.861/4.483fps，非门限内 </w:t>
+      </w:r>
+      <w:r>
+        <w:rPr>
+          <w:rFonts w:ascii="Consolas" w:hAnsi="Consolas" w:eastAsia="Microsoft YaHei" w:cs="Consolas"/>
+          <w:color w:val="000000"/>
+        </w:rPr>
+        <w:t>48x144</w:t>
+      </w:r>
+      <w:r>
+        <w:rPr>
+          <w:rFonts w:ascii="Microsoft YaHei" w:hAnsi="Microsoft YaHei" w:eastAsia="Microsoft YaHei" w:cs="Microsoft YaHei"/>
+          <w:b w:val="0"/>
+          <w:color w:val="000000"/>
+        </w:rPr>
+        <w:t xml:space="preserve"> 为 17.223fps 且 DSP=3504，因此当前完整 W8A12/F48 packed 2-D 规划不能声明 x2 720p20 已达标。按“降低 x2 FPS 目标”的补充口径，新增 </w:t>
+      </w:r>
+      <w:r>
+        <w:rPr>
+          <w:rFonts w:ascii="Consolas" w:hAnsi="Consolas" w:eastAsia="Microsoft YaHei" w:cs="Consolas"/>
+          <w:color w:val="000000"/>
+        </w:rPr>
+        <w:t>x2_720p4_fps_closure</w:t>
+      </w:r>
+      <w:r>
+        <w:rPr>
+          <w:rFonts w:ascii="Microsoft YaHei" w:hAnsi="Microsoft YaHei" w:eastAsia="Microsoft YaHei" w:cs="Microsoft YaHei"/>
+          <w:b w:val="0"/>
+          <w:color w:val="000000"/>
+        </w:rPr>
+        <w:t xml:space="preserve"> 门禁；其中 </w:t>
+      </w:r>
+      <w:r>
+        <w:rPr>
+          <w:rFonts w:ascii="Consolas" w:hAnsi="Consolas" w:eastAsia="Microsoft YaHei" w:cs="Consolas"/>
+          <w:color w:val="000000"/>
+        </w:rPr>
+        <w:t>24x72</w:t>
+      </w:r>
+      <w:r>
+        <w:rPr>
+          <w:rFonts w:ascii="Microsoft YaHei" w:hAnsi="Microsoft YaHei" w:eastAsia="Microsoft YaHei" w:cs="Microsoft YaHei"/>
+          <w:b w:val="0"/>
+          <w:color w:val="000000"/>
+        </w:rPr>
+        <w:t xml:space="preserve"> 为 4.483fps @250MHz、888 DSP、4fps 余量 10.789%，在 900-DSP 门限内达成 x2 720p4 scheduler-level 闭合；</w:t>
+      </w:r>
+      <w:r>
+        <w:rPr>
+          <w:rFonts w:ascii="Consolas" w:hAnsi="Consolas" w:eastAsia="Microsoft YaHei" w:cs="Consolas"/>
+          <w:color w:val="000000"/>
+        </w:rPr>
+        <w:t>24x64</w:t>
+      </w:r>
+      <w:r>
+        <w:rPr>
+          <w:rFonts w:ascii="Microsoft YaHei" w:hAnsi="Microsoft YaHei" w:eastAsia="Microsoft YaHei" w:cs="Microsoft YaHei"/>
+          <w:b w:val="0"/>
+          <w:color w:val="000000"/>
+        </w:rPr>
+        <w:t xml:space="preserve"> 为 3.861fps，仅作为低资源边界点。证据见 </w:t>
+      </w:r>
+      <w:r>
+        <w:rPr>
+          <w:rFonts w:ascii="Consolas" w:hAnsi="Consolas" w:eastAsia="Microsoft YaHei" w:cs="Consolas"/>
+          <w:color w:val="000000"/>
+        </w:rPr>
+        <w:t>evidence/sim_fps_design_space/x2_720p4_fps_closure/summary.md</w:t>
+      </w:r>
+      <w:r>
+        <w:rPr>
+          <w:rFonts w:ascii="Microsoft YaHei" w:hAnsi="Microsoft YaHei" w:eastAsia="Microsoft YaHei" w:cs="Microsoft YaHei"/>
+          <w:b w:val="0"/>
+          <w:color w:val="000000"/>
+        </w:rPr>
+        <w:t>。</w:t>
       </w:r>
     </w:p>
     <w:p>
@@ -9483,7 +11916,7 @@
           <w:b w:val="0"/>
           <w:color w:val="000000"/>
         </w:rPr>
-        <w:t xml:space="preserve">严格交付审计当前状态为 </w:t>
+        <w:t xml:space="preserve">严格 board-validation 审计当前状态为 </w:t>
       </w:r>
       <w:r>
         <w:rPr>
@@ -9498,7 +11931,7 @@
           <w:b w:val="0"/>
           <w:color w:val="000000"/>
         </w:rPr>
-        <w:t xml:space="preserve">。新增赛题报告、PDF/Word 报告导出、PPA 汇总、报告完整性检查、画质指标闭环门禁、stage-hash 上板流程静态检查、board validation readiness、submission manifest/archive 和 evidence matrix 后，当前审计为 </w:t>
+        <w:t xml:space="preserve">，历史计数为 </w:t>
       </w:r>
       <w:r>
         <w:rPr>
@@ -9513,7 +11946,7 @@
           <w:b w:val="0"/>
           <w:color w:val="000000"/>
         </w:rPr>
-        <w:t>，剩余 4 项均为真实板端 validation：</w:t>
+        <w:t>。如果赛题不要求真实插板运行，这 4 项不应作为提交阻断项；它们只代表后续工程实测补充。新增赛题报告、PDF/Word 报告导出、PPA 汇总、报告完整性检查、画质指标闭环门禁、bitstream/PPA gate、stage-hash 上板流程静态检查、board validation readiness、submission manifest/archive 和 evidence matrix 后，当前严格审计剩余 4 项均为真实板端 validation：</w:t>
       </w:r>
     </w:p>
     <w:p>
@@ -9543,7 +11976,117 @@
           <w:b w:val="0"/>
           <w:color w:val="000000"/>
         </w:rPr>
-        <w:t>在报告/PPA 优先主线下，当前可以先提交离线模型、RTL 仿真、OOC 综合、PPA 和风险说明材料；最终正式板端交付仍需补齐上述 4 项 board validation。</w:t>
+        <w:t xml:space="preserve">为避免将真实上板后续项误判为报告/PPA 口径阻断项，本工程新增赛题提交口径门禁 </w:t>
+      </w:r>
+      <w:r>
+        <w:rPr>
+          <w:rFonts w:ascii="Consolas" w:hAnsi="Consolas" w:eastAsia="Microsoft YaHei" w:cs="Consolas"/>
+          <w:color w:val="000000"/>
+        </w:rPr>
+        <w:t>evidence/contest_scope_readiness/summary.md</w:t>
+      </w:r>
+      <w:r>
+        <w:rPr>
+          <w:rFonts w:ascii="Microsoft YaHei" w:hAnsi="Microsoft YaHei" w:eastAsia="Microsoft YaHei" w:cs="Microsoft YaHei"/>
+          <w:b w:val="0"/>
+          <w:color w:val="000000"/>
+        </w:rPr>
+        <w:t xml:space="preserve">。该门禁状态为 </w:t>
+      </w:r>
+      <w:r>
+        <w:rPr>
+          <w:rFonts w:ascii="Consolas" w:hAnsi="Consolas" w:eastAsia="Microsoft YaHei" w:cs="Consolas"/>
+          <w:color w:val="000000"/>
+        </w:rPr>
+        <w:t>PASS_WITH_SCOPE</w:t>
+      </w:r>
+      <w:r>
+        <w:rPr>
+          <w:rFonts w:ascii="Microsoft YaHei" w:hAnsi="Microsoft YaHei" w:eastAsia="Microsoft YaHei" w:cs="Microsoft YaHei"/>
+          <w:b w:val="0"/>
+          <w:color w:val="000000"/>
+        </w:rPr>
+        <w:t xml:space="preserve"> 时，表示模型/训练口径、量化与转换、RTL 分层仿真、PDF/Word 报告、画质 baseline、x4 720p15 scheduler FPS、x2 720p4 降目标 scheduler FPS、bitstream/PPA 和 GitHub 上传前检查均已具备可追溯证据；同时明确 </w:t>
+      </w:r>
+      <w:r>
+        <w:rPr>
+          <w:rFonts w:ascii="Consolas" w:hAnsi="Consolas" w:eastAsia="Microsoft YaHei" w:cs="Consolas"/>
+          <w:color w:val="000000"/>
+        </w:rPr>
+        <w:t>a5.board_32x32</w:t>
+      </w:r>
+      <w:r>
+        <w:rPr>
+          <w:rFonts w:ascii="Microsoft YaHei" w:hAnsi="Microsoft YaHei" w:eastAsia="Microsoft YaHei" w:cs="Microsoft YaHei"/>
+          <w:b w:val="0"/>
+          <w:color w:val="000000"/>
+        </w:rPr>
+        <w:t>、</w:t>
+      </w:r>
+      <w:r>
+        <w:rPr>
+          <w:rFonts w:ascii="Consolas" w:hAnsi="Consolas" w:eastAsia="Microsoft YaHei" w:cs="Consolas"/>
+          <w:color w:val="000000"/>
+        </w:rPr>
+        <w:t>a6.board_64x64</w:t>
+      </w:r>
+      <w:r>
+        <w:rPr>
+          <w:rFonts w:ascii="Microsoft YaHei" w:hAnsi="Microsoft YaHei" w:eastAsia="Microsoft YaHei" w:cs="Microsoft YaHei"/>
+          <w:b w:val="0"/>
+          <w:color w:val="000000"/>
+        </w:rPr>
+        <w:t>、</w:t>
+      </w:r>
+      <w:r>
+        <w:rPr>
+          <w:rFonts w:ascii="Consolas" w:hAnsi="Consolas" w:eastAsia="Microsoft YaHei" w:cs="Consolas"/>
+          <w:color w:val="000000"/>
+        </w:rPr>
+        <w:t>a7.board_720p_x4</w:t>
+      </w:r>
+      <w:r>
+        <w:rPr>
+          <w:rFonts w:ascii="Microsoft YaHei" w:hAnsi="Microsoft YaHei" w:eastAsia="Microsoft YaHei" w:cs="Microsoft YaHei"/>
+          <w:b w:val="0"/>
+          <w:color w:val="000000"/>
+        </w:rPr>
+        <w:t>、</w:t>
+      </w:r>
+      <w:r>
+        <w:rPr>
+          <w:rFonts w:ascii="Consolas" w:hAnsi="Consolas" w:eastAsia="Microsoft YaHei" w:cs="Consolas"/>
+          <w:color w:val="000000"/>
+        </w:rPr>
+        <w:t>x2.board</w:t>
+      </w:r>
+      <w:r>
+        <w:rPr>
+          <w:rFonts w:ascii="Microsoft YaHei" w:hAnsi="Microsoft YaHei" w:eastAsia="Microsoft YaHei" w:cs="Microsoft YaHei"/>
+          <w:b w:val="0"/>
+          <w:color w:val="000000"/>
+        </w:rPr>
+        <w:t xml:space="preserve"> 是真实板端 validation 后续项，不作为“无真实插板要求”的赛题提交口径阻断项。</w:t>
+      </w:r>
+    </w:p>
+    <w:p>
+      <w:r>
+        <w:rPr>
+          <w:rFonts w:ascii="Microsoft YaHei" w:hAnsi="Microsoft YaHei" w:eastAsia="Microsoft YaHei" w:cs="Microsoft YaHei"/>
+          <w:b w:val="0"/>
+          <w:color w:val="000000"/>
+        </w:rPr>
+        <w:t>在报告/PPA 优先主线下，当前可以先提交离线模型、RTL 仿真、bitstream、OOC/implementation PPA 和风险说明材料；若评审没有真实上板要求，上述 4 项不会影响 bitstream/PPA 口径的提交。</w:t>
+      </w:r>
+    </w:p>
+    <w:p>
+      <w:r>
+        <w:rPr>
+          <w:rFonts w:ascii="Microsoft YaHei" w:hAnsi="Microsoft YaHei" w:eastAsia="Microsoft YaHei" w:cs="Microsoft YaHei"/>
+          <w:b w:val="0"/>
+          <w:color w:val="000000"/>
+        </w:rPr>
+        <w:t>因此，本报告的提交性质是“阶段性交付/相当报告 + bitstream/PPA 可提交版”。它已经覆盖赛题文档、模型、量化、RTL、仿真、bitstream、PPA 和验证流程要求；不足之处集中在真实板端输出、板端 FPS/功耗和 720p packed 2-D 完整硬件 bitstream。若评审确实不要求真实上板，则主要风险转为“提交 bitstream 的作用域需说明为 true2x2/tile-writer 配置，而不是 720p 完整实现”。</w:t>
       </w:r>
     </w:p>
     <w:p>
@@ -9590,6 +12133,8 @@
         <w:t>python W8A12_3lane\tools\generate_missing_evidence_plan.py</w:t>
         <w:br/>
         <w:t>python W8A12_3lane\tools\collect_submission_package.py</w:t>
+        <w:br/>
+        <w:t>python W8A12_3lane\tools\check_contest_scope_readiness.py</w:t>
         <w:br/>
         <w:t>python W8A12_3lane\tools\create_submission_archive.py --allow-incomplete</w:t>
         <w:br/>
@@ -9981,19 +12526,28 @@
             </w:pPr>
             <w:r>
               <w:rPr>
-                <w:rFonts w:ascii="Consolas" w:hAnsi="Consolas" w:eastAsia="Microsoft YaHei" w:cs="Consolas"/>
-                <w:color w:val="000000"/>
-                <w:sz w:val="16"/>
-              </w:rPr>
-              <w:t>output/docx/W8A12_3lane_contest_submission_report.docx</w:t>
-            </w:r>
-            <w:r>
-              <w:rPr>
                 <w:rFonts w:ascii="Microsoft YaHei" w:hAnsi="Microsoft YaHei" w:eastAsia="Microsoft YaHei" w:cs="Microsoft YaHei"/>
                 <w:b w:val="0"/>
                 <w:color w:val="000000"/>
                 <w:sz w:val="16"/>
               </w:rPr>
+              <w:t>标准路径：</w:t>
+            </w:r>
+            <w:r>
+              <w:rPr>
+                <w:rFonts w:ascii="Consolas" w:hAnsi="Consolas" w:eastAsia="Microsoft YaHei" w:cs="Consolas"/>
+                <w:color w:val="000000"/>
+                <w:sz w:val="16"/>
+              </w:rPr>
+              <w:t>output/docx/W8A12_3lane_contest_submission_report.docx</w:t>
+            </w:r>
+            <w:r>
+              <w:rPr>
+                <w:rFonts w:ascii="Microsoft YaHei" w:hAnsi="Microsoft YaHei" w:eastAsia="Microsoft YaHei" w:cs="Microsoft YaHei"/>
+                <w:b w:val="0"/>
+                <w:color w:val="000000"/>
+                <w:sz w:val="16"/>
+              </w:rPr>
               <w:t>、</w:t>
             </w:r>
             <w:r>
@@ -10003,6 +12557,40 @@
                 <w:sz w:val="16"/>
               </w:rPr>
               <w:t>evidence/report_docx/summary.md</w:t>
+            </w:r>
+            <w:r>
+              <w:rPr>
+                <w:rFonts w:ascii="Microsoft YaHei" w:hAnsi="Microsoft YaHei" w:eastAsia="Microsoft YaHei" w:cs="Microsoft YaHei"/>
+                <w:b w:val="0"/>
+                <w:color w:val="000000"/>
+                <w:sz w:val="16"/>
+              </w:rPr>
+              <w:t>；当前完整导出版：</w:t>
+            </w:r>
+            <w:r>
+              <w:rPr>
+                <w:rFonts w:ascii="Consolas" w:hAnsi="Consolas" w:eastAsia="Microsoft YaHei" w:cs="Consolas"/>
+                <w:color w:val="000000"/>
+                <w:sz w:val="16"/>
+              </w:rPr>
+              <w:t>output/docx/W8A12_3lane_contest_submission_report_complete_20260701.docx</w:t>
+            </w:r>
+            <w:r>
+              <w:rPr>
+                <w:rFonts w:ascii="Microsoft YaHei" w:hAnsi="Microsoft YaHei" w:eastAsia="Microsoft YaHei" w:cs="Microsoft YaHei"/>
+                <w:b w:val="0"/>
+                <w:color w:val="000000"/>
+                <w:sz w:val="16"/>
+              </w:rPr>
+              <w:t>、</w:t>
+            </w:r>
+            <w:r>
+              <w:rPr>
+                <w:rFonts w:ascii="Consolas" w:hAnsi="Consolas" w:eastAsia="Microsoft YaHei" w:cs="Consolas"/>
+                <w:color w:val="000000"/>
+                <w:sz w:val="16"/>
+              </w:rPr>
+              <w:t>evidence/report_docx_complete_20260701/summary.md</w:t>
             </w:r>
           </w:p>
         </w:tc>
@@ -10567,6 +13155,216 @@
                 <w:sz w:val="16"/>
               </w:rPr>
               <w:t>evidence/resource/A4_*_ooc/</w:t>
+            </w:r>
+          </w:p>
+        </w:tc>
+      </w:tr>
+      <w:tr>
+        <w:tc>
+          <w:tcPr>
+            <w:tcW w:type="dxa" w:w="3925"/>
+            <w:tcMar>
+              <w:top w:w="80" w:type="dxa"/>
+              <w:bottom w:w="80" w:type="dxa"/>
+              <w:start w:w="120" w:type="dxa"/>
+              <w:end w:w="120" w:type="dxa"/>
+            </w:tcMar>
+            <w:vAlign w:val="center"/>
+          </w:tcPr>
+          <w:p>
+            <w:pPr>
+              <w:spacing w:after="0"/>
+            </w:pPr>
+            <w:r>
+              <w:rPr>
+                <w:rFonts w:ascii="Microsoft YaHei" w:hAnsi="Microsoft YaHei" w:eastAsia="Microsoft YaHei" w:cs="Microsoft YaHei"/>
+                <w:b w:val="0"/>
+                <w:color w:val="000000"/>
+                <w:sz w:val="16"/>
+              </w:rPr>
+              <w:t>bitstream/PPA gate</w:t>
+            </w:r>
+          </w:p>
+        </w:tc>
+        <w:tc>
+          <w:tcPr>
+            <w:tcW w:type="dxa" w:w="5435"/>
+            <w:tcMar>
+              <w:top w:w="80" w:type="dxa"/>
+              <w:bottom w:w="80" w:type="dxa"/>
+              <w:start w:w="120" w:type="dxa"/>
+              <w:end w:w="120" w:type="dxa"/>
+            </w:tcMar>
+            <w:vAlign w:val="center"/>
+          </w:tcPr>
+          <w:p>
+            <w:pPr>
+              <w:spacing w:after="0"/>
+            </w:pPr>
+            <w:r>
+              <w:rPr>
+                <w:rFonts w:ascii="Consolas" w:hAnsi="Consolas" w:eastAsia="Microsoft YaHei" w:cs="Consolas"/>
+                <w:color w:val="000000"/>
+                <w:sz w:val="16"/>
+              </w:rPr>
+              <w:t>evidence/bitstream_ppa_gate/summary.md</w:t>
+            </w:r>
+          </w:p>
+        </w:tc>
+      </w:tr>
+      <w:tr>
+        <w:tc>
+          <w:tcPr>
+            <w:tcW w:type="dxa" w:w="3925"/>
+            <w:tcMar>
+              <w:top w:w="80" w:type="dxa"/>
+              <w:bottom w:w="80" w:type="dxa"/>
+              <w:start w:w="120" w:type="dxa"/>
+              <w:end w:w="120" w:type="dxa"/>
+            </w:tcMar>
+            <w:vAlign w:val="center"/>
+          </w:tcPr>
+          <w:p>
+            <w:pPr>
+              <w:spacing w:after="0"/>
+            </w:pPr>
+            <w:r>
+              <w:rPr>
+                <w:rFonts w:ascii="Microsoft YaHei" w:hAnsi="Microsoft YaHei" w:eastAsia="Microsoft YaHei" w:cs="Microsoft YaHei"/>
+                <w:b w:val="0"/>
+                <w:color w:val="000000"/>
+                <w:sz w:val="16"/>
+              </w:rPr>
+              <w:t>赛题提交口径门禁</w:t>
+            </w:r>
+          </w:p>
+        </w:tc>
+        <w:tc>
+          <w:tcPr>
+            <w:tcW w:type="dxa" w:w="5435"/>
+            <w:tcMar>
+              <w:top w:w="80" w:type="dxa"/>
+              <w:bottom w:w="80" w:type="dxa"/>
+              <w:start w:w="120" w:type="dxa"/>
+              <w:end w:w="120" w:type="dxa"/>
+            </w:tcMar>
+            <w:vAlign w:val="center"/>
+          </w:tcPr>
+          <w:p>
+            <w:pPr>
+              <w:spacing w:after="0"/>
+            </w:pPr>
+            <w:r>
+              <w:rPr>
+                <w:rFonts w:ascii="Consolas" w:hAnsi="Consolas" w:eastAsia="Microsoft YaHei" w:cs="Consolas"/>
+                <w:color w:val="000000"/>
+                <w:sz w:val="16"/>
+              </w:rPr>
+              <w:t>evidence/contest_scope_readiness/summary.md</w:t>
+            </w:r>
+          </w:p>
+        </w:tc>
+      </w:tr>
+      <w:tr>
+        <w:tc>
+          <w:tcPr>
+            <w:tcW w:type="dxa" w:w="3925"/>
+            <w:tcMar>
+              <w:top w:w="80" w:type="dxa"/>
+              <w:bottom w:w="80" w:type="dxa"/>
+              <w:start w:w="120" w:type="dxa"/>
+              <w:end w:w="120" w:type="dxa"/>
+            </w:tcMar>
+            <w:vAlign w:val="center"/>
+          </w:tcPr>
+          <w:p>
+            <w:pPr>
+              <w:spacing w:after="0"/>
+            </w:pPr>
+            <w:r>
+              <w:rPr>
+                <w:rFonts w:ascii="Microsoft YaHei" w:hAnsi="Microsoft YaHei" w:eastAsia="Microsoft YaHei" w:cs="Microsoft YaHei"/>
+                <w:b w:val="0"/>
+                <w:color w:val="000000"/>
+                <w:sz w:val="16"/>
+              </w:rPr>
+              <w:t>packed 2-D FPS scheduler</w:t>
+            </w:r>
+          </w:p>
+        </w:tc>
+        <w:tc>
+          <w:tcPr>
+            <w:tcW w:type="dxa" w:w="5435"/>
+            <w:tcMar>
+              <w:top w:w="80" w:type="dxa"/>
+              <w:bottom w:w="80" w:type="dxa"/>
+              <w:start w:w="120" w:type="dxa"/>
+              <w:end w:w="120" w:type="dxa"/>
+            </w:tcMar>
+            <w:vAlign w:val="center"/>
+          </w:tcPr>
+          <w:p>
+            <w:pPr>
+              <w:spacing w:after="0"/>
+            </w:pPr>
+            <w:r>
+              <w:rPr>
+                <w:rFonts w:ascii="Consolas" w:hAnsi="Consolas" w:eastAsia="Microsoft YaHei" w:cs="Consolas"/>
+                <w:color w:val="000000"/>
+                <w:sz w:val="16"/>
+              </w:rPr>
+              <w:t>evidence/sim_fps_design_space/packed2d_perf_scheduler/summary.md</w:t>
+            </w:r>
+            <w:r>
+              <w:rPr>
+                <w:rFonts w:ascii="Microsoft YaHei" w:hAnsi="Microsoft YaHei" w:eastAsia="Microsoft YaHei" w:cs="Microsoft YaHei"/>
+                <w:b w:val="0"/>
+                <w:color w:val="000000"/>
+                <w:sz w:val="16"/>
+              </w:rPr>
+              <w:t>、</w:t>
+            </w:r>
+            <w:r>
+              <w:rPr>
+                <w:rFonts w:ascii="Consolas" w:hAnsi="Consolas" w:eastAsia="Microsoft YaHei" w:cs="Consolas"/>
+                <w:color w:val="000000"/>
+                <w:sz w:val="16"/>
+              </w:rPr>
+              <w:t>evidence/sim_fps_design_space/x4_720p15_fps_closure/summary.md</w:t>
+            </w:r>
+            <w:r>
+              <w:rPr>
+                <w:rFonts w:ascii="Microsoft YaHei" w:hAnsi="Microsoft YaHei" w:eastAsia="Microsoft YaHei" w:cs="Microsoft YaHei"/>
+                <w:b w:val="0"/>
+                <w:color w:val="000000"/>
+                <w:sz w:val="16"/>
+              </w:rPr>
+              <w:t>、</w:t>
+            </w:r>
+            <w:r>
+              <w:rPr>
+                <w:rFonts w:ascii="Consolas" w:hAnsi="Consolas" w:eastAsia="Microsoft YaHei" w:cs="Consolas"/>
+                <w:color w:val="000000"/>
+                <w:sz w:val="16"/>
+              </w:rPr>
+              <w:t>evidence/sim_fps_design_space/x2_720p4_fps_closure/summary.md</w:t>
+            </w:r>
+            <w:r>
+              <w:rPr>
+                <w:rFonts w:ascii="Microsoft YaHei" w:hAnsi="Microsoft YaHei" w:eastAsia="Microsoft YaHei" w:cs="Microsoft YaHei"/>
+                <w:b w:val="0"/>
+                <w:color w:val="000000"/>
+                <w:sz w:val="16"/>
+              </w:rPr>
+              <w:t>、</w:t>
+            </w:r>
+            <w:r>
+              <w:rPr>
+                <w:rFonts w:ascii="Consolas" w:hAnsi="Consolas" w:eastAsia="Microsoft YaHei" w:cs="Consolas"/>
+                <w:color w:val="000000"/>
+                <w:sz w:val="16"/>
+              </w:rPr>
+              <w:t>evidence/sim_fps_design_space/packed2d_x2_720p20_perf_scheduler/summary.md</w:t>
             </w:r>
           </w:p>
         </w:tc>
@@ -10858,7 +13656,7 @@
           <w:b w:val="0"/>
           <w:color w:val="000000"/>
         </w:rPr>
-        <w:t>当前 W8A12_3lane 已经形成可用于赛题中期/相当报告的完整离线证据链：模型训练和验证口径明确，x4/x2 FP32 画质达到目标，传统插值 baseline 已对比，W8A12 定点导出和 x2 fixed reference 已通过，A0-A4 和 top shell 的 RTL 仿真/OOC 综合均有 PASS 证据，3-lane scheduler 在 XC7Z045 资源门限内。</w:t>
+        <w:t>当前 W8A12_3lane 已经形成可用于赛题阶段性交付/相当报告的完整离线证据链：模型训练和验证口径明确，x4/x2 FP32 画质达到目标，传统插值 baseline 已对比，W8A12 定点导出和 x2 fixed reference 已通过，A0-A4 和 top shell 的 RTL 仿真/OOC 综合均有 PASS 证据，3-lane scheduler 在 XC7Z045 资源门限内。报告、Word/PDF 导出、交付索引、证据矩阵和 GitHub 草案上传链路也已经建立。</w:t>
       </w:r>
     </w:p>
     <w:p>
@@ -11004,6 +13802,61 @@
           <w:color w:val="000000"/>
         </w:rPr>
         <w:t xml:space="preserve"> 链路内收窄第一个错误点，再逐步补齐 32x32、64x64、720p x4 和 720p x2 board validation。</w:t>
+      </w:r>
+    </w:p>
+    <w:p>
+      <w:r>
+        <w:rPr>
+          <w:rFonts w:ascii="Microsoft YaHei" w:hAnsi="Microsoft YaHei" w:eastAsia="Microsoft YaHei" w:cs="Microsoft YaHei"/>
+          <w:b w:val="0"/>
+          <w:color w:val="000000"/>
+        </w:rPr>
+        <w:t xml:space="preserve">最终结论：若评审口径为“正确性仿真通过 + 可生成 bitstream + 提供 PPA/资源时序报告”，当前材料可以作为赛题报告/PPA 提交版，并以 </w:t>
+      </w:r>
+      <w:r>
+        <w:rPr>
+          <w:rFonts w:ascii="Consolas" w:hAnsi="Consolas" w:eastAsia="Microsoft YaHei" w:cs="Consolas"/>
+          <w:color w:val="000000"/>
+        </w:rPr>
+        <w:t>evidence/contest_scope_readiness/summary.md</w:t>
+      </w:r>
+      <w:r>
+        <w:rPr>
+          <w:rFonts w:ascii="Microsoft YaHei" w:hAnsi="Microsoft YaHei" w:eastAsia="Microsoft YaHei" w:cs="Microsoft YaHei"/>
+          <w:b w:val="0"/>
+          <w:color w:val="000000"/>
+        </w:rPr>
+        <w:t xml:space="preserve"> 的 </w:t>
+      </w:r>
+      <w:r>
+        <w:rPr>
+          <w:rFonts w:ascii="Consolas" w:hAnsi="Consolas" w:eastAsia="Microsoft YaHei" w:cs="Consolas"/>
+          <w:color w:val="000000"/>
+        </w:rPr>
+        <w:t>PASS_WITH_SCOPE</w:t>
+      </w:r>
+      <w:r>
+        <w:rPr>
+          <w:rFonts w:ascii="Microsoft YaHei" w:hAnsi="Microsoft YaHei" w:eastAsia="Microsoft YaHei" w:cs="Microsoft YaHei"/>
+          <w:b w:val="0"/>
+          <w:color w:val="000000"/>
+        </w:rPr>
+        <w:t xml:space="preserve"> 作为提交前门禁；若评审明确要求真实板端 32x32/64x64/720p 输出和板端 FPS/功耗实测，则严格 board-validation 口径仍为 </w:t>
+      </w:r>
+      <w:r>
+        <w:rPr>
+          <w:rFonts w:ascii="Consolas" w:hAnsi="Consolas" w:eastAsia="Microsoft YaHei" w:cs="Consolas"/>
+          <w:color w:val="000000"/>
+        </w:rPr>
+        <w:t>INCOMPLETE</w:t>
+      </w:r>
+      <w:r>
+        <w:rPr>
+          <w:rFonts w:ascii="Microsoft YaHei" w:hAnsi="Microsoft YaHei" w:eastAsia="Microsoft YaHei" w:cs="Microsoft YaHei"/>
+          <w:b w:val="0"/>
+          <w:color w:val="000000"/>
+        </w:rPr>
+        <w:t>，必须继续完成上板任务后刷新报告和交付包。</w:t>
       </w:r>
     </w:p>
     <w:sectPr>

</xml_diff>

<commit_message>
Add contest scope submission package
</commit_message>
<xml_diff>
--- a/W8A12_3lane/output/docx/W8A12_3lane_contest_submission_report.docx
+++ b/W8A12_3lane/output/docx/W8A12_3lane_contest_submission_report.docx
@@ -12076,6 +12076,91 @@
           <w:b w:val="0"/>
           <w:color w:val="000000"/>
         </w:rPr>
+        <w:t>在此基础上，</w:t>
+      </w:r>
+      <w:r>
+        <w:rPr>
+          <w:rFonts w:ascii="Consolas" w:hAnsi="Consolas" w:eastAsia="Microsoft YaHei" w:cs="Consolas"/>
+          <w:color w:val="000000"/>
+        </w:rPr>
+        <w:t>tools/create_contest_scope_package.py</w:t>
+      </w:r>
+      <w:r>
+        <w:rPr>
+          <w:rFonts w:ascii="Microsoft YaHei" w:hAnsi="Microsoft YaHei" w:eastAsia="Microsoft YaHei" w:cs="Microsoft YaHei"/>
+          <w:b w:val="0"/>
+          <w:color w:val="000000"/>
+        </w:rPr>
+        <w:t xml:space="preserve"> 会从当前 submission manifest 生成独立的赛题口径提交包，证据见 </w:t>
+      </w:r>
+      <w:r>
+        <w:rPr>
+          <w:rFonts w:ascii="Consolas" w:hAnsi="Consolas" w:eastAsia="Microsoft YaHei" w:cs="Consolas"/>
+          <w:color w:val="000000"/>
+        </w:rPr>
+        <w:t>evidence/contest_scope_package/summary.md</w:t>
+      </w:r>
+      <w:r>
+        <w:rPr>
+          <w:rFonts w:ascii="Microsoft YaHei" w:hAnsi="Microsoft YaHei" w:eastAsia="Microsoft YaHei" w:cs="Microsoft YaHei"/>
+          <w:b w:val="0"/>
+          <w:color w:val="000000"/>
+        </w:rPr>
+        <w:t xml:space="preserve">。该包的 </w:t>
+      </w:r>
+      <w:r>
+        <w:rPr>
+          <w:rFonts w:ascii="Consolas" w:hAnsi="Consolas" w:eastAsia="Microsoft YaHei" w:cs="Consolas"/>
+          <w:color w:val="000000"/>
+        </w:rPr>
+        <w:t>PASS_WITH_SCOPE</w:t>
+      </w:r>
+      <w:r>
+        <w:rPr>
+          <w:rFonts w:ascii="Microsoft YaHei" w:hAnsi="Microsoft YaHei" w:eastAsia="Microsoft YaHei" w:cs="Microsoft YaHei"/>
+          <w:b w:val="0"/>
+          <w:color w:val="000000"/>
+        </w:rPr>
+        <w:t xml:space="preserve"> 只适用于“无真实插板硬门槛”的赛题报告/PPA 提交口径；严格上板归档仍保留在 </w:t>
+      </w:r>
+      <w:r>
+        <w:rPr>
+          <w:rFonts w:ascii="Consolas" w:hAnsi="Consolas" w:eastAsia="Microsoft YaHei" w:cs="Consolas"/>
+          <w:color w:val="000000"/>
+        </w:rPr>
+        <w:t>evidence/submission_package/archive/summary.md</w:t>
+      </w:r>
+      <w:r>
+        <w:rPr>
+          <w:rFonts w:ascii="Microsoft YaHei" w:hAnsi="Microsoft YaHei" w:eastAsia="Microsoft YaHei" w:cs="Microsoft YaHei"/>
+          <w:b w:val="0"/>
+          <w:color w:val="000000"/>
+        </w:rPr>
+        <w:t xml:space="preserve">，并继续以 </w:t>
+      </w:r>
+      <w:r>
+        <w:rPr>
+          <w:rFonts w:ascii="Consolas" w:hAnsi="Consolas" w:eastAsia="Microsoft YaHei" w:cs="Consolas"/>
+          <w:color w:val="000000"/>
+        </w:rPr>
+        <w:t>INCOMPLETE</w:t>
+      </w:r>
+      <w:r>
+        <w:rPr>
+          <w:rFonts w:ascii="Microsoft YaHei" w:hAnsi="Microsoft YaHei" w:eastAsia="Microsoft YaHei" w:cs="Microsoft YaHei"/>
+          <w:b w:val="0"/>
+          <w:color w:val="000000"/>
+        </w:rPr>
+        <w:t xml:space="preserve"> 标记 4 个真实板端 validation 缺口。</w:t>
+      </w:r>
+    </w:p>
+    <w:p>
+      <w:r>
+        <w:rPr>
+          <w:rFonts w:ascii="Microsoft YaHei" w:hAnsi="Microsoft YaHei" w:eastAsia="Microsoft YaHei" w:cs="Microsoft YaHei"/>
+          <w:b w:val="0"/>
+          <w:color w:val="000000"/>
+        </w:rPr>
         <w:t>在报告/PPA 优先主线下，当前可以先提交离线模型、RTL 仿真、bitstream、OOC/implementation PPA 和风险说明材料；若评审没有真实上板要求，上述 4 项不会影响 bitstream/PPA 口径的提交。</w:t>
       </w:r>
     </w:p>
@@ -12136,6 +12221,8 @@
         <w:br/>
         <w:t>python W8A12_3lane\tools\check_contest_scope_readiness.py</w:t>
         <w:br/>
+        <w:t>python W8A12_3lane\tools\create_contest_scope_package.py</w:t>
+        <w:br/>
         <w:t>python W8A12_3lane\tools\create_submission_archive.py --allow-incomplete</w:t>
         <w:br/>
         <w:t>python W8A12_3lane\tools\collect_delivery_manifest.py</w:t>
@@ -12191,8 +12278,8 @@
         <w:tblInd w:w="120" w:type="dxa"/>
       </w:tblPr>
       <w:tblGrid>
-        <w:gridCol w:w="3925"/>
-        <w:gridCol w:w="5435"/>
+        <w:gridCol w:w="3744"/>
+        <w:gridCol w:w="5616"/>
       </w:tblGrid>
       <w:tr>
         <w:trPr>
@@ -12200,7 +12287,7 @@
         </w:trPr>
         <w:tc>
           <w:tcPr>
-            <w:tcW w:type="dxa" w:w="3925"/>
+            <w:tcW w:type="dxa" w:w="3744"/>
             <w:tcMar>
               <w:top w:w="80" w:type="dxa"/>
               <w:bottom w:w="80" w:type="dxa"/>
@@ -12227,7 +12314,7 @@
         </w:tc>
         <w:tc>
           <w:tcPr>
-            <w:tcW w:type="dxa" w:w="5435"/>
+            <w:tcW w:type="dxa" w:w="5616"/>
             <w:tcMar>
               <w:top w:w="80" w:type="dxa"/>
               <w:bottom w:w="80" w:type="dxa"/>
@@ -12256,7 +12343,7 @@
       <w:tr>
         <w:tc>
           <w:tcPr>
-            <w:tcW w:type="dxa" w:w="3925"/>
+            <w:tcW w:type="dxa" w:w="3744"/>
             <w:tcMar>
               <w:top w:w="80" w:type="dxa"/>
               <w:bottom w:w="80" w:type="dxa"/>
@@ -12282,7 +12369,7 @@
         </w:tc>
         <w:tc>
           <w:tcPr>
-            <w:tcW w:type="dxa" w:w="5435"/>
+            <w:tcW w:type="dxa" w:w="5616"/>
             <w:tcMar>
               <w:top w:w="80" w:type="dxa"/>
               <w:bottom w:w="80" w:type="dxa"/>
@@ -12309,7 +12396,7 @@
       <w:tr>
         <w:tc>
           <w:tcPr>
-            <w:tcW w:type="dxa" w:w="3925"/>
+            <w:tcW w:type="dxa" w:w="3744"/>
             <w:tcMar>
               <w:top w:w="80" w:type="dxa"/>
               <w:bottom w:w="80" w:type="dxa"/>
@@ -12335,7 +12422,7 @@
         </w:tc>
         <w:tc>
           <w:tcPr>
-            <w:tcW w:type="dxa" w:w="5435"/>
+            <w:tcW w:type="dxa" w:w="5616"/>
             <w:tcMar>
               <w:top w:w="80" w:type="dxa"/>
               <w:bottom w:w="80" w:type="dxa"/>
@@ -12362,7 +12449,7 @@
       <w:tr>
         <w:tc>
           <w:tcPr>
-            <w:tcW w:type="dxa" w:w="3925"/>
+            <w:tcW w:type="dxa" w:w="3744"/>
             <w:tcMar>
               <w:top w:w="80" w:type="dxa"/>
               <w:bottom w:w="80" w:type="dxa"/>
@@ -12388,7 +12475,7 @@
         </w:tc>
         <w:tc>
           <w:tcPr>
-            <w:tcW w:type="dxa" w:w="5435"/>
+            <w:tcW w:type="dxa" w:w="5616"/>
             <w:tcMar>
               <w:top w:w="80" w:type="dxa"/>
               <w:bottom w:w="80" w:type="dxa"/>
@@ -12415,7 +12502,7 @@
       <w:tr>
         <w:tc>
           <w:tcPr>
-            <w:tcW w:type="dxa" w:w="3925"/>
+            <w:tcW w:type="dxa" w:w="3744"/>
             <w:tcMar>
               <w:top w:w="80" w:type="dxa"/>
               <w:bottom w:w="80" w:type="dxa"/>
@@ -12441,7 +12528,7 @@
         </w:tc>
         <w:tc>
           <w:tcPr>
-            <w:tcW w:type="dxa" w:w="5435"/>
+            <w:tcW w:type="dxa" w:w="5616"/>
             <w:tcMar>
               <w:top w:w="80" w:type="dxa"/>
               <w:bottom w:w="80" w:type="dxa"/>
@@ -12485,7 +12572,7 @@
       <w:tr>
         <w:tc>
           <w:tcPr>
-            <w:tcW w:type="dxa" w:w="3925"/>
+            <w:tcW w:type="dxa" w:w="3744"/>
             <w:tcMar>
               <w:top w:w="80" w:type="dxa"/>
               <w:bottom w:w="80" w:type="dxa"/>
@@ -12511,7 +12598,7 @@
         </w:tc>
         <w:tc>
           <w:tcPr>
-            <w:tcW w:type="dxa" w:w="5435"/>
+            <w:tcW w:type="dxa" w:w="5616"/>
             <w:tcMar>
               <w:top w:w="80" w:type="dxa"/>
               <w:bottom w:w="80" w:type="dxa"/>
@@ -12598,7 +12685,7 @@
       <w:tr>
         <w:tc>
           <w:tcPr>
-            <w:tcW w:type="dxa" w:w="3925"/>
+            <w:tcW w:type="dxa" w:w="3744"/>
             <w:tcMar>
               <w:top w:w="80" w:type="dxa"/>
               <w:bottom w:w="80" w:type="dxa"/>
@@ -12624,7 +12711,7 @@
         </w:tc>
         <w:tc>
           <w:tcPr>
-            <w:tcW w:type="dxa" w:w="5435"/>
+            <w:tcW w:type="dxa" w:w="5616"/>
             <w:tcMar>
               <w:top w:w="80" w:type="dxa"/>
               <w:bottom w:w="80" w:type="dxa"/>
@@ -12651,7 +12738,7 @@
       <w:tr>
         <w:tc>
           <w:tcPr>
-            <w:tcW w:type="dxa" w:w="3925"/>
+            <w:tcW w:type="dxa" w:w="3744"/>
             <w:tcMar>
               <w:top w:w="80" w:type="dxa"/>
               <w:bottom w:w="80" w:type="dxa"/>
@@ -12677,7 +12764,7 @@
         </w:tc>
         <w:tc>
           <w:tcPr>
-            <w:tcW w:type="dxa" w:w="5435"/>
+            <w:tcW w:type="dxa" w:w="5616"/>
             <w:tcMar>
               <w:top w:w="80" w:type="dxa"/>
               <w:bottom w:w="80" w:type="dxa"/>
@@ -12704,7 +12791,7 @@
       <w:tr>
         <w:tc>
           <w:tcPr>
-            <w:tcW w:type="dxa" w:w="3925"/>
+            <w:tcW w:type="dxa" w:w="3744"/>
             <w:tcMar>
               <w:top w:w="80" w:type="dxa"/>
               <w:bottom w:w="80" w:type="dxa"/>
@@ -12730,7 +12817,7 @@
         </w:tc>
         <w:tc>
           <w:tcPr>
-            <w:tcW w:type="dxa" w:w="5435"/>
+            <w:tcW w:type="dxa" w:w="5616"/>
             <w:tcMar>
               <w:top w:w="80" w:type="dxa"/>
               <w:bottom w:w="80" w:type="dxa"/>
@@ -12757,7 +12844,7 @@
       <w:tr>
         <w:tc>
           <w:tcPr>
-            <w:tcW w:type="dxa" w:w="3925"/>
+            <w:tcW w:type="dxa" w:w="3744"/>
             <w:tcMar>
               <w:top w:w="80" w:type="dxa"/>
               <w:bottom w:w="80" w:type="dxa"/>
@@ -12783,7 +12870,7 @@
         </w:tc>
         <w:tc>
           <w:tcPr>
-            <w:tcW w:type="dxa" w:w="5435"/>
+            <w:tcW w:type="dxa" w:w="5616"/>
             <w:tcMar>
               <w:top w:w="80" w:type="dxa"/>
               <w:bottom w:w="80" w:type="dxa"/>
@@ -12810,7 +12897,7 @@
       <w:tr>
         <w:tc>
           <w:tcPr>
-            <w:tcW w:type="dxa" w:w="3925"/>
+            <w:tcW w:type="dxa" w:w="3744"/>
             <w:tcMar>
               <w:top w:w="80" w:type="dxa"/>
               <w:bottom w:w="80" w:type="dxa"/>
@@ -12836,7 +12923,7 @@
         </w:tc>
         <w:tc>
           <w:tcPr>
-            <w:tcW w:type="dxa" w:w="5435"/>
+            <w:tcW w:type="dxa" w:w="5616"/>
             <w:tcMar>
               <w:top w:w="80" w:type="dxa"/>
               <w:bottom w:w="80" w:type="dxa"/>
@@ -12880,7 +12967,7 @@
       <w:tr>
         <w:tc>
           <w:tcPr>
-            <w:tcW w:type="dxa" w:w="3925"/>
+            <w:tcW w:type="dxa" w:w="3744"/>
             <w:tcMar>
               <w:top w:w="80" w:type="dxa"/>
               <w:bottom w:w="80" w:type="dxa"/>
@@ -12906,7 +12993,7 @@
         </w:tc>
         <w:tc>
           <w:tcPr>
-            <w:tcW w:type="dxa" w:w="5435"/>
+            <w:tcW w:type="dxa" w:w="5616"/>
             <w:tcMar>
               <w:top w:w="80" w:type="dxa"/>
               <w:bottom w:w="80" w:type="dxa"/>
@@ -12933,7 +13020,7 @@
       <w:tr>
         <w:tc>
           <w:tcPr>
-            <w:tcW w:type="dxa" w:w="3925"/>
+            <w:tcW w:type="dxa" w:w="3744"/>
             <w:tcMar>
               <w:top w:w="80" w:type="dxa"/>
               <w:bottom w:w="80" w:type="dxa"/>
@@ -12959,7 +13046,7 @@
         </w:tc>
         <w:tc>
           <w:tcPr>
-            <w:tcW w:type="dxa" w:w="5435"/>
+            <w:tcW w:type="dxa" w:w="5616"/>
             <w:tcMar>
               <w:top w:w="80" w:type="dxa"/>
               <w:bottom w:w="80" w:type="dxa"/>
@@ -12986,7 +13073,7 @@
       <w:tr>
         <w:tc>
           <w:tcPr>
-            <w:tcW w:type="dxa" w:w="3925"/>
+            <w:tcW w:type="dxa" w:w="3744"/>
             <w:tcMar>
               <w:top w:w="80" w:type="dxa"/>
               <w:bottom w:w="80" w:type="dxa"/>
@@ -13012,7 +13099,7 @@
         </w:tc>
         <w:tc>
           <w:tcPr>
-            <w:tcW w:type="dxa" w:w="5435"/>
+            <w:tcW w:type="dxa" w:w="5616"/>
             <w:tcMar>
               <w:top w:w="80" w:type="dxa"/>
               <w:bottom w:w="80" w:type="dxa"/>
@@ -13056,7 +13143,7 @@
       <w:tr>
         <w:tc>
           <w:tcPr>
-            <w:tcW w:type="dxa" w:w="3925"/>
+            <w:tcW w:type="dxa" w:w="3744"/>
             <w:tcMar>
               <w:top w:w="80" w:type="dxa"/>
               <w:bottom w:w="80" w:type="dxa"/>
@@ -13082,7 +13169,7 @@
         </w:tc>
         <w:tc>
           <w:tcPr>
-            <w:tcW w:type="dxa" w:w="5435"/>
+            <w:tcW w:type="dxa" w:w="5616"/>
             <w:tcMar>
               <w:top w:w="80" w:type="dxa"/>
               <w:bottom w:w="80" w:type="dxa"/>
@@ -13109,7 +13196,7 @@
       <w:tr>
         <w:tc>
           <w:tcPr>
-            <w:tcW w:type="dxa" w:w="3925"/>
+            <w:tcW w:type="dxa" w:w="3744"/>
             <w:tcMar>
               <w:top w:w="80" w:type="dxa"/>
               <w:bottom w:w="80" w:type="dxa"/>
@@ -13135,7 +13222,7 @@
         </w:tc>
         <w:tc>
           <w:tcPr>
-            <w:tcW w:type="dxa" w:w="5435"/>
+            <w:tcW w:type="dxa" w:w="5616"/>
             <w:tcMar>
               <w:top w:w="80" w:type="dxa"/>
               <w:bottom w:w="80" w:type="dxa"/>
@@ -13162,7 +13249,7 @@
       <w:tr>
         <w:tc>
           <w:tcPr>
-            <w:tcW w:type="dxa" w:w="3925"/>
+            <w:tcW w:type="dxa" w:w="3744"/>
             <w:tcMar>
               <w:top w:w="80" w:type="dxa"/>
               <w:bottom w:w="80" w:type="dxa"/>
@@ -13188,7 +13275,7 @@
         </w:tc>
         <w:tc>
           <w:tcPr>
-            <w:tcW w:type="dxa" w:w="5435"/>
+            <w:tcW w:type="dxa" w:w="5616"/>
             <w:tcMar>
               <w:top w:w="80" w:type="dxa"/>
               <w:bottom w:w="80" w:type="dxa"/>
@@ -13215,7 +13302,7 @@
       <w:tr>
         <w:tc>
           <w:tcPr>
-            <w:tcW w:type="dxa" w:w="3925"/>
+            <w:tcW w:type="dxa" w:w="3744"/>
             <w:tcMar>
               <w:top w:w="80" w:type="dxa"/>
               <w:bottom w:w="80" w:type="dxa"/>
@@ -13241,7 +13328,7 @@
         </w:tc>
         <w:tc>
           <w:tcPr>
-            <w:tcW w:type="dxa" w:w="5435"/>
+            <w:tcW w:type="dxa" w:w="5616"/>
             <w:tcMar>
               <w:top w:w="80" w:type="dxa"/>
               <w:bottom w:w="80" w:type="dxa"/>
@@ -13268,7 +13355,7 @@
       <w:tr>
         <w:tc>
           <w:tcPr>
-            <w:tcW w:type="dxa" w:w="3925"/>
+            <w:tcW w:type="dxa" w:w="3744"/>
             <w:tcMar>
               <w:top w:w="80" w:type="dxa"/>
               <w:bottom w:w="80" w:type="dxa"/>
@@ -13288,13 +13375,13 @@
                 <w:color w:val="000000"/>
                 <w:sz w:val="16"/>
               </w:rPr>
-              <w:t>packed 2-D FPS scheduler</w:t>
-            </w:r>
-          </w:p>
-        </w:tc>
-        <w:tc>
-          <w:tcPr>
-            <w:tcW w:type="dxa" w:w="5435"/>
+              <w:t>赛题口径提交包</w:t>
+            </w:r>
+          </w:p>
+        </w:tc>
+        <w:tc>
+          <w:tcPr>
+            <w:tcW w:type="dxa" w:w="5616"/>
             <w:tcMar>
               <w:top w:w="80" w:type="dxa"/>
               <w:bottom w:w="80" w:type="dxa"/>
@@ -13313,8 +13400,27 @@
                 <w:color w:val="000000"/>
                 <w:sz w:val="16"/>
               </w:rPr>
-              <w:t>evidence/sim_fps_design_space/packed2d_perf_scheduler/summary.md</w:t>
-            </w:r>
+              <w:t>evidence/contest_scope_package/summary.md</w:t>
+            </w:r>
+          </w:p>
+        </w:tc>
+      </w:tr>
+      <w:tr>
+        <w:tc>
+          <w:tcPr>
+            <w:tcW w:type="dxa" w:w="3744"/>
+            <w:tcMar>
+              <w:top w:w="80" w:type="dxa"/>
+              <w:bottom w:w="80" w:type="dxa"/>
+              <w:start w:w="120" w:type="dxa"/>
+              <w:end w:w="120" w:type="dxa"/>
+            </w:tcMar>
+            <w:vAlign w:val="center"/>
+          </w:tcPr>
+          <w:p>
+            <w:pPr>
+              <w:spacing w:after="0"/>
+            </w:pPr>
             <w:r>
               <w:rPr>
                 <w:rFonts w:ascii="Microsoft YaHei" w:hAnsi="Microsoft YaHei" w:eastAsia="Microsoft YaHei" w:cs="Microsoft YaHei"/>
@@ -13322,15 +13428,32 @@
                 <w:color w:val="000000"/>
                 <w:sz w:val="16"/>
               </w:rPr>
-              <w:t>、</w:t>
-            </w:r>
+              <w:t>packed 2-D FPS scheduler</w:t>
+            </w:r>
+          </w:p>
+        </w:tc>
+        <w:tc>
+          <w:tcPr>
+            <w:tcW w:type="dxa" w:w="5616"/>
+            <w:tcMar>
+              <w:top w:w="80" w:type="dxa"/>
+              <w:bottom w:w="80" w:type="dxa"/>
+              <w:start w:w="120" w:type="dxa"/>
+              <w:end w:w="120" w:type="dxa"/>
+            </w:tcMar>
+            <w:vAlign w:val="center"/>
+          </w:tcPr>
+          <w:p>
+            <w:pPr>
+              <w:spacing w:after="0"/>
+            </w:pPr>
             <w:r>
               <w:rPr>
                 <w:rFonts w:ascii="Consolas" w:hAnsi="Consolas" w:eastAsia="Microsoft YaHei" w:cs="Consolas"/>
                 <w:color w:val="000000"/>
                 <w:sz w:val="16"/>
               </w:rPr>
-              <w:t>evidence/sim_fps_design_space/x4_720p15_fps_closure/summary.md</w:t>
+              <w:t>evidence/sim_fps_design_space/packed2d_perf_scheduler/summary.md</w:t>
             </w:r>
             <w:r>
               <w:rPr>
@@ -13347,7 +13470,7 @@
                 <w:color w:val="000000"/>
                 <w:sz w:val="16"/>
               </w:rPr>
-              <w:t>evidence/sim_fps_design_space/x2_720p4_fps_closure/summary.md</w:t>
+              <w:t>evidence/sim_fps_design_space/x4_720p15_fps_closure/summary.md</w:t>
             </w:r>
             <w:r>
               <w:rPr>
@@ -13364,6 +13487,23 @@
                 <w:color w:val="000000"/>
                 <w:sz w:val="16"/>
               </w:rPr>
+              <w:t>evidence/sim_fps_design_space/x2_720p4_fps_closure/summary.md</w:t>
+            </w:r>
+            <w:r>
+              <w:rPr>
+                <w:rFonts w:ascii="Microsoft YaHei" w:hAnsi="Microsoft YaHei" w:eastAsia="Microsoft YaHei" w:cs="Microsoft YaHei"/>
+                <w:b w:val="0"/>
+                <w:color w:val="000000"/>
+                <w:sz w:val="16"/>
+              </w:rPr>
+              <w:t>、</w:t>
+            </w:r>
+            <w:r>
+              <w:rPr>
+                <w:rFonts w:ascii="Consolas" w:hAnsi="Consolas" w:eastAsia="Microsoft YaHei" w:cs="Consolas"/>
+                <w:color w:val="000000"/>
+                <w:sz w:val="16"/>
+              </w:rPr>
               <w:t>evidence/sim_fps_design_space/packed2d_x2_720p20_perf_scheduler/summary.md</w:t>
             </w:r>
           </w:p>
@@ -13372,7 +13512,7 @@
       <w:tr>
         <w:tc>
           <w:tcPr>
-            <w:tcW w:type="dxa" w:w="3925"/>
+            <w:tcW w:type="dxa" w:w="3744"/>
             <w:tcMar>
               <w:top w:w="80" w:type="dxa"/>
               <w:bottom w:w="80" w:type="dxa"/>
@@ -13398,7 +13538,7 @@
         </w:tc>
         <w:tc>
           <w:tcPr>
-            <w:tcW w:type="dxa" w:w="5435"/>
+            <w:tcW w:type="dxa" w:w="5616"/>
             <w:tcMar>
               <w:top w:w="80" w:type="dxa"/>
               <w:bottom w:w="80" w:type="dxa"/>
@@ -13425,7 +13565,7 @@
       <w:tr>
         <w:tc>
           <w:tcPr>
-            <w:tcW w:type="dxa" w:w="3925"/>
+            <w:tcW w:type="dxa" w:w="3744"/>
             <w:tcMar>
               <w:top w:w="80" w:type="dxa"/>
               <w:bottom w:w="80" w:type="dxa"/>
@@ -13451,7 +13591,7 @@
         </w:tc>
         <w:tc>
           <w:tcPr>
-            <w:tcW w:type="dxa" w:w="5435"/>
+            <w:tcW w:type="dxa" w:w="5616"/>
             <w:tcMar>
               <w:top w:w="80" w:type="dxa"/>
               <w:bottom w:w="80" w:type="dxa"/>
@@ -13478,7 +13618,7 @@
       <w:tr>
         <w:tc>
           <w:tcPr>
-            <w:tcW w:type="dxa" w:w="3925"/>
+            <w:tcW w:type="dxa" w:w="3744"/>
             <w:tcMar>
               <w:top w:w="80" w:type="dxa"/>
               <w:bottom w:w="80" w:type="dxa"/>
@@ -13504,7 +13644,7 @@
         </w:tc>
         <w:tc>
           <w:tcPr>
-            <w:tcW w:type="dxa" w:w="5435"/>
+            <w:tcW w:type="dxa" w:w="5616"/>
             <w:tcMar>
               <w:top w:w="80" w:type="dxa"/>
               <w:bottom w:w="80" w:type="dxa"/>
@@ -13531,7 +13671,7 @@
       <w:tr>
         <w:tc>
           <w:tcPr>
-            <w:tcW w:type="dxa" w:w="3925"/>
+            <w:tcW w:type="dxa" w:w="3744"/>
             <w:tcMar>
               <w:top w:w="80" w:type="dxa"/>
               <w:bottom w:w="80" w:type="dxa"/>
@@ -13551,13 +13691,13 @@
                 <w:color w:val="000000"/>
                 <w:sz w:val="16"/>
               </w:rPr>
-              <w:t>submission archive summary</w:t>
-            </w:r>
-          </w:p>
-        </w:tc>
-        <w:tc>
-          <w:tcPr>
-            <w:tcW w:type="dxa" w:w="5435"/>
+              <w:t>严格上板归档摘要</w:t>
+            </w:r>
+          </w:p>
+        </w:tc>
+        <w:tc>
+          <w:tcPr>
+            <w:tcW w:type="dxa" w:w="5616"/>
             <w:tcMar>
               <w:top w:w="80" w:type="dxa"/>
               <w:bottom w:w="80" w:type="dxa"/>
@@ -13584,7 +13724,7 @@
       <w:tr>
         <w:tc>
           <w:tcPr>
-            <w:tcW w:type="dxa" w:w="3925"/>
+            <w:tcW w:type="dxa" w:w="3744"/>
             <w:tcMar>
               <w:top w:w="80" w:type="dxa"/>
               <w:bottom w:w="80" w:type="dxa"/>
@@ -13610,7 +13750,7 @@
         </w:tc>
         <w:tc>
           <w:tcPr>
-            <w:tcW w:type="dxa" w:w="5435"/>
+            <w:tcW w:type="dxa" w:w="5616"/>
             <w:tcMar>
               <w:top w:w="80" w:type="dxa"/>
               <w:bottom w:w="80" w:type="dxa"/>
@@ -13819,6 +13959,21 @@
           <w:color w:val="000000"/>
         </w:rPr>
         <w:t>evidence/contest_scope_readiness/summary.md</w:t>
+      </w:r>
+      <w:r>
+        <w:rPr>
+          <w:rFonts w:ascii="Microsoft YaHei" w:hAnsi="Microsoft YaHei" w:eastAsia="Microsoft YaHei" w:cs="Microsoft YaHei"/>
+          <w:b w:val="0"/>
+          <w:color w:val="000000"/>
+        </w:rPr>
+        <w:t xml:space="preserve"> 与 </w:t>
+      </w:r>
+      <w:r>
+        <w:rPr>
+          <w:rFonts w:ascii="Consolas" w:hAnsi="Consolas" w:eastAsia="Microsoft YaHei" w:cs="Consolas"/>
+          <w:color w:val="000000"/>
+        </w:rPr>
+        <w:t>evidence/contest_scope_package/summary.md</w:t>
       </w:r>
       <w:r>
         <w:rPr>

</xml_diff>

<commit_message>
Add final submission guide
</commit_message>
<xml_diff>
--- a/W8A12_3lane/output/docx/W8A12_3lane_contest_submission_report.docx
+++ b/W8A12_3lane/output/docx/W8A12_3lane_contest_submission_report.docx
@@ -12678,6 +12678,59 @@
                 <w:sz w:val="16"/>
               </w:rPr>
               <w:t>evidence/report_docx_complete_20260701/summary.md</w:t>
+            </w:r>
+          </w:p>
+        </w:tc>
+      </w:tr>
+      <w:tr>
+        <w:tc>
+          <w:tcPr>
+            <w:tcW w:type="dxa" w:w="3744"/>
+            <w:tcMar>
+              <w:top w:w="80" w:type="dxa"/>
+              <w:bottom w:w="80" w:type="dxa"/>
+              <w:start w:w="120" w:type="dxa"/>
+              <w:end w:w="120" w:type="dxa"/>
+            </w:tcMar>
+            <w:vAlign w:val="center"/>
+          </w:tcPr>
+          <w:p>
+            <w:pPr>
+              <w:spacing w:after="0"/>
+            </w:pPr>
+            <w:r>
+              <w:rPr>
+                <w:rFonts w:ascii="Microsoft YaHei" w:hAnsi="Microsoft YaHei" w:eastAsia="Microsoft YaHei" w:cs="Microsoft YaHei"/>
+                <w:b w:val="0"/>
+                <w:color w:val="000000"/>
+                <w:sz w:val="16"/>
+              </w:rPr>
+              <w:t>最终提交指南</w:t>
+            </w:r>
+          </w:p>
+        </w:tc>
+        <w:tc>
+          <w:tcPr>
+            <w:tcW w:type="dxa" w:w="5616"/>
+            <w:tcMar>
+              <w:top w:w="80" w:type="dxa"/>
+              <w:bottom w:w="80" w:type="dxa"/>
+              <w:start w:w="120" w:type="dxa"/>
+              <w:end w:w="120" w:type="dxa"/>
+            </w:tcMar>
+            <w:vAlign w:val="center"/>
+          </w:tcPr>
+          <w:p>
+            <w:pPr>
+              <w:spacing w:after="0"/>
+            </w:pPr>
+            <w:r>
+              <w:rPr>
+                <w:rFonts w:ascii="Consolas" w:hAnsi="Consolas" w:eastAsia="Microsoft YaHei" w:cs="Consolas"/>
+                <w:color w:val="000000"/>
+                <w:sz w:val="16"/>
+              </w:rPr>
+              <w:t>docs/final_submission_guide.md</w:t>
             </w:r>
           </w:p>
         </w:tc>

</xml_diff>

<commit_message>
Add contest requirement traceability matrix
</commit_message>
<xml_diff>
--- a/W8A12_3lane/output/docx/W8A12_3lane_contest_submission_report.docx
+++ b/W8A12_3lane/output/docx/W8A12_3lane_contest_submission_report.docx
@@ -12731,6 +12731,59 @@
                 <w:sz w:val="16"/>
               </w:rPr>
               <w:t>docs/final_submission_guide.md</w:t>
+            </w:r>
+          </w:p>
+        </w:tc>
+      </w:tr>
+      <w:tr>
+        <w:tc>
+          <w:tcPr>
+            <w:tcW w:type="dxa" w:w="3744"/>
+            <w:tcMar>
+              <w:top w:w="80" w:type="dxa"/>
+              <w:bottom w:w="80" w:type="dxa"/>
+              <w:start w:w="120" w:type="dxa"/>
+              <w:end w:w="120" w:type="dxa"/>
+            </w:tcMar>
+            <w:vAlign w:val="center"/>
+          </w:tcPr>
+          <w:p>
+            <w:pPr>
+              <w:spacing w:after="0"/>
+            </w:pPr>
+            <w:r>
+              <w:rPr>
+                <w:rFonts w:ascii="Microsoft YaHei" w:hAnsi="Microsoft YaHei" w:eastAsia="Microsoft YaHei" w:cs="Microsoft YaHei"/>
+                <w:b w:val="0"/>
+                <w:color w:val="000000"/>
+                <w:sz w:val="16"/>
+              </w:rPr>
+              <w:t>赛题要求追踪矩阵</w:t>
+            </w:r>
+          </w:p>
+        </w:tc>
+        <w:tc>
+          <w:tcPr>
+            <w:tcW w:type="dxa" w:w="5616"/>
+            <w:tcMar>
+              <w:top w:w="80" w:type="dxa"/>
+              <w:bottom w:w="80" w:type="dxa"/>
+              <w:start w:w="120" w:type="dxa"/>
+              <w:end w:w="120" w:type="dxa"/>
+            </w:tcMar>
+            <w:vAlign w:val="center"/>
+          </w:tcPr>
+          <w:p>
+            <w:pPr>
+              <w:spacing w:after="0"/>
+            </w:pPr>
+            <w:r>
+              <w:rPr>
+                <w:rFonts w:ascii="Consolas" w:hAnsi="Consolas" w:eastAsia="Microsoft YaHei" w:cs="Consolas"/>
+                <w:color w:val="000000"/>
+                <w:sz w:val="16"/>
+              </w:rPr>
+              <w:t>docs/contest_requirement_traceability.md</w:t>
             </w:r>
           </w:p>
         </w:tc>

</xml_diff>

<commit_message>
Add direct x2 xsim replay evidence
</commit_message>
<xml_diff>
--- a/W8A12_3lane/output/docx/W8A12_3lane_contest_submission_report.docx
+++ b/W8A12_3lane/output/docx/W8A12_3lane_contest_submission_report.docx
@@ -7788,7 +7788,37 @@
           <w:b w:val="0"/>
           <w:color w:val="000000"/>
         </w:rPr>
-        <w:t>。</w:t>
+        <w:t xml:space="preserve">。为避免后台实现任务运行时再启动新的 Vivado batch/project，另提供 direct </w:t>
+      </w:r>
+      <w:r>
+        <w:rPr>
+          <w:rFonts w:ascii="Consolas" w:hAnsi="Consolas" w:eastAsia="Microsoft YaHei" w:cs="Consolas"/>
+          <w:color w:val="000000"/>
+        </w:rPr>
+        <w:t>xvlog/xelab/xsim</w:t>
+      </w:r>
+      <w:r>
+        <w:rPr>
+          <w:rFonts w:ascii="Microsoft YaHei" w:hAnsi="Microsoft YaHei" w:eastAsia="Microsoft YaHei" w:cs="Microsoft YaHei"/>
+          <w:b w:val="0"/>
+          <w:color w:val="000000"/>
+        </w:rPr>
+        <w:t xml:space="preserve"> 复跑脚本，证据见 </w:t>
+      </w:r>
+      <w:r>
+        <w:rPr>
+          <w:rFonts w:ascii="Consolas" w:hAnsi="Consolas" w:eastAsia="Microsoft YaHei" w:cs="Consolas"/>
+          <w:color w:val="000000"/>
+        </w:rPr>
+        <w:t>evidence/sim_fps_design_space/packed2d_x2_direct_xsim_replay/summary.md</w:t>
+      </w:r>
+      <w:r>
+        <w:rPr>
+          <w:rFonts w:ascii="Microsoft YaHei" w:hAnsi="Microsoft YaHei" w:eastAsia="Microsoft YaHei" w:cs="Microsoft YaHei"/>
+          <w:b w:val="0"/>
+          <w:color w:val="000000"/>
+        </w:rPr>
+        <w:t>，该证据只复核 scheduler/performance-model 数值边界，不声明板端 FPS。</w:t>
       </w:r>
     </w:p>
     <w:p>
@@ -13611,6 +13641,23 @@
                 <w:sz w:val="16"/>
               </w:rPr>
               <w:t>evidence/sim_fps_design_space/packed2d_x2_720p20_perf_scheduler/summary.md</w:t>
+            </w:r>
+            <w:r>
+              <w:rPr>
+                <w:rFonts w:ascii="Microsoft YaHei" w:hAnsi="Microsoft YaHei" w:eastAsia="Microsoft YaHei" w:cs="Microsoft YaHei"/>
+                <w:b w:val="0"/>
+                <w:color w:val="000000"/>
+                <w:sz w:val="16"/>
+              </w:rPr>
+              <w:t>、</w:t>
+            </w:r>
+            <w:r>
+              <w:rPr>
+                <w:rFonts w:ascii="Consolas" w:hAnsi="Consolas" w:eastAsia="Microsoft YaHei" w:cs="Consolas"/>
+                <w:color w:val="000000"/>
+                <w:sz w:val="16"/>
+              </w:rPr>
+              <w:t>evidence/sim_fps_design_space/packed2d_x2_direct_xsim_replay/summary.md</w:t>
             </w:r>
           </w:p>
         </w:tc>

</xml_diff>

<commit_message>
Refresh report artifacts for current JTAG state
</commit_message>
<xml_diff>
--- a/W8A12_3lane/output/docx/W8A12_3lane_contest_submission_report.docx
+++ b/W8A12_3lane/output/docx/W8A12_3lane_contest_submission_report.docx
@@ -10679,7 +10679,7 @@
           <w:color w:val="000000"/>
           <w:sz w:val="20"/>
         </w:rPr>
-        <w:t xml:space="preserve"> 和 </w:t>
+        <w:t>、</w:t>
       </w:r>
       <w:r>
         <w:rPr>
@@ -10696,7 +10696,7 @@
           <w:color w:val="000000"/>
           <w:sz w:val="20"/>
         </w:rPr>
-        <w:t xml:space="preserve">，当前证据显示在线 USB 设备无已知 JTAG；强制 Vivado probe 后 </w:t>
+        <w:t xml:space="preserve"> 和 </w:t>
       </w:r>
       <w:r>
         <w:rPr>
@@ -10704,7 +10704,7 @@
           <w:color w:val="000000"/>
           <w:sz w:val="20"/>
         </w:rPr>
-        <w:t>Vivado target count=0</w:t>
+        <w:t>evidence/board_probe/jtag_precondition_usb_only_current/summary.md</w:t>
       </w:r>
       <w:r>
         <w:rPr>
@@ -10713,7 +10713,24 @@
           <w:color w:val="000000"/>
           <w:sz w:val="20"/>
         </w:rPr>
-        <w:t>。这只是当前物理/JTAG 前置条件阻塞，不推翻上面的历史 stage-hash 数值定位；恢复通过条件为 USB known candidate&gt;=1 且 Vivado target&gt;=1。</w:t>
+        <w:t xml:space="preserve">。2026-07-03 USB-only 复测显示 </w:t>
+      </w:r>
+      <w:r>
+        <w:rPr>
+          <w:rFonts w:ascii="Consolas" w:hAnsi="Consolas" w:eastAsia="Microsoft YaHei" w:cs="Consolas"/>
+          <w:color w:val="000000"/>
+          <w:sz w:val="20"/>
+        </w:rPr>
+        <w:t>USB_READY</w:t>
+      </w:r>
+      <w:r>
+        <w:rPr>
+          <w:rFonts w:ascii="Microsoft YaHei" w:hAnsi="Microsoft YaHei" w:eastAsia="Microsoft YaHei" w:cs="Microsoft YaHei"/>
+          <w:b w:val="0"/>
+          <w:color w:val="000000"/>
+          <w:sz w:val="20"/>
+        </w:rPr>
+        <w:t>，USB known JTAG candidate=3；但因后台 Vivado 实现任务仍在运行，Vivado target 尚未安全复测。该状态不等价于 board validation PASS，也不推翻上面的历史 stage-hash 数值定位；恢复通过条件仍为 USB known candidate&gt;=1 且 Vivado target&gt;=1。</w:t>
       </w:r>
     </w:p>
     <w:p>
@@ -14049,14 +14066,14 @@
           <w:b w:val="0"/>
           <w:color w:val="000000"/>
         </w:rPr>
-        <w:t xml:space="preserve"> 首个边界已经不等于 RTL 期望。当前最新物理连接又回到 USB/JTAG 枚举阻塞，强制 Vivado probe 后 </w:t>
+        <w:t xml:space="preserve"> 首个边界已经不等于 RTL 期望。当前最新物理前置状态为 USB-only </w:t>
       </w:r>
       <w:r>
         <w:rPr>
           <w:rFonts w:ascii="Consolas" w:hAnsi="Consolas" w:eastAsia="Microsoft YaHei" w:cs="Consolas"/>
           <w:color w:val="000000"/>
         </w:rPr>
-        <w:t>Vivado target count=0</w:t>
+        <w:t>USB_READY</w:t>
       </w:r>
       <w:r>
         <w:rPr>
@@ -14064,7 +14081,7 @@
           <w:b w:val="0"/>
           <w:color w:val="000000"/>
         </w:rPr>
-        <w:t xml:space="preserve">，因此不能继续板上读 dbg2 bank；恢复连接后，应直接用低侵入 dbg2 source-boundary 验证 </w:t>
+        <w:t xml:space="preserve">，USB known JTAG candidate=3；Vivado target 需要等后台实现任务结束后再安全复测，因此暂不能继续板上读 dbg2 bank。恢复 Vivado target 后，应直接用低侵入 dbg2 source-boundary 验证 </w:t>
       </w:r>
       <w:r>
         <w:rPr>

</xml_diff>

<commit_message>
Document route congestion and refresh delivery report
</commit_message>
<xml_diff>
--- a/W8A12_3lane/output/docx/W8A12_3lane_contest_submission_report.docx
+++ b/W8A12_3lane/output/docx/W8A12_3lane_contest_submission_report.docx
@@ -6806,6 +6806,151 @@
           <w:color w:val="000000"/>
         </w:rPr>
         <w:t xml:space="preserve"> mismatch。它证明当前 W8A12 tile 计算和写回配置能够生成 bitstream 并满足资源/时序门限；但不声明 720p packed 2-D 完整硬件 bitstream 已闭合。</w:t>
+      </w:r>
+    </w:p>
+    <w:p>
+      <w:r>
+        <w:rPr>
+          <w:rFonts w:ascii="Microsoft YaHei" w:hAnsi="Microsoft YaHei" w:eastAsia="Microsoft YaHei" w:cs="Microsoft YaHei"/>
+          <w:b w:val="0"/>
+          <w:color w:val="000000"/>
+        </w:rPr>
+        <w:t xml:space="preserve">2026-07-03 另补跑了一次 </w:t>
+      </w:r>
+      <w:r>
+        <w:rPr>
+          <w:rFonts w:ascii="Consolas" w:hAnsi="Consolas" w:eastAsia="Microsoft YaHei" w:cs="Consolas"/>
+          <w:color w:val="000000"/>
+        </w:rPr>
+        <w:t>dma_axis_w8a10_system_wrapper</w:t>
+      </w:r>
+      <w:r>
+        <w:rPr>
+          <w:rFonts w:ascii="Microsoft YaHei" w:hAnsi="Microsoft YaHei" w:eastAsia="Microsoft YaHei" w:cs="Microsoft YaHei"/>
+          <w:b w:val="0"/>
+          <w:color w:val="000000"/>
+        </w:rPr>
+        <w:t xml:space="preserve"> 大集成实现尝试，作为完整计算壳资源压力测试。该 run 在 placed 阶段的资源画像为 LUT </w:t>
+      </w:r>
+      <w:r>
+        <w:rPr>
+          <w:rFonts w:ascii="Consolas" w:hAnsi="Consolas" w:eastAsia="Microsoft YaHei" w:cs="Consolas"/>
+          <w:color w:val="000000"/>
+        </w:rPr>
+        <w:t>279774</w:t>
+      </w:r>
+      <w:r>
+        <w:rPr>
+          <w:rFonts w:ascii="Microsoft YaHei" w:hAnsi="Microsoft YaHei" w:eastAsia="Microsoft YaHei" w:cs="Microsoft YaHei"/>
+          <w:b w:val="0"/>
+          <w:color w:val="000000"/>
+        </w:rPr>
+        <w:t xml:space="preserve">、FF </w:t>
+      </w:r>
+      <w:r>
+        <w:rPr>
+          <w:rFonts w:ascii="Consolas" w:hAnsi="Consolas" w:eastAsia="Microsoft YaHei" w:cs="Consolas"/>
+          <w:color w:val="000000"/>
+        </w:rPr>
+        <w:t>363066</w:t>
+      </w:r>
+      <w:r>
+        <w:rPr>
+          <w:rFonts w:ascii="Microsoft YaHei" w:hAnsi="Microsoft YaHei" w:eastAsia="Microsoft YaHei" w:cs="Microsoft YaHei"/>
+          <w:b w:val="0"/>
+          <w:color w:val="000000"/>
+        </w:rPr>
+        <w:t xml:space="preserve">、BRAM tile </w:t>
+      </w:r>
+      <w:r>
+        <w:rPr>
+          <w:rFonts w:ascii="Consolas" w:hAnsi="Consolas" w:eastAsia="Microsoft YaHei" w:cs="Consolas"/>
+          <w:color w:val="000000"/>
+        </w:rPr>
+        <w:t>619</w:t>
+      </w:r>
+      <w:r>
+        <w:rPr>
+          <w:rFonts w:ascii="Microsoft YaHei" w:hAnsi="Microsoft YaHei" w:eastAsia="Microsoft YaHei" w:cs="Microsoft YaHei"/>
+          <w:b w:val="0"/>
+          <w:color w:val="000000"/>
+        </w:rPr>
+        <w:t xml:space="preserve">、DSP </w:t>
+      </w:r>
+      <w:r>
+        <w:rPr>
+          <w:rFonts w:ascii="Consolas" w:hAnsi="Consolas" w:eastAsia="Microsoft YaHei" w:cs="Consolas"/>
+          <w:color w:val="000000"/>
+        </w:rPr>
+        <w:t>769</w:t>
+      </w:r>
+      <w:r>
+        <w:rPr>
+          <w:rFonts w:ascii="Microsoft YaHei" w:hAnsi="Microsoft YaHei" w:eastAsia="Microsoft YaHei" w:cs="Microsoft YaHei"/>
+          <w:b w:val="0"/>
+          <w:color w:val="000000"/>
+        </w:rPr>
+        <w:t xml:space="preserve">，其中 CLB sites 已达 </w:t>
+      </w:r>
+      <w:r>
+        <w:rPr>
+          <w:rFonts w:ascii="Consolas" w:hAnsi="Consolas" w:eastAsia="Microsoft YaHei" w:cs="Consolas"/>
+          <w:color w:val="000000"/>
+        </w:rPr>
+        <w:t>63744 / 65340 = 97.56%</w:t>
+      </w:r>
+      <w:r>
+        <w:rPr>
+          <w:rFonts w:ascii="Microsoft YaHei" w:hAnsi="Microsoft YaHei" w:eastAsia="Microsoft YaHei" w:cs="Microsoft YaHei"/>
+          <w:b w:val="0"/>
+          <w:color w:val="000000"/>
+        </w:rPr>
+        <w:t>；route 阶段因 congestion 失败，</w:t>
+      </w:r>
+      <w:r>
+        <w:rPr>
+          <w:rFonts w:ascii="Consolas" w:hAnsi="Consolas" w:eastAsia="Microsoft YaHei" w:cs="Consolas"/>
+          <w:color w:val="000000"/>
+        </w:rPr>
+        <w:t>write_bitstream</w:t>
+      </w:r>
+      <w:r>
+        <w:rPr>
+          <w:rFonts w:ascii="Microsoft YaHei" w:hAnsi="Microsoft YaHei" w:eastAsia="Microsoft YaHei" w:cs="Microsoft YaHei"/>
+          <w:b w:val="0"/>
+          <w:color w:val="000000"/>
+        </w:rPr>
+        <w:t xml:space="preserve"> 未启动且未生成 </w:t>
+      </w:r>
+      <w:r>
+        <w:rPr>
+          <w:rFonts w:ascii="Consolas" w:hAnsi="Consolas" w:eastAsia="Microsoft YaHei" w:cs="Consolas"/>
+          <w:color w:val="000000"/>
+        </w:rPr>
+        <w:t>.bit</w:t>
+      </w:r>
+      <w:r>
+        <w:rPr>
+          <w:rFonts w:ascii="Microsoft YaHei" w:hAnsi="Microsoft YaHei" w:eastAsia="Microsoft YaHei" w:cs="Microsoft YaHei"/>
+          <w:b w:val="0"/>
+          <w:color w:val="000000"/>
+        </w:rPr>
+        <w:t xml:space="preserve">。证据见 </w:t>
+      </w:r>
+      <w:r>
+        <w:rPr>
+          <w:rFonts w:ascii="Consolas" w:hAnsi="Consolas" w:eastAsia="Microsoft YaHei" w:cs="Consolas"/>
+          <w:color w:val="000000"/>
+        </w:rPr>
+        <w:t>evidence/implementation_runs/dma_axis_w8a10_route_congestion_20260703/summary.md</w:t>
+      </w:r>
+      <w:r>
+        <w:rPr>
+          <w:rFonts w:ascii="Microsoft YaHei" w:hAnsi="Microsoft YaHei" w:eastAsia="Microsoft YaHei" w:cs="Microsoft YaHei"/>
+          <w:b w:val="0"/>
+          <w:color w:val="000000"/>
+        </w:rPr>
+        <w:t>。因此该 run 只能作为“完整大集成仍需降资源/分阶段闭合”的风险证据，不能作为 bitstream/PPA PASS 计入提交口径。</w:t>
       </w:r>
     </w:p>
     <w:p>
@@ -13448,6 +13593,59 @@
                 <w:sz w:val="16"/>
               </w:rPr>
               <w:t>evidence/bitstream_ppa_gate/summary.md</w:t>
+            </w:r>
+          </w:p>
+        </w:tc>
+      </w:tr>
+      <w:tr>
+        <w:tc>
+          <w:tcPr>
+            <w:tcW w:type="dxa" w:w="3744"/>
+            <w:tcMar>
+              <w:top w:w="80" w:type="dxa"/>
+              <w:bottom w:w="80" w:type="dxa"/>
+              <w:start w:w="120" w:type="dxa"/>
+              <w:end w:w="120" w:type="dxa"/>
+            </w:tcMar>
+            <w:vAlign w:val="center"/>
+          </w:tcPr>
+          <w:p>
+            <w:pPr>
+              <w:spacing w:after="0"/>
+            </w:pPr>
+            <w:r>
+              <w:rPr>
+                <w:rFonts w:ascii="Microsoft YaHei" w:hAnsi="Microsoft YaHei" w:eastAsia="Microsoft YaHei" w:cs="Microsoft YaHei"/>
+                <w:b w:val="0"/>
+                <w:color w:val="000000"/>
+                <w:sz w:val="16"/>
+              </w:rPr>
+              <w:t>大集成 route 压力测试</w:t>
+            </w:r>
+          </w:p>
+        </w:tc>
+        <w:tc>
+          <w:tcPr>
+            <w:tcW w:type="dxa" w:w="5616"/>
+            <w:tcMar>
+              <w:top w:w="80" w:type="dxa"/>
+              <w:bottom w:w="80" w:type="dxa"/>
+              <w:start w:w="120" w:type="dxa"/>
+              <w:end w:w="120" w:type="dxa"/>
+            </w:tcMar>
+            <w:vAlign w:val="center"/>
+          </w:tcPr>
+          <w:p>
+            <w:pPr>
+              <w:spacing w:after="0"/>
+            </w:pPr>
+            <w:r>
+              <w:rPr>
+                <w:rFonts w:ascii="Consolas" w:hAnsi="Consolas" w:eastAsia="Microsoft YaHei" w:cs="Consolas"/>
+                <w:color w:val="000000"/>
+                <w:sz w:val="16"/>
+              </w:rPr>
+              <w:t>evidence/implementation_runs/dma_axis_w8a10_route_congestion_20260703/summary.md</w:t>
             </w:r>
           </w:p>
         </w:tc>

</xml_diff>

<commit_message>
Record latest dbg2 board mismatch evidence
</commit_message>
<xml_diff>
--- a/W8A12_3lane/output/docx/W8A12_3lane_contest_submission_report.docx
+++ b/W8A12_3lane/output/docx/W8A12_3lane_contest_submission_report.docx
@@ -10849,7 +10849,7 @@
           <w:color w:val="000000"/>
           <w:sz w:val="20"/>
         </w:rPr>
-        <w:t>evidence/board_probe/jtag_precondition_usb_only_current/summary.md</w:t>
+        <w:t>evidence/board_probe/jtag_precondition_current/summary.md</w:t>
       </w:r>
       <w:r>
         <w:rPr>
@@ -10858,7 +10858,7 @@
           <w:color w:val="000000"/>
           <w:sz w:val="20"/>
         </w:rPr>
-        <w:t xml:space="preserve">。2026-07-03 USB-only 复测显示 </w:t>
+        <w:t xml:space="preserve">。2026-07-03 full probe 显示 </w:t>
       </w:r>
       <w:r>
         <w:rPr>
@@ -10866,7 +10866,7 @@
           <w:color w:val="000000"/>
           <w:sz w:val="20"/>
         </w:rPr>
-        <w:t>USB_READY</w:t>
+        <w:t>READY</w:t>
       </w:r>
       <w:r>
         <w:rPr>
@@ -10875,7 +10875,7 @@
           <w:color w:val="000000"/>
           <w:sz w:val="20"/>
         </w:rPr>
-        <w:t>，USB known JTAG candidate=3；但因后台 Vivado 实现任务仍在运行，Vivado target 尚未安全复测。该状态不等价于 board validation PASS，也不推翻上面的历史 stage-hash 数值定位；恢复通过条件仍为 USB known candidate&gt;=1 且 Vivado target&gt;=1。</w:t>
+        <w:t>，USB known JTAG candidate=3，Vivado target count=1；该状态允许继续小图上板验收，但不等价于 board validation PASS。</w:t>
       </w:r>
     </w:p>
     <w:p>
@@ -12009,14 +12009,14 @@
           <w:b w:val="0"/>
           <w:color w:val="000000"/>
         </w:rPr>
-        <w:t xml:space="preserve"> source-boundary 路线：只导出 </w:t>
+        <w:t xml:space="preserve"> source-boundary 路线。2026-07-03 已完成一次 </w:t>
       </w:r>
       <w:r>
         <w:rPr>
           <w:rFonts w:ascii="Consolas" w:hAnsi="Consolas" w:eastAsia="Microsoft YaHei" w:cs="Consolas"/>
           <w:color w:val="000000"/>
         </w:rPr>
-        <w:t>tail_feat0=0x000004bf</w:t>
+        <w:t>dbg2 current source-b6</w:t>
       </w:r>
       <w:r>
         <w:rPr>
@@ -12024,14 +12024,14 @@
           <w:b w:val="0"/>
           <w:color w:val="000000"/>
         </w:rPr>
-        <w:t>、</w:t>
+        <w:t xml:space="preserve"> 实板续跑：probe PASS、PSU init PASS、寄存器读回 PASS、输出完整 </w:t>
       </w:r>
       <w:r>
         <w:rPr>
           <w:rFonts w:ascii="Consolas" w:hAnsi="Consolas" w:eastAsia="Microsoft YaHei" w:cs="Consolas"/>
           <w:color w:val="000000"/>
         </w:rPr>
-        <w:t>src_feat0=0x00000004</w:t>
+        <w:t>192/192</w:t>
       </w:r>
       <w:r>
         <w:rPr>
@@ -12039,14 +12039,14 @@
           <w:b w:val="0"/>
           <w:color w:val="000000"/>
         </w:rPr>
-        <w:t>、</w:t>
+        <w:t xml:space="preserve">，但 compare FAIL </w:t>
       </w:r>
       <w:r>
         <w:rPr>
           <w:rFonts w:ascii="Consolas" w:hAnsi="Consolas" w:eastAsia="Microsoft YaHei" w:cs="Consolas"/>
           <w:color w:val="000000"/>
         </w:rPr>
-        <w:t>src_b1=0x00070004</w:t>
+        <w:t>188/192</w:t>
       </w:r>
       <w:r>
         <w:rPr>
@@ -12054,14 +12054,14 @@
           <w:b w:val="0"/>
           <w:color w:val="000000"/>
         </w:rPr>
-        <w:t xml:space="preserve">，不打开 SPAB deep bank。该版本 RTL raw compare PASS，bitstream/timing/resource PASS；当前一键验收脚本因 USB known JTAG candidate </w:t>
+        <w:t xml:space="preserve">、PSNR </w:t>
       </w:r>
       <w:r>
         <w:rPr>
           <w:rFonts w:ascii="Consolas" w:hAnsi="Consolas" w:eastAsia="Microsoft YaHei" w:cs="Consolas"/>
           <w:color w:val="000000"/>
         </w:rPr>
-        <w:t>0</w:t>
+        <w:t>19.263 dB</w:t>
       </w:r>
       <w:r>
         <w:rPr>
@@ -12069,14 +12069,14 @@
           <w:b w:val="0"/>
           <w:color w:val="000000"/>
         </w:rPr>
-        <w:t xml:space="preserve"> 生成 </w:t>
+        <w:t xml:space="preserve">，并出现 </w:t>
       </w:r>
       <w:r>
         <w:rPr>
           <w:rFonts w:ascii="Consolas" w:hAnsi="Consolas" w:eastAsia="Microsoft YaHei" w:cs="Consolas"/>
           <w:color w:val="000000"/>
         </w:rPr>
-        <w:t>BLOCKED</w:t>
+        <w:t>error=0x0000000C</w:t>
       </w:r>
       <w:r>
         <w:rPr>
@@ -12084,7 +12084,37 @@
           <w:b w:val="0"/>
           <w:color w:val="000000"/>
         </w:rPr>
-        <w:t xml:space="preserve"> summary。恢复 JTAG 后，直接运行 dbg2 一键脚本即可继续在上述历史链路内收窄，而不是重新排查。</w:t>
+        <w:t xml:space="preserve">。证据见 </w:t>
+      </w:r>
+      <w:r>
+        <w:rPr>
+          <w:rFonts w:ascii="Consolas" w:hAnsi="Consolas" w:eastAsia="Microsoft YaHei" w:cs="Consolas"/>
+          <w:color w:val="000000"/>
+        </w:rPr>
+        <w:t>evidence/board_reports/jtag_true2x2_dbg2_src_boundary_20260703_goal_continue/analysis.md</w:t>
+      </w:r>
+      <w:r>
+        <w:rPr>
+          <w:rFonts w:ascii="Microsoft YaHei" w:hAnsi="Microsoft YaHei" w:eastAsia="Microsoft YaHei" w:cs="Microsoft YaHei"/>
+          <w:b w:val="0"/>
+          <w:color w:val="000000"/>
+        </w:rPr>
+        <w:t xml:space="preserve">。因此当前结论不是连接问题，而是该 debug 版本仍存在板端数值错误且可能带有 probe 侵入性；下一步应回退到非侵入 stagehash baseline 或 single-boundary probe，要求 </w:t>
+      </w:r>
+      <w:r>
+        <w:rPr>
+          <w:rFonts w:ascii="Consolas" w:hAnsi="Consolas" w:eastAsia="Microsoft YaHei" w:cs="Consolas"/>
+          <w:color w:val="000000"/>
+        </w:rPr>
+        <w:t>error=0</w:t>
+      </w:r>
+      <w:r>
+        <w:rPr>
+          <w:rFonts w:ascii="Microsoft YaHei" w:hAnsi="Microsoft YaHei" w:eastAsia="Microsoft YaHei" w:cs="Microsoft YaHei"/>
+          <w:b w:val="0"/>
+          <w:color w:val="000000"/>
+        </w:rPr>
+        <w:t xml:space="preserve"> 后再把 first mismatching boundary 作为 RTL 修改依据。</w:t>
       </w:r>
     </w:p>
     <w:p>
@@ -13310,7 +13340,7 @@
                 <w:color w:val="000000"/>
                 <w:sz w:val="16"/>
               </w:rPr>
-              <w:t>evidence/board_reports/jtag_true2x2_stagehash_live_20260629.md</w:t>
+              <w:t>evidence/board_reports/jtag_true2x2_dbg2_src_boundary_20260703_goal_continue/analysis.md</w:t>
             </w:r>
           </w:p>
         </w:tc>
@@ -14264,14 +14294,14 @@
           <w:b w:val="0"/>
           <w:color w:val="000000"/>
         </w:rPr>
-        <w:t xml:space="preserve"> 首个边界已经不等于 RTL 期望。当前最新物理前置状态为 USB-only </w:t>
+        <w:t xml:space="preserve"> 首个边界已经不等于 RTL 期望。2026-07-03 full probe 已恢复到 </w:t>
       </w:r>
       <w:r>
         <w:rPr>
           <w:rFonts w:ascii="Consolas" w:hAnsi="Consolas" w:eastAsia="Microsoft YaHei" w:cs="Consolas"/>
           <w:color w:val="000000"/>
         </w:rPr>
-        <w:t>USB_READY</w:t>
+        <w:t>READY</w:t>
       </w:r>
       <w:r>
         <w:rPr>
@@ -14279,14 +14309,14 @@
           <w:b w:val="0"/>
           <w:color w:val="000000"/>
         </w:rPr>
-        <w:t xml:space="preserve">，USB known JTAG candidate=3；Vivado target 需要等后台实现任务结束后再安全复测，因此暂不能继续板上读 dbg2 bank。恢复 Vivado target 后，应直接用低侵入 dbg2 source-boundary 验证 </w:t>
+        <w:t xml:space="preserve">，随后 dbg2/source-b6 实板续跑得到输出完整 </w:t>
       </w:r>
       <w:r>
         <w:rPr>
           <w:rFonts w:ascii="Consolas" w:hAnsi="Consolas" w:eastAsia="Microsoft YaHei" w:cs="Consolas"/>
           <w:color w:val="000000"/>
         </w:rPr>
-        <w:t>tail_feat0/src_feat0/src_b1</w:t>
+        <w:t>192/192</w:t>
       </w:r>
       <w:r>
         <w:rPr>
@@ -14294,7 +14324,67 @@
           <w:b w:val="0"/>
           <w:color w:val="000000"/>
         </w:rPr>
-        <w:t xml:space="preserve">，在 </w:t>
+        <w:t xml:space="preserve">、compare FAIL </w:t>
+      </w:r>
+      <w:r>
+        <w:rPr>
+          <w:rFonts w:ascii="Consolas" w:hAnsi="Consolas" w:eastAsia="Microsoft YaHei" w:cs="Consolas"/>
+          <w:color w:val="000000"/>
+        </w:rPr>
+        <w:t>188/192</w:t>
+      </w:r>
+      <w:r>
+        <w:rPr>
+          <w:rFonts w:ascii="Microsoft YaHei" w:hAnsi="Microsoft YaHei" w:eastAsia="Microsoft YaHei" w:cs="Microsoft YaHei"/>
+          <w:b w:val="0"/>
+          <w:color w:val="000000"/>
+        </w:rPr>
+        <w:t>、PSNR 19.263 dB、</w:t>
+      </w:r>
+      <w:r>
+        <w:rPr>
+          <w:rFonts w:ascii="Consolas" w:hAnsi="Consolas" w:eastAsia="Microsoft YaHei" w:cs="Consolas"/>
+          <w:color w:val="000000"/>
+        </w:rPr>
+        <w:t>error=0x0000000C</w:t>
+      </w:r>
+      <w:r>
+        <w:rPr>
+          <w:rFonts w:ascii="Microsoft YaHei" w:hAnsi="Microsoft YaHei" w:eastAsia="Microsoft YaHei" w:cs="Microsoft YaHei"/>
+          <w:b w:val="0"/>
+          <w:color w:val="000000"/>
+        </w:rPr>
+        <w:t xml:space="preserve">。这进一步证明板端链路可运行，但本轮 debug hash 带错误标志，不能作为干净 datapath 根因。后续应先做低侵入 single-boundary probe，在 </w:t>
+      </w:r>
+      <w:r>
+        <w:rPr>
+          <w:rFonts w:ascii="Consolas" w:hAnsi="Consolas" w:eastAsia="Microsoft YaHei" w:cs="Consolas"/>
+          <w:color w:val="000000"/>
+        </w:rPr>
+        <w:t>error=0</w:t>
+      </w:r>
+      <w:r>
+        <w:rPr>
+          <w:rFonts w:ascii="Microsoft YaHei" w:hAnsi="Microsoft YaHei" w:eastAsia="Microsoft YaHei" w:cs="Microsoft YaHei"/>
+          <w:b w:val="0"/>
+          <w:color w:val="000000"/>
+        </w:rPr>
+        <w:t>、</w:t>
+      </w:r>
+      <w:r>
+        <w:rPr>
+          <w:rFonts w:ascii="Consolas" w:hAnsi="Consolas" w:eastAsia="Microsoft YaHei" w:cs="Consolas"/>
+          <w:color w:val="000000"/>
+        </w:rPr>
+        <w:t>frame_done=1</w:t>
+      </w:r>
+      <w:r>
+        <w:rPr>
+          <w:rFonts w:ascii="Microsoft YaHei" w:hAnsi="Microsoft YaHei" w:eastAsia="Microsoft YaHei" w:cs="Microsoft YaHei"/>
+          <w:b w:val="0"/>
+          <w:color w:val="000000"/>
+        </w:rPr>
+        <w:t xml:space="preserve">、输出完整时再沿 </w:t>
       </w:r>
       <w:r>
         <w:rPr>
@@ -14309,7 +14399,7 @@
           <w:b w:val="0"/>
           <w:color w:val="000000"/>
         </w:rPr>
-        <w:t xml:space="preserve"> 链路内收窄第一个错误点，再逐步补齐 32x32、64x64、720p x4 和 720p x2 board validation。</w:t>
+        <w:t xml:space="preserve"> 链路收窄第一个错误点，并逐步补齐 32x32、64x64、720p x4 和 720p x2 board validation。</w:t>
       </w:r>
     </w:p>
     <w:p>

</xml_diff>

<commit_message>
Record clean stagehash baseline rerun
</commit_message>
<xml_diff>
--- a/W8A12_3lane/output/docx/W8A12_3lane_contest_submission_report.docx
+++ b/W8A12_3lane/output/docx/W8A12_3lane_contest_submission_report.docx
@@ -12099,7 +12099,82 @@
           <w:b w:val="0"/>
           <w:color w:val="000000"/>
         </w:rPr>
-        <w:t xml:space="preserve">。因此当前结论不是连接问题，而是该 debug 版本仍存在板端数值错误且可能带有 probe 侵入性；下一步应回退到非侵入 stagehash baseline 或 single-boundary probe，要求 </w:t>
+        <w:t xml:space="preserve">。因此该 debug 版本只作为探针侵入性风险证据。随后复跑非侵入 stagehash baseline，得到 probe/PSU/register PASS、输出完整 </w:t>
+      </w:r>
+      <w:r>
+        <w:rPr>
+          <w:rFonts w:ascii="Consolas" w:hAnsi="Consolas" w:eastAsia="Microsoft YaHei" w:cs="Consolas"/>
+          <w:color w:val="000000"/>
+        </w:rPr>
+        <w:t>192/192</w:t>
+      </w:r>
+      <w:r>
+        <w:rPr>
+          <w:rFonts w:ascii="Microsoft YaHei" w:hAnsi="Microsoft YaHei" w:eastAsia="Microsoft YaHei" w:cs="Microsoft YaHei"/>
+          <w:b w:val="0"/>
+          <w:color w:val="000000"/>
+        </w:rPr>
+        <w:t>、</w:t>
+      </w:r>
+      <w:r>
+        <w:rPr>
+          <w:rFonts w:ascii="Consolas" w:hAnsi="Consolas" w:eastAsia="Microsoft YaHei" w:cs="Consolas"/>
+          <w:color w:val="000000"/>
+        </w:rPr>
+        <w:t>error=0</w:t>
+      </w:r>
+      <w:r>
+        <w:rPr>
+          <w:rFonts w:ascii="Microsoft YaHei" w:hAnsi="Microsoft YaHei" w:eastAsia="Microsoft YaHei" w:cs="Microsoft YaHei"/>
+          <w:b w:val="0"/>
+          <w:color w:val="000000"/>
+        </w:rPr>
+        <w:t xml:space="preserve">，但 compare FAIL </w:t>
+      </w:r>
+      <w:r>
+        <w:rPr>
+          <w:rFonts w:ascii="Consolas" w:hAnsi="Consolas" w:eastAsia="Microsoft YaHei" w:cs="Consolas"/>
+          <w:color w:val="000000"/>
+        </w:rPr>
+        <w:t>192/192</w:t>
+      </w:r>
+      <w:r>
+        <w:rPr>
+          <w:rFonts w:ascii="Microsoft YaHei" w:hAnsi="Microsoft YaHei" w:eastAsia="Microsoft YaHei" w:cs="Microsoft YaHei"/>
+          <w:b w:val="0"/>
+          <w:color w:val="000000"/>
+        </w:rPr>
+        <w:t xml:space="preserve">、PSNR </w:t>
+      </w:r>
+      <w:r>
+        <w:rPr>
+          <w:rFonts w:ascii="Consolas" w:hAnsi="Consolas" w:eastAsia="Microsoft YaHei" w:cs="Consolas"/>
+          <w:color w:val="000000"/>
+        </w:rPr>
+        <w:t>11.884 dB</w:t>
+      </w:r>
+      <w:r>
+        <w:rPr>
+          <w:rFonts w:ascii="Microsoft YaHei" w:hAnsi="Microsoft YaHei" w:eastAsia="Microsoft YaHei" w:cs="Microsoft YaHei"/>
+          <w:b w:val="0"/>
+          <w:color w:val="000000"/>
+        </w:rPr>
+        <w:t xml:space="preserve">。证据见 </w:t>
+      </w:r>
+      <w:r>
+        <w:rPr>
+          <w:rFonts w:ascii="Consolas" w:hAnsi="Consolas" w:eastAsia="Microsoft YaHei" w:cs="Consolas"/>
+          <w:color w:val="000000"/>
+        </w:rPr>
+        <w:t>evidence/board_reports/jtag_true2x2_stagehash_baseline_rerun_20260703_goal_continue/analysis.md</w:t>
+      </w:r>
+      <w:r>
+        <w:rPr>
+          <w:rFonts w:ascii="Microsoft YaHei" w:hAnsi="Microsoft YaHei" w:eastAsia="Microsoft YaHei" w:cs="Microsoft YaHei"/>
+          <w:b w:val="0"/>
+          <w:color w:val="000000"/>
+        </w:rPr>
+        <w:t xml:space="preserve">。当前 clean 结论不是连接问题，而是 PL 数值路径仍不等价；下一步应基于该 baseline 做 single-boundary probe，要求 </w:t>
       </w:r>
       <w:r>
         <w:rPr>
@@ -13340,7 +13415,7 @@
                 <w:color w:val="000000"/>
                 <w:sz w:val="16"/>
               </w:rPr>
-              <w:t>evidence/board_reports/jtag_true2x2_dbg2_src_boundary_20260703_goal_continue/analysis.md</w:t>
+              <w:t>evidence/board_reports/jtag_true2x2_stagehash_baseline_rerun_20260703_goal_continue/analysis.md</w:t>
             </w:r>
           </w:p>
         </w:tc>
@@ -14219,7 +14294,67 @@
           <w:b w:val="0"/>
           <w:color w:val="000000"/>
         </w:rPr>
-        <w:t xml:space="preserve"> byte mismatch；2026-06-29 有效 stage-hash 续跑已经恢复 JTAG/PSU/register read，并完成上板读回，证明历史数值问题不是硬件 target 不可见，而是 PL 计算路径数值不一致。该 stage-hash 结果为输出完整 </w:t>
+        <w:t xml:space="preserve"> byte mismatch；2026-06-29 有效 stage-hash 续跑已经恢复 JTAG/PSU/register read，并完成上板读回，证明历史数值问题不是硬件 target 不可见，而是 PL 计算路径数值不一致。2026-07-03 full probe 已恢复到 </w:t>
+      </w:r>
+      <w:r>
+        <w:rPr>
+          <w:rFonts w:ascii="Consolas" w:hAnsi="Consolas" w:eastAsia="Microsoft YaHei" w:cs="Consolas"/>
+          <w:color w:val="000000"/>
+        </w:rPr>
+        <w:t>READY</w:t>
+      </w:r>
+      <w:r>
+        <w:rPr>
+          <w:rFonts w:ascii="Microsoft YaHei" w:hAnsi="Microsoft YaHei" w:eastAsia="Microsoft YaHei" w:cs="Microsoft YaHei"/>
+          <w:b w:val="0"/>
+          <w:color w:val="000000"/>
+        </w:rPr>
+        <w:t xml:space="preserve">；dbg2/source-b6 实板续跑得到输出完整 </w:t>
+      </w:r>
+      <w:r>
+        <w:rPr>
+          <w:rFonts w:ascii="Consolas" w:hAnsi="Consolas" w:eastAsia="Microsoft YaHei" w:cs="Consolas"/>
+          <w:color w:val="000000"/>
+        </w:rPr>
+        <w:t>192/192</w:t>
+      </w:r>
+      <w:r>
+        <w:rPr>
+          <w:rFonts w:ascii="Microsoft YaHei" w:hAnsi="Microsoft YaHei" w:eastAsia="Microsoft YaHei" w:cs="Microsoft YaHei"/>
+          <w:b w:val="0"/>
+          <w:color w:val="000000"/>
+        </w:rPr>
+        <w:t xml:space="preserve">、compare FAIL </w:t>
+      </w:r>
+      <w:r>
+        <w:rPr>
+          <w:rFonts w:ascii="Consolas" w:hAnsi="Consolas" w:eastAsia="Microsoft YaHei" w:cs="Consolas"/>
+          <w:color w:val="000000"/>
+        </w:rPr>
+        <w:t>188/192</w:t>
+      </w:r>
+      <w:r>
+        <w:rPr>
+          <w:rFonts w:ascii="Microsoft YaHei" w:hAnsi="Microsoft YaHei" w:eastAsia="Microsoft YaHei" w:cs="Microsoft YaHei"/>
+          <w:b w:val="0"/>
+          <w:color w:val="000000"/>
+        </w:rPr>
+        <w:t>、PSNR 19.263 dB、</w:t>
+      </w:r>
+      <w:r>
+        <w:rPr>
+          <w:rFonts w:ascii="Consolas" w:hAnsi="Consolas" w:eastAsia="Microsoft YaHei" w:cs="Consolas"/>
+          <w:color w:val="000000"/>
+        </w:rPr>
+        <w:t>error=0x0000000C</w:t>
+      </w:r>
+      <w:r>
+        <w:rPr>
+          <w:rFonts w:ascii="Microsoft YaHei" w:hAnsi="Microsoft YaHei" w:eastAsia="Microsoft YaHei" w:cs="Microsoft YaHei"/>
+          <w:b w:val="0"/>
+          <w:color w:val="000000"/>
+        </w:rPr>
+        <w:t xml:space="preserve">，只能作为探针侵入性风险证据。随后非侵入 stagehash baseline 复跑得到输出完整 </w:t>
       </w:r>
       <w:r>
         <w:rPr>
@@ -14271,51 +14406,6 @@
           <w:rFonts w:ascii="Consolas" w:hAnsi="Consolas" w:eastAsia="Microsoft YaHei" w:cs="Consolas"/>
           <w:color w:val="000000"/>
         </w:rPr>
-        <w:t>191/192</w:t>
-      </w:r>
-      <w:r>
-        <w:rPr>
-          <w:rFonts w:ascii="Microsoft YaHei" w:hAnsi="Microsoft YaHei" w:eastAsia="Microsoft YaHei" w:cs="Microsoft YaHei"/>
-          <w:b w:val="0"/>
-          <w:color w:val="000000"/>
-        </w:rPr>
-        <w:t xml:space="preserve">、PSNR 11.8292 dB，且 </w:t>
-      </w:r>
-      <w:r>
-        <w:rPr>
-          <w:rFonts w:ascii="Consolas" w:hAnsi="Consolas" w:eastAsia="Microsoft YaHei" w:cs="Consolas"/>
-          <w:color w:val="000000"/>
-        </w:rPr>
-        <w:t>tail_b1_hash</w:t>
-      </w:r>
-      <w:r>
-        <w:rPr>
-          <w:rFonts w:ascii="Microsoft YaHei" w:hAnsi="Microsoft YaHei" w:eastAsia="Microsoft YaHei" w:cs="Microsoft YaHei"/>
-          <w:b w:val="0"/>
-          <w:color w:val="000000"/>
-        </w:rPr>
-        <w:t xml:space="preserve"> 首个边界已经不等于 RTL 期望。2026-07-03 full probe 已恢复到 </w:t>
-      </w:r>
-      <w:r>
-        <w:rPr>
-          <w:rFonts w:ascii="Consolas" w:hAnsi="Consolas" w:eastAsia="Microsoft YaHei" w:cs="Consolas"/>
-          <w:color w:val="000000"/>
-        </w:rPr>
-        <w:t>READY</w:t>
-      </w:r>
-      <w:r>
-        <w:rPr>
-          <w:rFonts w:ascii="Microsoft YaHei" w:hAnsi="Microsoft YaHei" w:eastAsia="Microsoft YaHei" w:cs="Microsoft YaHei"/>
-          <w:b w:val="0"/>
-          <w:color w:val="000000"/>
-        </w:rPr>
-        <w:t xml:space="preserve">，随后 dbg2/source-b6 实板续跑得到输出完整 </w:t>
-      </w:r>
-      <w:r>
-        <w:rPr>
-          <w:rFonts w:ascii="Consolas" w:hAnsi="Consolas" w:eastAsia="Microsoft YaHei" w:cs="Consolas"/>
-          <w:color w:val="000000"/>
-        </w:rPr>
         <w:t>192/192</w:t>
       </w:r>
       <w:r>
@@ -14324,14 +14414,14 @@
           <w:b w:val="0"/>
           <w:color w:val="000000"/>
         </w:rPr>
-        <w:t xml:space="preserve">、compare FAIL </w:t>
+        <w:t xml:space="preserve">、PSNR 11.884 dB，且 </w:t>
       </w:r>
       <w:r>
         <w:rPr>
           <w:rFonts w:ascii="Consolas" w:hAnsi="Consolas" w:eastAsia="Microsoft YaHei" w:cs="Consolas"/>
           <w:color w:val="000000"/>
         </w:rPr>
-        <w:t>188/192</w:t>
+        <w:t>tail_b1/tail_b6_act1/tail_rgb_q/writeback</w:t>
       </w:r>
       <w:r>
         <w:rPr>
@@ -14339,22 +14429,7 @@
           <w:b w:val="0"/>
           <w:color w:val="000000"/>
         </w:rPr>
-        <w:t>、PSNR 19.263 dB、</w:t>
-      </w:r>
-      <w:r>
-        <w:rPr>
-          <w:rFonts w:ascii="Consolas" w:hAnsi="Consolas" w:eastAsia="Microsoft YaHei" w:cs="Consolas"/>
-          <w:color w:val="000000"/>
-        </w:rPr>
-        <w:t>error=0x0000000C</w:t>
-      </w:r>
-      <w:r>
-        <w:rPr>
-          <w:rFonts w:ascii="Microsoft YaHei" w:hAnsi="Microsoft YaHei" w:eastAsia="Microsoft YaHei" w:cs="Microsoft YaHei"/>
-          <w:b w:val="0"/>
-          <w:color w:val="000000"/>
-        </w:rPr>
-        <w:t xml:space="preserve">。这进一步证明板端链路可运行，但本轮 debug hash 带错误标志，不能作为干净 datapath 根因。后续应先做低侵入 single-boundary probe，在 </w:t>
+        <w:t xml:space="preserve"> 均与 RTL 期望不一致。这是当前最干净的 board mismatch 基线。后续应做低侵入 single-boundary probe，在 </w:t>
       </w:r>
       <w:r>
         <w:rPr>

</xml_diff>

<commit_message>
Record dbg3 board localization and report refresh
</commit_message>
<xml_diff>
--- a/W8A12_3lane/output/docx/W8A12_3lane_contest_submission_report.docx
+++ b/W8A12_3lane/output/docx/W8A12_3lane_contest_submission_report.docx
@@ -12193,6 +12193,196 @@
       </w:r>
     </w:p>
     <w:p>
+      <w:r>
+        <w:rPr>
+          <w:rFonts w:ascii="Microsoft YaHei" w:hAnsi="Microsoft YaHei" w:eastAsia="Microsoft YaHei" w:cs="Microsoft YaHei"/>
+          <w:b w:val="0"/>
+          <w:color w:val="000000"/>
+        </w:rPr>
+        <w:t xml:space="preserve">2026-07-03 已继续完成 </w:t>
+      </w:r>
+      <w:r>
+        <w:rPr>
+          <w:rFonts w:ascii="Consolas" w:hAnsi="Consolas" w:eastAsia="Microsoft YaHei" w:cs="Consolas"/>
+          <w:color w:val="000000"/>
+        </w:rPr>
+        <w:t>dbg3/single-boundary</w:t>
+      </w:r>
+      <w:r>
+        <w:rPr>
+          <w:rFonts w:ascii="Microsoft YaHei" w:hAnsi="Microsoft YaHei" w:eastAsia="Microsoft YaHei" w:cs="Microsoft YaHei"/>
+          <w:b w:val="0"/>
+          <w:color w:val="000000"/>
+        </w:rPr>
+        <w:t xml:space="preserve"> 版本：行为级 RTL raw compare 为 </w:t>
+      </w:r>
+      <w:r>
+        <w:rPr>
+          <w:rFonts w:ascii="Consolas" w:hAnsi="Consolas" w:eastAsia="Microsoft YaHei" w:cs="Consolas"/>
+          <w:color w:val="000000"/>
+        </w:rPr>
+        <w:t>0/192</w:t>
+      </w:r>
+      <w:r>
+        <w:rPr>
+          <w:rFonts w:ascii="Microsoft YaHei" w:hAnsi="Microsoft YaHei" w:eastAsia="Microsoft YaHei" w:cs="Microsoft YaHei"/>
+          <w:b w:val="0"/>
+          <w:color w:val="000000"/>
+        </w:rPr>
+        <w:t xml:space="preserve"> mismatch，bitstream 生成和 timing PASS，实板 probe/PSU/register read PASS，输出完整 </w:t>
+      </w:r>
+      <w:r>
+        <w:rPr>
+          <w:rFonts w:ascii="Consolas" w:hAnsi="Consolas" w:eastAsia="Microsoft YaHei" w:cs="Consolas"/>
+          <w:color w:val="000000"/>
+        </w:rPr>
+        <w:t>192/192</w:t>
+      </w:r>
+      <w:r>
+        <w:rPr>
+          <w:rFonts w:ascii="Microsoft YaHei" w:hAnsi="Microsoft YaHei" w:eastAsia="Microsoft YaHei" w:cs="Microsoft YaHei"/>
+          <w:b w:val="0"/>
+          <w:color w:val="000000"/>
+        </w:rPr>
+        <w:t>、</w:t>
+      </w:r>
+      <w:r>
+        <w:rPr>
+          <w:rFonts w:ascii="Consolas" w:hAnsi="Consolas" w:eastAsia="Microsoft YaHei" w:cs="Consolas"/>
+          <w:color w:val="000000"/>
+        </w:rPr>
+        <w:t>frame_done=1</w:t>
+      </w:r>
+      <w:r>
+        <w:rPr>
+          <w:rFonts w:ascii="Microsoft YaHei" w:hAnsi="Microsoft YaHei" w:eastAsia="Microsoft YaHei" w:cs="Microsoft YaHei"/>
+          <w:b w:val="0"/>
+          <w:color w:val="000000"/>
+        </w:rPr>
+        <w:t>、</w:t>
+      </w:r>
+      <w:r>
+        <w:rPr>
+          <w:rFonts w:ascii="Consolas" w:hAnsi="Consolas" w:eastAsia="Microsoft YaHei" w:cs="Consolas"/>
+          <w:color w:val="000000"/>
+        </w:rPr>
+        <w:t>error=0</w:t>
+      </w:r>
+      <w:r>
+        <w:rPr>
+          <w:rFonts w:ascii="Microsoft YaHei" w:hAnsi="Microsoft YaHei" w:eastAsia="Microsoft YaHei" w:cs="Microsoft YaHei"/>
+          <w:b w:val="0"/>
+          <w:color w:val="000000"/>
+        </w:rPr>
+        <w:t xml:space="preserve">，但 compare FAIL </w:t>
+      </w:r>
+      <w:r>
+        <w:rPr>
+          <w:rFonts w:ascii="Consolas" w:hAnsi="Consolas" w:eastAsia="Microsoft YaHei" w:cs="Consolas"/>
+          <w:color w:val="000000"/>
+        </w:rPr>
+        <w:t>192/192</w:t>
+      </w:r>
+      <w:r>
+        <w:rPr>
+          <w:rFonts w:ascii="Microsoft YaHei" w:hAnsi="Microsoft YaHei" w:eastAsia="Microsoft YaHei" w:cs="Microsoft YaHei"/>
+          <w:b w:val="0"/>
+          <w:color w:val="000000"/>
+        </w:rPr>
+        <w:t xml:space="preserve">、PSNR </w:t>
+      </w:r>
+      <w:r>
+        <w:rPr>
+          <w:rFonts w:ascii="Consolas" w:hAnsi="Consolas" w:eastAsia="Microsoft YaHei" w:cs="Consolas"/>
+          <w:color w:val="000000"/>
+        </w:rPr>
+        <w:t>7.724 dB</w:t>
+      </w:r>
+      <w:r>
+        <w:rPr>
+          <w:rFonts w:ascii="Microsoft YaHei" w:hAnsi="Microsoft YaHei" w:eastAsia="Microsoft YaHei" w:cs="Microsoft YaHei"/>
+          <w:b w:val="0"/>
+          <w:color w:val="000000"/>
+        </w:rPr>
+        <w:t>。关键边界上，</w:t>
+      </w:r>
+      <w:r>
+        <w:rPr>
+          <w:rFonts w:ascii="Consolas" w:hAnsi="Consolas" w:eastAsia="Microsoft YaHei" w:cs="Consolas"/>
+          <w:color w:val="000000"/>
+        </w:rPr>
+        <w:t>src_feat0_hash=0xF7F21881</w:t>
+      </w:r>
+      <w:r>
+        <w:rPr>
+          <w:rFonts w:ascii="Microsoft YaHei" w:hAnsi="Microsoft YaHei" w:eastAsia="Microsoft YaHei" w:cs="Microsoft YaHei"/>
+          <w:b w:val="0"/>
+          <w:color w:val="000000"/>
+        </w:rPr>
+        <w:t xml:space="preserve"> 与 RTL 期望一致，说明输入/JTAG/PSU/写回前置和 conv1 feat0 source 边界可用；</w:t>
+      </w:r>
+      <w:r>
+        <w:rPr>
+          <w:rFonts w:ascii="Consolas" w:hAnsi="Consolas" w:eastAsia="Microsoft YaHei" w:cs="Consolas"/>
+          <w:color w:val="000000"/>
+        </w:rPr>
+        <w:t>src_b1_hash=0xF657C1B4</w:t>
+      </w:r>
+      <w:r>
+        <w:rPr>
+          <w:rFonts w:ascii="Microsoft YaHei" w:hAnsi="Microsoft YaHei" w:eastAsia="Microsoft YaHei" w:cs="Microsoft YaHei"/>
+          <w:b w:val="0"/>
+          <w:color w:val="000000"/>
+        </w:rPr>
+        <w:t xml:space="preserve"> 与 RTL 期望 </w:t>
+      </w:r>
+      <w:r>
+        <w:rPr>
+          <w:rFonts w:ascii="Consolas" w:hAnsi="Consolas" w:eastAsia="Microsoft YaHei" w:cs="Consolas"/>
+          <w:color w:val="000000"/>
+        </w:rPr>
+        <w:t>0x16ede581</w:t>
+      </w:r>
+      <w:r>
+        <w:rPr>
+          <w:rFonts w:ascii="Microsoft YaHei" w:hAnsi="Microsoft YaHei" w:eastAsia="Microsoft YaHei" w:cs="Microsoft YaHei"/>
+          <w:b w:val="0"/>
+          <w:color w:val="000000"/>
+        </w:rPr>
+        <w:t xml:space="preserve"> 不一致，首个已知 mismatch 前移到 SPAB block1 输出/feature buffer replay 到 </w:t>
+      </w:r>
+      <w:r>
+        <w:rPr>
+          <w:rFonts w:ascii="Consolas" w:hAnsi="Consolas" w:eastAsia="Microsoft YaHei" w:cs="Consolas"/>
+          <w:color w:val="000000"/>
+        </w:rPr>
+        <w:t>src_b1</w:t>
+      </w:r>
+      <w:r>
+        <w:rPr>
+          <w:rFonts w:ascii="Microsoft YaHei" w:hAnsi="Microsoft YaHei" w:eastAsia="Microsoft YaHei" w:cs="Microsoft YaHei"/>
+          <w:b w:val="0"/>
+          <w:color w:val="000000"/>
+        </w:rPr>
+        <w:t xml:space="preserve"> 的边界。证据见 </w:t>
+      </w:r>
+      <w:r>
+        <w:rPr>
+          <w:rFonts w:ascii="Consolas" w:hAnsi="Consolas" w:eastAsia="Microsoft YaHei" w:cs="Consolas"/>
+          <w:color w:val="000000"/>
+        </w:rPr>
+        <w:t>evidence/board_reports/jtag_true2x2_dbg3_single_boundary_20260703/analysis.md</w:t>
+      </w:r>
+      <w:r>
+        <w:rPr>
+          <w:rFonts w:ascii="Microsoft YaHei" w:hAnsi="Microsoft YaHei" w:eastAsia="Microsoft YaHei" w:cs="Microsoft YaHei"/>
+          <w:b w:val="0"/>
+          <w:color w:val="000000"/>
+        </w:rPr>
+        <w:t>。</w:t>
+      </w:r>
+    </w:p>
+    <w:p>
       <w:pPr>
         <w:pStyle w:val="Heading1"/>
       </w:pPr>
@@ -13415,7 +13605,7 @@
                 <w:color w:val="000000"/>
                 <w:sz w:val="16"/>
               </w:rPr>
-              <w:t>evidence/board_reports/jtag_true2x2_stagehash_baseline_rerun_20260703_goal_continue/analysis.md</w:t>
+              <w:t>evidence/board_reports/jtag_true2x2_dbg3_single_boundary_20260703/analysis.md</w:t>
             </w:r>
           </w:p>
         </w:tc>
@@ -14429,7 +14619,7 @@
           <w:b w:val="0"/>
           <w:color w:val="000000"/>
         </w:rPr>
-        <w:t xml:space="preserve"> 均与 RTL 期望不一致。这是当前最干净的 board mismatch 基线。后续应做低侵入 single-boundary probe，在 </w:t>
+        <w:t xml:space="preserve"> 均与 RTL 期望不一致。最新 dbg3/single-boundary 版本保持 </w:t>
       </w:r>
       <w:r>
         <w:rPr>
@@ -14444,14 +14634,14 @@
           <w:b w:val="0"/>
           <w:color w:val="000000"/>
         </w:rPr>
-        <w:t>、</w:t>
+        <w:t xml:space="preserve"> 和完整输出，并把已知首错从 tail/stage hash 前移到 </w:t>
       </w:r>
       <w:r>
         <w:rPr>
           <w:rFonts w:ascii="Consolas" w:hAnsi="Consolas" w:eastAsia="Microsoft YaHei" w:cs="Consolas"/>
           <w:color w:val="000000"/>
         </w:rPr>
-        <w:t>frame_done=1</w:t>
+        <w:t>src_b1_hash</w:t>
       </w:r>
       <w:r>
         <w:rPr>
@@ -14459,14 +14649,14 @@
           <w:b w:val="0"/>
           <w:color w:val="000000"/>
         </w:rPr>
-        <w:t xml:space="preserve">、输出完整时再沿 </w:t>
+        <w:t>：</w:t>
       </w:r>
       <w:r>
         <w:rPr>
           <w:rFonts w:ascii="Consolas" w:hAnsi="Consolas" w:eastAsia="Microsoft YaHei" w:cs="Consolas"/>
           <w:color w:val="000000"/>
         </w:rPr>
-        <w:t>halo fetch / conv1 feat0 -&gt; SPAB block1 -&gt; feature buffer/replay -&gt; b1_m_feat -&gt; tail</w:t>
+        <w:t>src_feat0_hash</w:t>
       </w:r>
       <w:r>
         <w:rPr>
@@ -14474,7 +14664,37 @@
           <w:b w:val="0"/>
           <w:color w:val="000000"/>
         </w:rPr>
-        <w:t xml:space="preserve"> 链路收窄第一个错误点，并逐步补齐 32x32、64x64、720p x4 和 720p x2 board validation。</w:t>
+        <w:t xml:space="preserve"> 已与 RTL 匹配，</w:t>
+      </w:r>
+      <w:r>
+        <w:rPr>
+          <w:rFonts w:ascii="Consolas" w:hAnsi="Consolas" w:eastAsia="Microsoft YaHei" w:cs="Consolas"/>
+          <w:color w:val="000000"/>
+        </w:rPr>
+        <w:t>src_b1_hash</w:t>
+      </w:r>
+      <w:r>
+        <w:rPr>
+          <w:rFonts w:ascii="Microsoft YaHei" w:hAnsi="Microsoft YaHei" w:eastAsia="Microsoft YaHei" w:cs="Microsoft YaHei"/>
+          <w:b w:val="0"/>
+          <w:color w:val="000000"/>
+        </w:rPr>
+        <w:t xml:space="preserve"> 仍不匹配。后续应继续拆 SPAB block1 内部输出和 feature buffer/replay 到 </w:t>
+      </w:r>
+      <w:r>
+        <w:rPr>
+          <w:rFonts w:ascii="Consolas" w:hAnsi="Consolas" w:eastAsia="Microsoft YaHei" w:cs="Consolas"/>
+          <w:color w:val="000000"/>
+        </w:rPr>
+        <w:t>src_b1</w:t>
+      </w:r>
+      <w:r>
+        <w:rPr>
+          <w:rFonts w:ascii="Microsoft YaHei" w:hAnsi="Microsoft YaHei" w:eastAsia="Microsoft YaHei" w:cs="Microsoft YaHei"/>
+          <w:b w:val="0"/>
+          <w:color w:val="000000"/>
+        </w:rPr>
+        <w:t xml:space="preserve"> 的边界，并逐步补齐 32x32、64x64、720p x4 和 720p x2 board validation。</w:t>
       </w:r>
     </w:p>
     <w:p>

</xml_diff>

<commit_message>
Update W8A12 3-lane delivery evidence
</commit_message>
<xml_diff>
--- a/W8A12_3lane/output/docx/W8A12_3lane_contest_submission_report.docx
+++ b/W8A12_3lane/output/docx/W8A12_3lane_contest_submission_report.docx
@@ -1403,7 +1403,7 @@
                 <w:color w:val="000000"/>
                 <w:sz w:val="16"/>
               </w:rPr>
-              <w:t>A4 3-lane scheduler 672 DSP 低于 900 DSP 规划门限；true2x2/JTAG-W8A12 implementation 为 LUT 38803、FF 116441、BRAM 311、DSP 128、WNS 12.517ns</w:t>
+              <w:t>A4 3-lane scheduler 672 DSP 低于 900 DSP 规划门限；true2x2/JTAG-W8A12 implementation 为 LUT 39799、FF 116685、BRAM 311、DSP 128、WNS 12.580ns</w:t>
             </w:r>
           </w:p>
         </w:tc>
@@ -6180,7 +6180,7 @@
                 <w:color w:val="000000"/>
                 <w:sz w:val="16"/>
               </w:rPr>
-              <w:t>38803</w:t>
+              <w:t>39799</w:t>
             </w:r>
           </w:p>
         </w:tc>
@@ -6286,7 +6286,7 @@
                 <w:color w:val="000000"/>
                 <w:sz w:val="16"/>
               </w:rPr>
-              <w:t>116441</w:t>
+              <w:t>116685</w:t>
             </w:r>
           </w:p>
         </w:tc>
@@ -6604,7 +6604,7 @@
                 <w:color w:val="000000"/>
                 <w:sz w:val="16"/>
               </w:rPr>
-              <w:t>12.517 ns</w:t>
+              <w:t>12.580 ns</w:t>
             </w:r>
           </w:p>
         </w:tc>
@@ -6790,7 +6790,7 @@
           <w:b w:val="0"/>
           <w:color w:val="000000"/>
         </w:rPr>
-        <w:t xml:space="preserve"> 的 JTAG-W8A12 x4 tile-writer/debug source-boundary 配置，行为级 RTL raw compare 为 </w:t>
+        <w:t xml:space="preserve"> 的 JTAG-W8A12 x4 tile-writer/debug count-view 配置，行为级 RTL raw compare 为 </w:t>
       </w:r>
       <w:r>
         <w:rPr>
@@ -10793,7 +10793,41 @@
           <w:color w:val="000000"/>
           <w:sz w:val="20"/>
         </w:rPr>
-        <w:t xml:space="preserve"> 不一致，最早失败边界定位到 front/SPAB block1 或更前输入/halo 路径。</w:t>
+        <w:t xml:space="preserve"> 不一致。2026-07-03 dbg3 clean run 进一步确认 </w:t>
+      </w:r>
+      <w:r>
+        <w:rPr>
+          <w:rFonts w:ascii="Consolas" w:hAnsi="Consolas" w:eastAsia="Microsoft YaHei" w:cs="Consolas"/>
+          <w:color w:val="000000"/>
+          <w:sz w:val="20"/>
+        </w:rPr>
+        <w:t>src_feat0_hash</w:t>
+      </w:r>
+      <w:r>
+        <w:rPr>
+          <w:rFonts w:ascii="Microsoft YaHei" w:hAnsi="Microsoft YaHei" w:eastAsia="Microsoft YaHei" w:cs="Microsoft YaHei"/>
+          <w:b w:val="0"/>
+          <w:color w:val="000000"/>
+          <w:sz w:val="20"/>
+        </w:rPr>
+        <w:t xml:space="preserve"> 匹配、</w:t>
+      </w:r>
+      <w:r>
+        <w:rPr>
+          <w:rFonts w:ascii="Consolas" w:hAnsi="Consolas" w:eastAsia="Microsoft YaHei" w:cs="Consolas"/>
+          <w:color w:val="000000"/>
+          <w:sz w:val="20"/>
+        </w:rPr>
+        <w:t>src_b1_hash</w:t>
+      </w:r>
+      <w:r>
+        <w:rPr>
+          <w:rFonts w:ascii="Microsoft YaHei" w:hAnsi="Microsoft YaHei" w:eastAsia="Microsoft YaHei" w:cs="Microsoft YaHei"/>
+          <w:b w:val="0"/>
+          <w:color w:val="000000"/>
+          <w:sz w:val="20"/>
+        </w:rPr>
+        <w:t xml:space="preserve"> 首错；dbg5/count-view 将 stall 压到 block1 C1 后、C2/C3/attention 前。</w:t>
       </w:r>
     </w:p>
     <w:p>
@@ -11028,7 +11062,7 @@
           <w:color w:val="000000"/>
           <w:sz w:val="20"/>
         </w:rPr>
-        <w:t xml:space="preserve">回到历史最好 Default/inpixfix baseline，加更窄的 </w:t>
+        <w:t>当前 clean baseline 为 dbg3/single-boundary：</w:t>
       </w:r>
       <w:r>
         <w:rPr>
@@ -11036,7 +11070,7 @@
           <w:color w:val="000000"/>
           <w:sz w:val="20"/>
         </w:rPr>
-        <w:t>tail_b1_hash</w:t>
+        <w:t>src_feat0_hash</w:t>
       </w:r>
       <w:r>
         <w:rPr>
@@ -11045,7 +11079,7 @@
           <w:color w:val="000000"/>
           <w:sz w:val="20"/>
         </w:rPr>
-        <w:t>、</w:t>
+        <w:t xml:space="preserve"> 匹配、</w:t>
       </w:r>
       <w:r>
         <w:rPr>
@@ -11053,7 +11087,7 @@
           <w:color w:val="000000"/>
           <w:sz w:val="20"/>
         </w:rPr>
-        <w:t>tail_b6_act1_hash</w:t>
+        <w:t>src_b1_hash</w:t>
       </w:r>
       <w:r>
         <w:rPr>
@@ -11062,41 +11096,7 @@
           <w:color w:val="000000"/>
           <w:sz w:val="20"/>
         </w:rPr>
-        <w:t>、</w:t>
-      </w:r>
-      <w:r>
-        <w:rPr>
-          <w:rFonts w:ascii="Consolas" w:hAnsi="Consolas" w:eastAsia="Microsoft YaHei" w:cs="Consolas"/>
-          <w:color w:val="000000"/>
-          <w:sz w:val="20"/>
-        </w:rPr>
-        <w:t>tail_rgb_q_hash</w:t>
-      </w:r>
-      <w:r>
-        <w:rPr>
-          <w:rFonts w:ascii="Microsoft YaHei" w:hAnsi="Microsoft YaHei" w:eastAsia="Microsoft YaHei" w:cs="Microsoft YaHei"/>
-          <w:b w:val="0"/>
-          <w:color w:val="000000"/>
-          <w:sz w:val="20"/>
-        </w:rPr>
-        <w:t xml:space="preserve"> 和 writer </w:t>
-      </w:r>
-      <w:r>
-        <w:rPr>
-          <w:rFonts w:ascii="Consolas" w:hAnsi="Consolas" w:eastAsia="Microsoft YaHei" w:cs="Consolas"/>
-          <w:color w:val="000000"/>
-          <w:sz w:val="20"/>
-        </w:rPr>
-        <w:t>hash/first/last</w:t>
-      </w:r>
-      <w:r>
-        <w:rPr>
-          <w:rFonts w:ascii="Microsoft YaHei" w:hAnsi="Microsoft YaHei" w:eastAsia="Microsoft YaHei" w:cs="Microsoft YaHei"/>
-          <w:b w:val="0"/>
-          <w:color w:val="000000"/>
-          <w:sz w:val="20"/>
-        </w:rPr>
-        <w:t>；</w:t>
+        <w:t xml:space="preserve"> 首错且输出完整；</w:t>
       </w:r>
     </w:p>
     <w:p>
@@ -11110,7 +11110,7 @@
           <w:color w:val="000000"/>
           <w:sz w:val="20"/>
         </w:rPr>
-        <w:t>若 writeback/stage hash 一致但 board output mismatch，查 endpoint 输出缓存/JTAG 读回；</w:t>
+        <w:t>最新 dbg5/count-view 显示 C1 有部分计数，C2/C3/attention 为 0，下一步只挂一个 C1-&gt;C2 ready/valid 或 feature replay ready/valid 探针；</w:t>
       </w:r>
     </w:p>
     <w:p>
@@ -11124,7 +11124,7 @@
           <w:color w:val="000000"/>
           <w:sz w:val="20"/>
         </w:rPr>
-        <w:t>若 hash 不一致，继续查 front/SPAB、tail/pixelshuffle/RGB；</w:t>
+        <w:t>若新窄探针计数一致但 board output 仍 mismatch，再查 endpoint 输出缓存/JTAG 读回；若计数不一致，继续查 front/SPAB block1、attention、feature replay；</w:t>
       </w:r>
     </w:p>
     <w:p>
@@ -12383,6 +12383,226 @@
       </w:r>
     </w:p>
     <w:p>
+      <w:r>
+        <w:rPr>
+          <w:rFonts w:ascii="Microsoft YaHei" w:hAnsi="Microsoft YaHei" w:eastAsia="Microsoft YaHei" w:cs="Microsoft YaHei"/>
+          <w:b w:val="0"/>
+          <w:color w:val="000000"/>
+        </w:rPr>
+        <w:t xml:space="preserve">2026-07-03 继续补充 </w:t>
+      </w:r>
+      <w:r>
+        <w:rPr>
+          <w:rFonts w:ascii="Consolas" w:hAnsi="Consolas" w:eastAsia="Microsoft YaHei" w:cs="Consolas"/>
+          <w:color w:val="000000"/>
+        </w:rPr>
+        <w:t>dbg4/bank4</w:t>
+      </w:r>
+      <w:r>
+        <w:rPr>
+          <w:rFonts w:ascii="Microsoft YaHei" w:hAnsi="Microsoft YaHei" w:eastAsia="Microsoft YaHei" w:cs="Microsoft YaHei"/>
+          <w:b w:val="0"/>
+          <w:color w:val="000000"/>
+        </w:rPr>
+        <w:t xml:space="preserve"> 和 </w:t>
+      </w:r>
+      <w:r>
+        <w:rPr>
+          <w:rFonts w:ascii="Consolas" w:hAnsi="Consolas" w:eastAsia="Microsoft YaHei" w:cs="Consolas"/>
+          <w:color w:val="000000"/>
+        </w:rPr>
+        <w:t>dbg5/count-view</w:t>
+      </w:r>
+      <w:r>
+        <w:rPr>
+          <w:rFonts w:ascii="Microsoft YaHei" w:hAnsi="Microsoft YaHei" w:eastAsia="Microsoft YaHei" w:cs="Microsoft YaHei"/>
+          <w:b w:val="0"/>
+          <w:color w:val="000000"/>
+        </w:rPr>
+        <w:t xml:space="preserve">。dbg4 证明 </w:t>
+      </w:r>
+      <w:r>
+        <w:rPr>
+          <w:rFonts w:ascii="Consolas" w:hAnsi="Consolas" w:eastAsia="Microsoft YaHei" w:cs="Consolas"/>
+          <w:color w:val="000000"/>
+        </w:rPr>
+        <w:t>sched_feat0_hash</w:t>
+      </w:r>
+      <w:r>
+        <w:rPr>
+          <w:rFonts w:ascii="Microsoft YaHei" w:hAnsi="Microsoft YaHei" w:eastAsia="Microsoft YaHei" w:cs="Microsoft YaHei"/>
+          <w:b w:val="0"/>
+          <w:color w:val="000000"/>
+        </w:rPr>
+        <w:t xml:space="preserve"> 与 RTL 匹配，但 </w:t>
+      </w:r>
+      <w:r>
+        <w:rPr>
+          <w:rFonts w:ascii="Consolas" w:hAnsi="Consolas" w:eastAsia="Microsoft YaHei" w:cs="Consolas"/>
+          <w:color w:val="000000"/>
+        </w:rPr>
+        <w:t>sched_b1_hash</w:t>
+      </w:r>
+      <w:r>
+        <w:rPr>
+          <w:rFonts w:ascii="Microsoft YaHei" w:hAnsi="Microsoft YaHei" w:eastAsia="Microsoft YaHei" w:cs="Microsoft YaHei"/>
+          <w:b w:val="0"/>
+          <w:color w:val="000000"/>
+        </w:rPr>
+        <w:t xml:space="preserve"> 不匹配并伴随 no-output stall。dbg5 使用更低侵入的计数视图，行为级 RTL raw compare 仍为 </w:t>
+      </w:r>
+      <w:r>
+        <w:rPr>
+          <w:rFonts w:ascii="Consolas" w:hAnsi="Consolas" w:eastAsia="Microsoft YaHei" w:cs="Consolas"/>
+          <w:color w:val="000000"/>
+        </w:rPr>
+        <w:t>0/192</w:t>
+      </w:r>
+      <w:r>
+        <w:rPr>
+          <w:rFonts w:ascii="Microsoft YaHei" w:hAnsi="Microsoft YaHei" w:eastAsia="Microsoft YaHei" w:cs="Microsoft YaHei"/>
+          <w:b w:val="0"/>
+          <w:color w:val="000000"/>
+        </w:rPr>
+        <w:t xml:space="preserve"> mismatch，bitstream/timing PASS；实板 JTAG/PSU/register read PASS，但 smoke 输出 </w:t>
+      </w:r>
+      <w:r>
+        <w:rPr>
+          <w:rFonts w:ascii="Consolas" w:hAnsi="Consolas" w:eastAsia="Microsoft YaHei" w:cs="Consolas"/>
+          <w:color w:val="000000"/>
+        </w:rPr>
+        <w:t>0/192</w:t>
+      </w:r>
+      <w:r>
+        <w:rPr>
+          <w:rFonts w:ascii="Microsoft YaHei" w:hAnsi="Microsoft YaHei" w:eastAsia="Microsoft YaHei" w:cs="Microsoft YaHei"/>
+          <w:b w:val="0"/>
+          <w:color w:val="000000"/>
+        </w:rPr>
+        <w:t xml:space="preserve">。关键计数上，RTL 期望 </w:t>
+      </w:r>
+      <w:r>
+        <w:rPr>
+          <w:rFonts w:ascii="Consolas" w:hAnsi="Consolas" w:eastAsia="Microsoft YaHei" w:cs="Consolas"/>
+          <w:color w:val="000000"/>
+        </w:rPr>
+        <w:t>C1/C2/C3/ATT=0x00030003</w:t>
+      </w:r>
+      <w:r>
+        <w:rPr>
+          <w:rFonts w:ascii="Microsoft YaHei" w:hAnsi="Microsoft YaHei" w:eastAsia="Microsoft YaHei" w:cs="Microsoft YaHei"/>
+          <w:b w:val="0"/>
+          <w:color w:val="000000"/>
+        </w:rPr>
+        <w:t>、</w:t>
+      </w:r>
+      <w:r>
+        <w:rPr>
+          <w:rFonts w:ascii="Consolas" w:hAnsi="Consolas" w:eastAsia="Microsoft YaHei" w:cs="Consolas"/>
+          <w:color w:val="000000"/>
+        </w:rPr>
+        <w:t>block_counts=0x00060018</w:t>
+      </w:r>
+      <w:r>
+        <w:rPr>
+          <w:rFonts w:ascii="Microsoft YaHei" w:hAnsi="Microsoft YaHei" w:eastAsia="Microsoft YaHei" w:cs="Microsoft YaHei"/>
+          <w:b w:val="0"/>
+          <w:color w:val="000000"/>
+        </w:rPr>
+        <w:t>、</w:t>
+      </w:r>
+      <w:r>
+        <w:rPr>
+          <w:rFonts w:ascii="Consolas" w:hAnsi="Consolas" w:eastAsia="Microsoft YaHei" w:cs="Consolas"/>
+          <w:color w:val="000000"/>
+        </w:rPr>
+        <w:t>replay=0x18</w:t>
+      </w:r>
+      <w:r>
+        <w:rPr>
+          <w:rFonts w:ascii="Microsoft YaHei" w:hAnsi="Microsoft YaHei" w:eastAsia="Microsoft YaHei" w:cs="Microsoft YaHei"/>
+          <w:b w:val="0"/>
+          <w:color w:val="000000"/>
+        </w:rPr>
+        <w:t xml:space="preserve">，板端为 </w:t>
+      </w:r>
+      <w:r>
+        <w:rPr>
+          <w:rFonts w:ascii="Consolas" w:hAnsi="Consolas" w:eastAsia="Microsoft YaHei" w:cs="Consolas"/>
+          <w:color w:val="000000"/>
+        </w:rPr>
+        <w:t>C1=0x00000003</w:t>
+      </w:r>
+      <w:r>
+        <w:rPr>
+          <w:rFonts w:ascii="Microsoft YaHei" w:hAnsi="Microsoft YaHei" w:eastAsia="Microsoft YaHei" w:cs="Microsoft YaHei"/>
+          <w:b w:val="0"/>
+          <w:color w:val="000000"/>
+        </w:rPr>
+        <w:t>、</w:t>
+      </w:r>
+      <w:r>
+        <w:rPr>
+          <w:rFonts w:ascii="Consolas" w:hAnsi="Consolas" w:eastAsia="Microsoft YaHei" w:cs="Consolas"/>
+          <w:color w:val="000000"/>
+        </w:rPr>
+        <w:t>C2/C3/ATT=0</w:t>
+      </w:r>
+      <w:r>
+        <w:rPr>
+          <w:rFonts w:ascii="Microsoft YaHei" w:hAnsi="Microsoft YaHei" w:eastAsia="Microsoft YaHei" w:cs="Microsoft YaHei"/>
+          <w:b w:val="0"/>
+          <w:color w:val="000000"/>
+        </w:rPr>
+        <w:t>、</w:t>
+      </w:r>
+      <w:r>
+        <w:rPr>
+          <w:rFonts w:ascii="Consolas" w:hAnsi="Consolas" w:eastAsia="Microsoft YaHei" w:cs="Consolas"/>
+          <w:color w:val="000000"/>
+        </w:rPr>
+        <w:t>block_counts=0x00010000</w:t>
+      </w:r>
+      <w:r>
+        <w:rPr>
+          <w:rFonts w:ascii="Microsoft YaHei" w:hAnsi="Microsoft YaHei" w:eastAsia="Microsoft YaHei" w:cs="Microsoft YaHei"/>
+          <w:b w:val="0"/>
+          <w:color w:val="000000"/>
+        </w:rPr>
+        <w:t>、</w:t>
+      </w:r>
+      <w:r>
+        <w:rPr>
+          <w:rFonts w:ascii="Consolas" w:hAnsi="Consolas" w:eastAsia="Microsoft YaHei" w:cs="Consolas"/>
+          <w:color w:val="000000"/>
+        </w:rPr>
+        <w:t>replay=0x4</w:t>
+      </w:r>
+      <w:r>
+        <w:rPr>
+          <w:rFonts w:ascii="Microsoft YaHei" w:hAnsi="Microsoft YaHei" w:eastAsia="Microsoft YaHei" w:cs="Microsoft YaHei"/>
+          <w:b w:val="0"/>
+          <w:color w:val="000000"/>
+        </w:rPr>
+        <w:t xml:space="preserve">。因此 dbg3 仍是 clean correctness baseline，dbg5 是最新定位证据：下一步排查点为 SPAB block1 C1-&gt;C2 ready/valid 或 feature replay ready/valid。证据见 </w:t>
+      </w:r>
+      <w:r>
+        <w:rPr>
+          <w:rFonts w:ascii="Consolas" w:hAnsi="Consolas" w:eastAsia="Microsoft YaHei" w:cs="Consolas"/>
+          <w:color w:val="000000"/>
+        </w:rPr>
+        <w:t>evidence/board_reports/jtag_true2x2_dbg5_countview_20260703/analysis.md</w:t>
+      </w:r>
+      <w:r>
+        <w:rPr>
+          <w:rFonts w:ascii="Microsoft YaHei" w:hAnsi="Microsoft YaHei" w:eastAsia="Microsoft YaHei" w:cs="Microsoft YaHei"/>
+          <w:b w:val="0"/>
+          <w:color w:val="000000"/>
+        </w:rPr>
+        <w:t>。</w:t>
+      </w:r>
+    </w:p>
+    <w:p>
       <w:pPr>
         <w:pStyle w:val="Heading1"/>
       </w:pPr>
@@ -13605,7 +13825,7 @@
                 <w:color w:val="000000"/>
                 <w:sz w:val="16"/>
               </w:rPr>
-              <w:t>evidence/board_reports/jtag_true2x2_dbg3_single_boundary_20260703/analysis.md</w:t>
+              <w:t>evidence/board_reports/jtag_true2x2_dbg5_countview_20260703/analysis.md</w:t>
             </w:r>
           </w:p>
         </w:tc>
@@ -14604,14 +14824,14 @@
           <w:b w:val="0"/>
           <w:color w:val="000000"/>
         </w:rPr>
-        <w:t xml:space="preserve">、PSNR 11.884 dB，且 </w:t>
+        <w:t xml:space="preserve">、PSNR 11.884 dB。dbg3/single-boundary 版本保持 </w:t>
       </w:r>
       <w:r>
         <w:rPr>
           <w:rFonts w:ascii="Consolas" w:hAnsi="Consolas" w:eastAsia="Microsoft YaHei" w:cs="Consolas"/>
           <w:color w:val="000000"/>
         </w:rPr>
-        <w:t>tail_b1/tail_b6_act1/tail_rgb_q/writeback</w:t>
+        <w:t>error=0</w:t>
       </w:r>
       <w:r>
         <w:rPr>
@@ -14619,14 +14839,14 @@
           <w:b w:val="0"/>
           <w:color w:val="000000"/>
         </w:rPr>
-        <w:t xml:space="preserve"> 均与 RTL 期望不一致。最新 dbg3/single-boundary 版本保持 </w:t>
+        <w:t xml:space="preserve"> 和完整输出，并把已知首错从 tail/stage hash 前移到 </w:t>
       </w:r>
       <w:r>
         <w:rPr>
           <w:rFonts w:ascii="Consolas" w:hAnsi="Consolas" w:eastAsia="Microsoft YaHei" w:cs="Consolas"/>
           <w:color w:val="000000"/>
         </w:rPr>
-        <w:t>error=0</w:t>
+        <w:t>src_b1_hash</w:t>
       </w:r>
       <w:r>
         <w:rPr>
@@ -14634,14 +14854,14 @@
           <w:b w:val="0"/>
           <w:color w:val="000000"/>
         </w:rPr>
-        <w:t xml:space="preserve"> 和完整输出，并把已知首错从 tail/stage hash 前移到 </w:t>
+        <w:t>：</w:t>
       </w:r>
       <w:r>
         <w:rPr>
           <w:rFonts w:ascii="Consolas" w:hAnsi="Consolas" w:eastAsia="Microsoft YaHei" w:cs="Consolas"/>
           <w:color w:val="000000"/>
         </w:rPr>
-        <w:t>src_b1_hash</w:t>
+        <w:t>src_feat0_hash</w:t>
       </w:r>
       <w:r>
         <w:rPr>
@@ -14649,14 +14869,14 @@
           <w:b w:val="0"/>
           <w:color w:val="000000"/>
         </w:rPr>
-        <w:t>：</w:t>
+        <w:t xml:space="preserve"> 已与 RTL 匹配，</w:t>
       </w:r>
       <w:r>
         <w:rPr>
           <w:rFonts w:ascii="Consolas" w:hAnsi="Consolas" w:eastAsia="Microsoft YaHei" w:cs="Consolas"/>
           <w:color w:val="000000"/>
         </w:rPr>
-        <w:t>src_feat0_hash</w:t>
+        <w:t>src_b1_hash</w:t>
       </w:r>
       <w:r>
         <w:rPr>
@@ -14664,37 +14884,7 @@
           <w:b w:val="0"/>
           <w:color w:val="000000"/>
         </w:rPr>
-        <w:t xml:space="preserve"> 已与 RTL 匹配，</w:t>
-      </w:r>
-      <w:r>
-        <w:rPr>
-          <w:rFonts w:ascii="Consolas" w:hAnsi="Consolas" w:eastAsia="Microsoft YaHei" w:cs="Consolas"/>
-          <w:color w:val="000000"/>
-        </w:rPr>
-        <w:t>src_b1_hash</w:t>
-      </w:r>
-      <w:r>
-        <w:rPr>
-          <w:rFonts w:ascii="Microsoft YaHei" w:hAnsi="Microsoft YaHei" w:eastAsia="Microsoft YaHei" w:cs="Microsoft YaHei"/>
-          <w:b w:val="0"/>
-          <w:color w:val="000000"/>
-        </w:rPr>
-        <w:t xml:space="preserve"> 仍不匹配。后续应继续拆 SPAB block1 内部输出和 feature buffer/replay 到 </w:t>
-      </w:r>
-      <w:r>
-        <w:rPr>
-          <w:rFonts w:ascii="Consolas" w:hAnsi="Consolas" w:eastAsia="Microsoft YaHei" w:cs="Consolas"/>
-          <w:color w:val="000000"/>
-        </w:rPr>
-        <w:t>src_b1</w:t>
-      </w:r>
-      <w:r>
-        <w:rPr>
-          <w:rFonts w:ascii="Microsoft YaHei" w:hAnsi="Microsoft YaHei" w:eastAsia="Microsoft YaHei" w:cs="Microsoft YaHei"/>
-          <w:b w:val="0"/>
-          <w:color w:val="000000"/>
-        </w:rPr>
-        <w:t xml:space="preserve"> 的边界，并逐步补齐 32x32、64x64、720p x4 和 720p x2 board validation。</w:t>
+        <w:t xml:space="preserve"> 仍不匹配。最新 dbg5/count-view 显示 block1 仅 C1 有部分计数，C2/C3/attention 为 0，下一步应查 SPAB block1 C1-&gt;C2 ready/valid 和 feature replay ready/valid，并逐步补齐 32x32、64x64、720p x4 和 720p x2 board validation。</w:t>
       </w:r>
     </w:p>
     <w:p>

</xml_diff>

<commit_message>
Refresh contest report with latest A5 evidence
</commit_message>
<xml_diff>
--- a/W8A12_3lane/output/docx/W8A12_3lane_contest_submission_report.docx
+++ b/W8A12_3lane/output/docx/W8A12_3lane_contest_submission_report.docx
@@ -179,7 +179,7 @@
           <w:color w:val="000000"/>
           <w:sz w:val="20"/>
         </w:rPr>
-        <w:t>后续补齐方式：恢复 JTAG 后先完成 dbg2 source-boundary true2x2 验收，再依次补 A5 32x32、A6 64x64、A7 720p x4 和 x2 720p 上板报告；每个报告必须包含 bitstream、资源、时序、功耗/latency/FPS、board output、fixed reference 和 PSNR/SSIM 对比。</w:t>
+        <w:t>后续补齐方式：在已恢复的 JTAG/PSU/DDR 输入链路上继续拆 SPAB block1 C1-&gt;C2 或 feature replay ready/valid 边界；随后依次补 A5 32x32、A6 64x64、A7 720p x4 和 x2 720p 上板报告。每个报告必须包含 bitstream、资源、时序、功耗/latency/FPS、board output、fixed reference 和 PSNR/SSIM 对比。</w:t>
       </w:r>
     </w:p>
     <w:p>
@@ -10923,6 +10923,88 @@
           <w:color w:val="000000"/>
           <w:sz w:val="20"/>
         </w:rPr>
+        <w:t xml:space="preserve">最新 A5 32x32 attempt 已补入 </w:t>
+      </w:r>
+      <w:r>
+        <w:rPr>
+          <w:rFonts w:ascii="Consolas" w:hAnsi="Consolas" w:eastAsia="Microsoft YaHei" w:cs="Consolas"/>
+          <w:color w:val="000000"/>
+          <w:sz w:val="20"/>
+        </w:rPr>
+        <w:t>evidence/board_reports/a5_32x32_attempt/attempt_summary.md</w:t>
+      </w:r>
+      <w:r>
+        <w:rPr>
+          <w:rFonts w:ascii="Microsoft YaHei" w:hAnsi="Microsoft YaHei" w:eastAsia="Microsoft YaHei" w:cs="Microsoft YaHei"/>
+          <w:b w:val="0"/>
+          <w:color w:val="000000"/>
+          <w:sz w:val="20"/>
+        </w:rPr>
+        <w:t>：software reference PASS，bitstream program PASS，资源门限 PASS，DDR input verify mismatch=0；但 XSCT 等待超时，</w:t>
+      </w:r>
+      <w:r>
+        <w:rPr>
+          <w:rFonts w:ascii="Consolas" w:hAnsi="Consolas" w:eastAsia="Microsoft YaHei" w:cs="Consolas"/>
+          <w:color w:val="000000"/>
+          <w:sz w:val="20"/>
+        </w:rPr>
+        <w:t>frame_done=0</w:t>
+      </w:r>
+      <w:r>
+        <w:rPr>
+          <w:rFonts w:ascii="Microsoft YaHei" w:hAnsi="Microsoft YaHei" w:eastAsia="Microsoft YaHei" w:cs="Microsoft YaHei"/>
+          <w:b w:val="0"/>
+          <w:color w:val="000000"/>
+          <w:sz w:val="20"/>
+        </w:rPr>
+        <w:t>、</w:t>
+      </w:r>
+      <w:r>
+        <w:rPr>
+          <w:rFonts w:ascii="Consolas" w:hAnsi="Consolas" w:eastAsia="Microsoft YaHei" w:cs="Consolas"/>
+          <w:color w:val="000000"/>
+          <w:sz w:val="20"/>
+        </w:rPr>
+        <w:t>output_read_pixels=0</w:t>
+      </w:r>
+      <w:r>
+        <w:rPr>
+          <w:rFonts w:ascii="Microsoft YaHei" w:hAnsi="Microsoft YaHei" w:eastAsia="Microsoft YaHei" w:cs="Microsoft YaHei"/>
+          <w:b w:val="0"/>
+          <w:color w:val="000000"/>
+          <w:sz w:val="20"/>
+        </w:rPr>
+        <w:t>、</w:t>
+      </w:r>
+      <w:r>
+        <w:rPr>
+          <w:rFonts w:ascii="Consolas" w:hAnsi="Consolas" w:eastAsia="Microsoft YaHei" w:cs="Consolas"/>
+          <w:color w:val="000000"/>
+          <w:sz w:val="20"/>
+        </w:rPr>
+        <w:t>rgb_output_count=0</w:t>
+      </w:r>
+      <w:r>
+        <w:rPr>
+          <w:rFonts w:ascii="Microsoft YaHei" w:hAnsi="Microsoft YaHei" w:eastAsia="Microsoft YaHei" w:cs="Microsoft YaHei"/>
+          <w:b w:val="0"/>
+          <w:color w:val="000000"/>
+          <w:sz w:val="20"/>
+        </w:rPr>
+        <w:t>、AXI write fire=0。该结果证明失败不在 Python reference、板卡连接或 DDR 输入写入，而是在 PL compute completion/writeback 路径。</w:t>
+      </w:r>
+    </w:p>
+    <w:p>
+      <w:pPr>
+        <w:pStyle w:val="ListBullet"/>
+      </w:pPr>
+      <w:r>
+        <w:rPr>
+          <w:rFonts w:ascii="Microsoft YaHei" w:hAnsi="Microsoft YaHei" w:eastAsia="Microsoft YaHei" w:cs="Microsoft YaHei"/>
+          <w:b w:val="0"/>
+          <w:color w:val="000000"/>
+          <w:sz w:val="20"/>
+        </w:rPr>
         <w:t>32x32/64x64/720p x4 和 720p x2 board validation 均待补。</w:t>
       </w:r>
     </w:p>
@@ -14884,7 +14966,22 @@
           <w:b w:val="0"/>
           <w:color w:val="000000"/>
         </w:rPr>
-        <w:t xml:space="preserve"> 仍不匹配。最新 dbg5/count-view 显示 block1 仅 C1 有部分计数，C2/C3/attention 为 0，下一步应查 SPAB block1 C1-&gt;C2 ready/valid 和 feature replay ready/valid，并逐步补齐 32x32、64x64、720p x4 和 720p x2 board validation。</w:t>
+        <w:t xml:space="preserve"> 仍不匹配。最新 dbg5/count-view 显示 block1 仅 C1 有部分计数，C2/C3/attention 为 0；最新 A5 32x32 attempt 也在 reference/program/DDR 输入均通过后停在 </w:t>
+      </w:r>
+      <w:r>
+        <w:rPr>
+          <w:rFonts w:ascii="Consolas" w:hAnsi="Consolas" w:eastAsia="Microsoft YaHei" w:cs="Consolas"/>
+          <w:color w:val="000000"/>
+        </w:rPr>
+        <w:t>frame_done=0/output_read_pixels=0</w:t>
+      </w:r>
+      <w:r>
+        <w:rPr>
+          <w:rFonts w:ascii="Microsoft YaHei" w:hAnsi="Microsoft YaHei" w:eastAsia="Microsoft YaHei" w:cs="Microsoft YaHei"/>
+          <w:b w:val="0"/>
+          <w:color w:val="000000"/>
+        </w:rPr>
+        <w:t>。下一步应查 SPAB block1 C1-&gt;C2 ready/valid 和 feature replay ready/valid，并逐步补齐 32x32、64x64、720p x4 和 720p x2 board validation。</w:t>
       </w:r>
     </w:p>
     <w:p>

</xml_diff>

<commit_message>
Update report BRAM accounting evidence
</commit_message>
<xml_diff>
--- a/W8A12_3lane/output/docx/W8A12_3lane_contest_submission_report.docx
+++ b/W8A12_3lane/output/docx/W8A12_3lane_contest_submission_report.docx
@@ -1403,7 +1403,7 @@
                 <w:color w:val="000000"/>
                 <w:sz w:val="16"/>
               </w:rPr>
-              <w:t>A4 3-lane scheduler 672 DSP 低于 900 DSP 规划门限；true2x2/JTAG-W8A12 implementation 为 LUT 39799、FF 116685、BRAM 311、DSP 128、WNS 12.580ns</w:t>
+              <w:t>A4 3-lane scheduler 672 DSP 低于 900 DSP 规划门限；BRAM 消耗计算已补充；true2x2/JTAG-W8A12 implementation 为 LUT 39799、FF 116685、BRAM 311、DSP 128、WNS 12.580ns</w:t>
             </w:r>
           </w:p>
         </w:tc>
@@ -5960,7 +5960,913 @@
           <w:b w:val="0"/>
           <w:color w:val="000000"/>
         </w:rPr>
-        <w:t>当前 A4 3-lane scheduler 的 DSP 使用量为 672，占 XC7Z045 门限 74.67%，低于 900 DSP 门限；LUT 占比 56.35%，FF 占比 58.61%，均低于对应门限。BRAM 为 0 是因为该 OOC 统计对象是计算 scheduler，不包含完整 tile/frame buffer。完整 accelerator 的最终 BRAM、DDR bandwidth、power 和 board FPS 需在完整集成后重新统计。</w:t>
+        <w:t>当前 A4 3-lane scheduler 的 DSP 使用量为 672，占 XC7Z045 门限 74.67%，低于 900 DSP 门限；LUT 占比 56.35%，FF 占比 58.61%，均低于对应门限。BRAM 为 0 是因为该 OOC 统计对象是计算 scheduler，不包含完整 tile/frame buffer、权重 ROM 和非线性 LUT。</w:t>
+      </w:r>
+    </w:p>
+    <w:p>
+      <w:r>
+        <w:rPr>
+          <w:rFonts w:ascii="Microsoft YaHei" w:hAnsi="Microsoft YaHei" w:eastAsia="Microsoft YaHei" w:cs="Microsoft YaHei"/>
+          <w:b w:val="0"/>
+          <w:color w:val="000000"/>
+        </w:rPr>
+        <w:t xml:space="preserve">为避免把“计算 scheduler OOC 资源”和“完整 tile/frame buffer 存储”混在一起，本工程新增 BRAM accounting 证据，见 </w:t>
+      </w:r>
+      <w:r>
+        <w:rPr>
+          <w:rFonts w:ascii="Consolas" w:hAnsi="Consolas" w:eastAsia="Microsoft YaHei" w:cs="Consolas"/>
+          <w:color w:val="000000"/>
+        </w:rPr>
+        <w:t>evidence/resource/bram_accounting/summary.md</w:t>
+      </w:r>
+      <w:r>
+        <w:rPr>
+          <w:rFonts w:ascii="Microsoft YaHei" w:hAnsi="Microsoft YaHei" w:eastAsia="Microsoft YaHei" w:cs="Microsoft YaHei"/>
+          <w:b w:val="0"/>
+          <w:color w:val="000000"/>
+        </w:rPr>
+        <w:t>。该证据按 BRAM36=</w:t>
+      </w:r>
+      <w:r>
+        <w:rPr>
+          <w:rFonts w:ascii="Consolas" w:hAnsi="Consolas" w:eastAsia="Microsoft YaHei" w:cs="Consolas"/>
+          <w:color w:val="000000"/>
+        </w:rPr>
+        <w:t>36864 bit</w:t>
+      </w:r>
+      <w:r>
+        <w:rPr>
+          <w:rFonts w:ascii="Microsoft YaHei" w:hAnsi="Microsoft YaHei" w:eastAsia="Microsoft YaHei" w:cs="Microsoft YaHei"/>
+          <w:b w:val="0"/>
+          <w:color w:val="000000"/>
+        </w:rPr>
+        <w:t>、XC7Z045/ZC706 等效门限=</w:t>
+      </w:r>
+      <w:r>
+        <w:rPr>
+          <w:rFonts w:ascii="Consolas" w:hAnsi="Consolas" w:eastAsia="Microsoft YaHei" w:cs="Consolas"/>
+          <w:color w:val="000000"/>
+        </w:rPr>
+        <w:t>545 BRAM tile</w:t>
+      </w:r>
+      <w:r>
+        <w:rPr>
+          <w:rFonts w:ascii="Microsoft YaHei" w:hAnsi="Microsoft YaHei" w:eastAsia="Microsoft YaHei" w:cs="Microsoft YaHei"/>
+          <w:b w:val="0"/>
+          <w:color w:val="000000"/>
+        </w:rPr>
+        <w:t xml:space="preserve"> 统计，分为模型常量逻辑下限、32x32 tile buffer 理论下限和 Vivado 实际资源三类口径：</w:t>
+      </w:r>
+    </w:p>
+    <w:tbl>
+      <w:tblPr>
+        <w:tblStyle w:val="TableGrid"/>
+        <w:tblW w:type="dxa" w:w="9360"/>
+        <w:jc w:val="left"/>
+        <w:tblLayout w:type="fixed"/>
+        <w:tblLook w:firstColumn="1" w:firstRow="1" w:lastColumn="0" w:lastRow="0" w:noHBand="0" w:noVBand="1" w:val="04A0"/>
+        <w:tblInd w:w="120" w:type="dxa"/>
+      </w:tblPr>
+      <w:tblGrid>
+        <w:gridCol w:w="3370"/>
+        <w:gridCol w:w="1404"/>
+        <w:gridCol w:w="1217"/>
+        <w:gridCol w:w="3369"/>
+      </w:tblGrid>
+      <w:tr>
+        <w:trPr>
+          <w:tblHeader w:val="true"/>
+        </w:trPr>
+        <w:tc>
+          <w:tcPr>
+            <w:tcW w:type="dxa" w:w="3370"/>
+            <w:tcMar>
+              <w:top w:w="80" w:type="dxa"/>
+              <w:bottom w:w="80" w:type="dxa"/>
+              <w:start w:w="120" w:type="dxa"/>
+              <w:end w:w="120" w:type="dxa"/>
+            </w:tcMar>
+            <w:vAlign w:val="center"/>
+            <w:shd w:fill="F2F2F2"/>
+          </w:tcPr>
+          <w:p>
+            <w:pPr>
+              <w:spacing w:after="0"/>
+            </w:pPr>
+            <w:r>
+              <w:rPr>
+                <w:rFonts w:ascii="Microsoft YaHei" w:hAnsi="Microsoft YaHei" w:eastAsia="Microsoft YaHei" w:cs="Microsoft YaHei"/>
+                <w:b/>
+                <w:color w:val="000000"/>
+                <w:sz w:val="16"/>
+              </w:rPr>
+              <w:t>口径</w:t>
+            </w:r>
+          </w:p>
+        </w:tc>
+        <w:tc>
+          <w:tcPr>
+            <w:tcW w:type="dxa" w:w="1404"/>
+            <w:tcMar>
+              <w:top w:w="80" w:type="dxa"/>
+              <w:bottom w:w="80" w:type="dxa"/>
+              <w:start w:w="120" w:type="dxa"/>
+              <w:end w:w="120" w:type="dxa"/>
+            </w:tcMar>
+            <w:vAlign w:val="center"/>
+            <w:shd w:fill="F2F2F2"/>
+          </w:tcPr>
+          <w:p>
+            <w:pPr>
+              <w:spacing w:after="0"/>
+            </w:pPr>
+            <w:r>
+              <w:rPr>
+                <w:rFonts w:ascii="Microsoft YaHei" w:hAnsi="Microsoft YaHei" w:eastAsia="Microsoft YaHei" w:cs="Microsoft YaHei"/>
+                <w:b/>
+                <w:color w:val="000000"/>
+                <w:sz w:val="16"/>
+              </w:rPr>
+              <w:t>x4 W8A12/F48</w:t>
+            </w:r>
+          </w:p>
+        </w:tc>
+        <w:tc>
+          <w:tcPr>
+            <w:tcW w:type="dxa" w:w="1217"/>
+            <w:tcMar>
+              <w:top w:w="80" w:type="dxa"/>
+              <w:bottom w:w="80" w:type="dxa"/>
+              <w:start w:w="120" w:type="dxa"/>
+              <w:end w:w="120" w:type="dxa"/>
+            </w:tcMar>
+            <w:vAlign w:val="center"/>
+            <w:shd w:fill="F2F2F2"/>
+          </w:tcPr>
+          <w:p>
+            <w:pPr>
+              <w:spacing w:after="0"/>
+            </w:pPr>
+            <w:r>
+              <w:rPr>
+                <w:rFonts w:ascii="Microsoft YaHei" w:hAnsi="Microsoft YaHei" w:eastAsia="Microsoft YaHei" w:cs="Microsoft YaHei"/>
+                <w:b/>
+                <w:color w:val="000000"/>
+                <w:sz w:val="16"/>
+              </w:rPr>
+              <w:t>x2 W8A12/F48</w:t>
+            </w:r>
+          </w:p>
+        </w:tc>
+        <w:tc>
+          <w:tcPr>
+            <w:tcW w:type="dxa" w:w="3369"/>
+            <w:tcMar>
+              <w:top w:w="80" w:type="dxa"/>
+              <w:bottom w:w="80" w:type="dxa"/>
+              <w:start w:w="120" w:type="dxa"/>
+              <w:end w:w="120" w:type="dxa"/>
+            </w:tcMar>
+            <w:vAlign w:val="center"/>
+            <w:shd w:fill="F2F2F2"/>
+          </w:tcPr>
+          <w:p>
+            <w:pPr>
+              <w:spacing w:after="0"/>
+            </w:pPr>
+            <w:r>
+              <w:rPr>
+                <w:rFonts w:ascii="Microsoft YaHei" w:hAnsi="Microsoft YaHei" w:eastAsia="Microsoft YaHei" w:cs="Microsoft YaHei"/>
+                <w:b/>
+                <w:color w:val="000000"/>
+                <w:sz w:val="16"/>
+              </w:rPr>
+              <w:t>说明</w:t>
+            </w:r>
+          </w:p>
+        </w:tc>
+      </w:tr>
+      <w:tr>
+        <w:tc>
+          <w:tcPr>
+            <w:tcW w:type="dxa" w:w="3370"/>
+            <w:tcMar>
+              <w:top w:w="80" w:type="dxa"/>
+              <w:bottom w:w="80" w:type="dxa"/>
+              <w:start w:w="120" w:type="dxa"/>
+              <w:end w:w="120" w:type="dxa"/>
+            </w:tcMar>
+            <w:vAlign w:val="center"/>
+          </w:tcPr>
+          <w:p>
+            <w:pPr>
+              <w:spacing w:after="0"/>
+            </w:pPr>
+            <w:r>
+              <w:rPr>
+                <w:rFonts w:ascii="Microsoft YaHei" w:hAnsi="Microsoft YaHei" w:eastAsia="Microsoft YaHei" w:cs="Microsoft YaHei"/>
+                <w:b w:val="0"/>
+                <w:color w:val="000000"/>
+                <w:sz w:val="16"/>
+              </w:rPr>
+              <w:t>模型常量存储下限</w:t>
+            </w:r>
+          </w:p>
+        </w:tc>
+        <w:tc>
+          <w:tcPr>
+            <w:tcW w:type="dxa" w:w="1404"/>
+            <w:tcMar>
+              <w:top w:w="80" w:type="dxa"/>
+              <w:bottom w:w="80" w:type="dxa"/>
+              <w:start w:w="120" w:type="dxa"/>
+              <w:end w:w="120" w:type="dxa"/>
+            </w:tcMar>
+            <w:vAlign w:val="center"/>
+          </w:tcPr>
+          <w:p>
+            <w:pPr>
+              <w:spacing w:after="0"/>
+            </w:pPr>
+            <w:r>
+              <w:rPr>
+                <w:rFonts w:ascii="Microsoft YaHei" w:hAnsi="Microsoft YaHei" w:eastAsia="Microsoft YaHei" w:cs="Microsoft YaHei"/>
+                <w:b w:val="0"/>
+                <w:color w:val="000000"/>
+                <w:sz w:val="16"/>
+              </w:rPr>
+              <w:t>119.32 BRAM36</w:t>
+            </w:r>
+          </w:p>
+        </w:tc>
+        <w:tc>
+          <w:tcPr>
+            <w:tcW w:type="dxa" w:w="1217"/>
+            <w:tcMar>
+              <w:top w:w="80" w:type="dxa"/>
+              <w:bottom w:w="80" w:type="dxa"/>
+              <w:start w:w="120" w:type="dxa"/>
+              <w:end w:w="120" w:type="dxa"/>
+            </w:tcMar>
+            <w:vAlign w:val="center"/>
+          </w:tcPr>
+          <w:p>
+            <w:pPr>
+              <w:spacing w:after="0"/>
+            </w:pPr>
+            <w:r>
+              <w:rPr>
+                <w:rFonts w:ascii="Microsoft YaHei" w:hAnsi="Microsoft YaHei" w:eastAsia="Microsoft YaHei" w:cs="Microsoft YaHei"/>
+                <w:b w:val="0"/>
+                <w:color w:val="000000"/>
+                <w:sz w:val="16"/>
+              </w:rPr>
+              <w:t>115.84 BRAM36</w:t>
+            </w:r>
+          </w:p>
+        </w:tc>
+        <w:tc>
+          <w:tcPr>
+            <w:tcW w:type="dxa" w:w="3369"/>
+            <w:tcMar>
+              <w:top w:w="80" w:type="dxa"/>
+              <w:bottom w:w="80" w:type="dxa"/>
+              <w:start w:w="120" w:type="dxa"/>
+              <w:end w:w="120" w:type="dxa"/>
+            </w:tcMar>
+            <w:vAlign w:val="center"/>
+          </w:tcPr>
+          <w:p>
+            <w:pPr>
+              <w:spacing w:after="0"/>
+            </w:pPr>
+            <w:r>
+              <w:rPr>
+                <w:rFonts w:ascii="Microsoft YaHei" w:hAnsi="Microsoft YaHei" w:eastAsia="Microsoft YaHei" w:cs="Microsoft YaHei"/>
+                <w:b w:val="0"/>
+                <w:color w:val="000000"/>
+                <w:sz w:val="16"/>
+              </w:rPr>
+              <w:t>unique weight/bias/requant/LUT，不重复统计 raw/grouped 多视图导出文件</w:t>
+            </w:r>
+          </w:p>
+        </w:tc>
+      </w:tr>
+      <w:tr>
+        <w:tc>
+          <w:tcPr>
+            <w:tcW w:type="dxa" w:w="3370"/>
+            <w:tcMar>
+              <w:top w:w="80" w:type="dxa"/>
+              <w:bottom w:w="80" w:type="dxa"/>
+              <w:start w:w="120" w:type="dxa"/>
+              <w:end w:w="120" w:type="dxa"/>
+            </w:tcMar>
+            <w:vAlign w:val="center"/>
+          </w:tcPr>
+          <w:p>
+            <w:pPr>
+              <w:spacing w:after="0"/>
+            </w:pPr>
+            <w:r>
+              <w:rPr>
+                <w:rFonts w:ascii="Microsoft YaHei" w:hAnsi="Microsoft YaHei" w:eastAsia="Microsoft YaHei" w:cs="Microsoft YaHei"/>
+                <w:b w:val="0"/>
+                <w:color w:val="000000"/>
+                <w:sz w:val="16"/>
+              </w:rPr>
+              <w:t>32x32 tile buffer 下限</w:t>
+            </w:r>
+          </w:p>
+        </w:tc>
+        <w:tc>
+          <w:tcPr>
+            <w:tcW w:type="dxa" w:w="1404"/>
+            <w:tcMar>
+              <w:top w:w="80" w:type="dxa"/>
+              <w:bottom w:w="80" w:type="dxa"/>
+              <w:start w:w="120" w:type="dxa"/>
+              <w:end w:w="120" w:type="dxa"/>
+            </w:tcMar>
+            <w:vAlign w:val="center"/>
+          </w:tcPr>
+          <w:p>
+            <w:pPr>
+              <w:spacing w:after="0"/>
+            </w:pPr>
+            <w:r>
+              <w:rPr>
+                <w:rFonts w:ascii="Microsoft YaHei" w:hAnsi="Microsoft YaHei" w:eastAsia="Microsoft YaHei" w:cs="Microsoft YaHei"/>
+                <w:b w:val="0"/>
+                <w:color w:val="000000"/>
+                <w:sz w:val="16"/>
+              </w:rPr>
+              <w:t>142.23 BRAM36</w:t>
+            </w:r>
+          </w:p>
+        </w:tc>
+        <w:tc>
+          <w:tcPr>
+            <w:tcW w:type="dxa" w:w="1217"/>
+            <w:tcMar>
+              <w:top w:w="80" w:type="dxa"/>
+              <w:bottom w:w="80" w:type="dxa"/>
+              <w:start w:w="120" w:type="dxa"/>
+              <w:end w:w="120" w:type="dxa"/>
+            </w:tcMar>
+            <w:vAlign w:val="center"/>
+          </w:tcPr>
+          <w:p>
+            <w:pPr>
+              <w:spacing w:after="0"/>
+            </w:pPr>
+            <w:r>
+              <w:rPr>
+                <w:rFonts w:ascii="Microsoft YaHei" w:hAnsi="Microsoft YaHei" w:eastAsia="Microsoft YaHei" w:cs="Microsoft YaHei"/>
+                <w:b w:val="0"/>
+                <w:color w:val="000000"/>
+                <w:sz w:val="16"/>
+              </w:rPr>
+              <w:t>134.23 BRAM36</w:t>
+            </w:r>
+          </w:p>
+        </w:tc>
+        <w:tc>
+          <w:tcPr>
+            <w:tcW w:type="dxa" w:w="3369"/>
+            <w:tcMar>
+              <w:top w:w="80" w:type="dxa"/>
+              <w:bottom w:w="80" w:type="dxa"/>
+              <w:start w:w="120" w:type="dxa"/>
+              <w:end w:w="120" w:type="dxa"/>
+            </w:tcMar>
+            <w:vAlign w:val="center"/>
+          </w:tcPr>
+          <w:p>
+            <w:pPr>
+              <w:spacing w:after="0"/>
+            </w:pPr>
+            <w:r>
+              <w:rPr>
+                <w:rFonts w:ascii="Consolas" w:hAnsi="Consolas" w:eastAsia="Microsoft YaHei" w:cs="Consolas"/>
+                <w:color w:val="000000"/>
+                <w:sz w:val="16"/>
+              </w:rPr>
+              <w:t>halo=21</w:t>
+            </w:r>
+            <w:r>
+              <w:rPr>
+                <w:rFonts w:ascii="Microsoft YaHei" w:hAnsi="Microsoft YaHei" w:eastAsia="Microsoft YaHei" w:cs="Microsoft YaHei"/>
+                <w:b w:val="0"/>
+                <w:color w:val="000000"/>
+                <w:sz w:val="16"/>
+              </w:rPr>
+              <w:t>、8 个 48ch/12-bit feature buffer、SR RGB output tile</w:t>
+            </w:r>
+          </w:p>
+        </w:tc>
+      </w:tr>
+      <w:tr>
+        <w:tc>
+          <w:tcPr>
+            <w:tcW w:type="dxa" w:w="3370"/>
+            <w:tcMar>
+              <w:top w:w="80" w:type="dxa"/>
+              <w:bottom w:w="80" w:type="dxa"/>
+              <w:start w:w="120" w:type="dxa"/>
+              <w:end w:w="120" w:type="dxa"/>
+            </w:tcMar>
+            <w:vAlign w:val="center"/>
+          </w:tcPr>
+          <w:p>
+            <w:pPr>
+              <w:spacing w:after="0"/>
+            </w:pPr>
+            <w:r>
+              <w:rPr>
+                <w:rFonts w:ascii="Microsoft YaHei" w:hAnsi="Microsoft YaHei" w:eastAsia="Microsoft YaHei" w:cs="Microsoft YaHei"/>
+                <w:b w:val="0"/>
+                <w:color w:val="000000"/>
+                <w:sz w:val="16"/>
+              </w:rPr>
+              <w:t>true2x2/JTAG-W8A12 dbg5 implementation</w:t>
+            </w:r>
+          </w:p>
+        </w:tc>
+        <w:tc>
+          <w:tcPr>
+            <w:tcW w:type="dxa" w:w="1404"/>
+            <w:tcMar>
+              <w:top w:w="80" w:type="dxa"/>
+              <w:bottom w:w="80" w:type="dxa"/>
+              <w:start w:w="120" w:type="dxa"/>
+              <w:end w:w="120" w:type="dxa"/>
+            </w:tcMar>
+            <w:vAlign w:val="center"/>
+          </w:tcPr>
+          <w:p>
+            <w:pPr>
+              <w:spacing w:after="0"/>
+            </w:pPr>
+            <w:r>
+              <w:rPr>
+                <w:rFonts w:ascii="Microsoft YaHei" w:hAnsi="Microsoft YaHei" w:eastAsia="Microsoft YaHei" w:cs="Microsoft YaHei"/>
+                <w:b w:val="0"/>
+                <w:color w:val="000000"/>
+                <w:sz w:val="16"/>
+              </w:rPr>
+              <w:t>311 BRAM tile</w:t>
+            </w:r>
+          </w:p>
+        </w:tc>
+        <w:tc>
+          <w:tcPr>
+            <w:tcW w:type="dxa" w:w="1217"/>
+            <w:tcMar>
+              <w:top w:w="80" w:type="dxa"/>
+              <w:bottom w:w="80" w:type="dxa"/>
+              <w:start w:w="120" w:type="dxa"/>
+              <w:end w:w="120" w:type="dxa"/>
+            </w:tcMar>
+            <w:vAlign w:val="center"/>
+          </w:tcPr>
+          <w:p>
+            <w:pPr>
+              <w:spacing w:after="0"/>
+            </w:pPr>
+            <w:r>
+              <w:rPr>
+                <w:rFonts w:ascii="Microsoft YaHei" w:hAnsi="Microsoft YaHei" w:eastAsia="Microsoft YaHei" w:cs="Microsoft YaHei"/>
+                <w:b w:val="0"/>
+                <w:color w:val="000000"/>
+                <w:sz w:val="16"/>
+              </w:rPr>
+              <w:t>不适用</w:t>
+            </w:r>
+          </w:p>
+        </w:tc>
+        <w:tc>
+          <w:tcPr>
+            <w:tcW w:type="dxa" w:w="3369"/>
+            <w:tcMar>
+              <w:top w:w="80" w:type="dxa"/>
+              <w:bottom w:w="80" w:type="dxa"/>
+              <w:start w:w="120" w:type="dxa"/>
+              <w:end w:w="120" w:type="dxa"/>
+            </w:tcMar>
+            <w:vAlign w:val="center"/>
+          </w:tcPr>
+          <w:p>
+            <w:pPr>
+              <w:spacing w:after="0"/>
+            </w:pPr>
+            <w:r>
+              <w:rPr>
+                <w:rFonts w:ascii="Microsoft YaHei" w:hAnsi="Microsoft YaHei" w:eastAsia="Microsoft YaHei" w:cs="Microsoft YaHei"/>
+                <w:b w:val="0"/>
+                <w:color w:val="000000"/>
+                <w:sz w:val="16"/>
+              </w:rPr>
+              <w:t>已生成 bitstream，作为当前 PPA 提交口径</w:t>
+            </w:r>
+          </w:p>
+        </w:tc>
+      </w:tr>
+      <w:tr>
+        <w:tc>
+          <w:tcPr>
+            <w:tcW w:type="dxa" w:w="3370"/>
+            <w:tcMar>
+              <w:top w:w="80" w:type="dxa"/>
+              <w:bottom w:w="80" w:type="dxa"/>
+              <w:start w:w="120" w:type="dxa"/>
+              <w:end w:w="120" w:type="dxa"/>
+            </w:tcMar>
+            <w:vAlign w:val="center"/>
+          </w:tcPr>
+          <w:p>
+            <w:pPr>
+              <w:spacing w:after="0"/>
+            </w:pPr>
+            <w:r>
+              <w:rPr>
+                <w:rFonts w:ascii="Microsoft YaHei" w:hAnsi="Microsoft YaHei" w:eastAsia="Microsoft YaHei" w:cs="Microsoft YaHei"/>
+                <w:b w:val="0"/>
+                <w:color w:val="000000"/>
+                <w:sz w:val="16"/>
+              </w:rPr>
+              <w:t>true2x2/JTAG-W8A12 dbg6 synth snapshot</w:t>
+            </w:r>
+          </w:p>
+        </w:tc>
+        <w:tc>
+          <w:tcPr>
+            <w:tcW w:type="dxa" w:w="1404"/>
+            <w:tcMar>
+              <w:top w:w="80" w:type="dxa"/>
+              <w:bottom w:w="80" w:type="dxa"/>
+              <w:start w:w="120" w:type="dxa"/>
+              <w:end w:w="120" w:type="dxa"/>
+            </w:tcMar>
+            <w:vAlign w:val="center"/>
+          </w:tcPr>
+          <w:p>
+            <w:pPr>
+              <w:spacing w:after="0"/>
+            </w:pPr>
+            <w:r>
+              <w:rPr>
+                <w:rFonts w:ascii="Microsoft YaHei" w:hAnsi="Microsoft YaHei" w:eastAsia="Microsoft YaHei" w:cs="Microsoft YaHei"/>
+                <w:b w:val="0"/>
+                <w:color w:val="000000"/>
+                <w:sz w:val="16"/>
+              </w:rPr>
+              <w:t>311 BRAM tile</w:t>
+            </w:r>
+          </w:p>
+        </w:tc>
+        <w:tc>
+          <w:tcPr>
+            <w:tcW w:type="dxa" w:w="1217"/>
+            <w:tcMar>
+              <w:top w:w="80" w:type="dxa"/>
+              <w:bottom w:w="80" w:type="dxa"/>
+              <w:start w:w="120" w:type="dxa"/>
+              <w:end w:w="120" w:type="dxa"/>
+            </w:tcMar>
+            <w:vAlign w:val="center"/>
+          </w:tcPr>
+          <w:p>
+            <w:pPr>
+              <w:spacing w:after="0"/>
+            </w:pPr>
+            <w:r>
+              <w:rPr>
+                <w:rFonts w:ascii="Microsoft YaHei" w:hAnsi="Microsoft YaHei" w:eastAsia="Microsoft YaHei" w:cs="Microsoft YaHei"/>
+                <w:b w:val="0"/>
+                <w:color w:val="000000"/>
+                <w:sz w:val="16"/>
+              </w:rPr>
+              <w:t>不适用</w:t>
+            </w:r>
+          </w:p>
+        </w:tc>
+        <w:tc>
+          <w:tcPr>
+            <w:tcW w:type="dxa" w:w="3369"/>
+            <w:tcMar>
+              <w:top w:w="80" w:type="dxa"/>
+              <w:bottom w:w="80" w:type="dxa"/>
+              <w:start w:w="120" w:type="dxa"/>
+              <w:end w:w="120" w:type="dxa"/>
+            </w:tcMar>
+            <w:vAlign w:val="center"/>
+          </w:tcPr>
+          <w:p>
+            <w:pPr>
+              <w:spacing w:after="0"/>
+            </w:pPr>
+            <w:r>
+              <w:rPr>
+                <w:rFonts w:ascii="Microsoft YaHei" w:hAnsi="Microsoft YaHei" w:eastAsia="Microsoft YaHei" w:cs="Microsoft YaHei"/>
+                <w:b w:val="0"/>
+                <w:color w:val="000000"/>
+                <w:sz w:val="16"/>
+              </w:rPr>
+              <w:t>已综合到 synth/opt checkpoint，未生成 dbg6 bitstream</w:t>
+            </w:r>
+          </w:p>
+        </w:tc>
+      </w:tr>
+      <w:tr>
+        <w:tc>
+          <w:tcPr>
+            <w:tcW w:type="dxa" w:w="3370"/>
+            <w:tcMar>
+              <w:top w:w="80" w:type="dxa"/>
+              <w:bottom w:w="80" w:type="dxa"/>
+              <w:start w:w="120" w:type="dxa"/>
+              <w:end w:w="120" w:type="dxa"/>
+            </w:tcMar>
+            <w:vAlign w:val="center"/>
+          </w:tcPr>
+          <w:p>
+            <w:pPr>
+              <w:spacing w:after="0"/>
+            </w:pPr>
+            <w:r>
+              <w:rPr>
+                <w:rFonts w:ascii="Microsoft YaHei" w:hAnsi="Microsoft YaHei" w:eastAsia="Microsoft YaHei" w:cs="Microsoft YaHei"/>
+                <w:b w:val="0"/>
+                <w:color w:val="000000"/>
+                <w:sz w:val="16"/>
+              </w:rPr>
+              <w:t>A5 32x32 PS-DDR tile-writer attempt</w:t>
+            </w:r>
+          </w:p>
+        </w:tc>
+        <w:tc>
+          <w:tcPr>
+            <w:tcW w:type="dxa" w:w="1404"/>
+            <w:tcMar>
+              <w:top w:w="80" w:type="dxa"/>
+              <w:bottom w:w="80" w:type="dxa"/>
+              <w:start w:w="120" w:type="dxa"/>
+              <w:end w:w="120" w:type="dxa"/>
+            </w:tcMar>
+            <w:vAlign w:val="center"/>
+          </w:tcPr>
+          <w:p>
+            <w:pPr>
+              <w:spacing w:after="0"/>
+            </w:pPr>
+            <w:r>
+              <w:rPr>
+                <w:rFonts w:ascii="Microsoft YaHei" w:hAnsi="Microsoft YaHei" w:eastAsia="Microsoft YaHei" w:cs="Microsoft YaHei"/>
+                <w:b w:val="0"/>
+                <w:color w:val="000000"/>
+                <w:sz w:val="16"/>
+              </w:rPr>
+              <w:t>415.5 BRAM tile</w:t>
+            </w:r>
+          </w:p>
+        </w:tc>
+        <w:tc>
+          <w:tcPr>
+            <w:tcW w:type="dxa" w:w="1217"/>
+            <w:tcMar>
+              <w:top w:w="80" w:type="dxa"/>
+              <w:bottom w:w="80" w:type="dxa"/>
+              <w:start w:w="120" w:type="dxa"/>
+              <w:end w:w="120" w:type="dxa"/>
+            </w:tcMar>
+            <w:vAlign w:val="center"/>
+          </w:tcPr>
+          <w:p>
+            <w:pPr>
+              <w:spacing w:after="0"/>
+            </w:pPr>
+            <w:r>
+              <w:rPr>
+                <w:rFonts w:ascii="Microsoft YaHei" w:hAnsi="Microsoft YaHei" w:eastAsia="Microsoft YaHei" w:cs="Microsoft YaHei"/>
+                <w:b w:val="0"/>
+                <w:color w:val="000000"/>
+                <w:sz w:val="16"/>
+              </w:rPr>
+              <w:t>不适用</w:t>
+            </w:r>
+          </w:p>
+        </w:tc>
+        <w:tc>
+          <w:tcPr>
+            <w:tcW w:type="dxa" w:w="3369"/>
+            <w:tcMar>
+              <w:top w:w="80" w:type="dxa"/>
+              <w:bottom w:w="80" w:type="dxa"/>
+              <w:start w:w="120" w:type="dxa"/>
+              <w:end w:w="120" w:type="dxa"/>
+            </w:tcMar>
+            <w:vAlign w:val="center"/>
+          </w:tcPr>
+          <w:p>
+            <w:pPr>
+              <w:spacing w:after="0"/>
+            </w:pPr>
+            <w:r>
+              <w:rPr>
+                <w:rFonts w:ascii="Microsoft YaHei" w:hAnsi="Microsoft YaHei" w:eastAsia="Microsoft YaHei" w:cs="Microsoft YaHei"/>
+                <w:b w:val="0"/>
+                <w:color w:val="000000"/>
+                <w:sz w:val="16"/>
+              </w:rPr>
+              <w:t xml:space="preserve">占 XC7Z045/ZC706 门限 76.24%，资源 PASS，但板端 </w:t>
+            </w:r>
+            <w:r>
+              <w:rPr>
+                <w:rFonts w:ascii="Consolas" w:hAnsi="Consolas" w:eastAsia="Microsoft YaHei" w:cs="Consolas"/>
+                <w:color w:val="000000"/>
+                <w:sz w:val="16"/>
+              </w:rPr>
+              <w:t>frame_done=0</w:t>
+            </w:r>
+          </w:p>
+        </w:tc>
+      </w:tr>
+      <w:tr>
+        <w:tc>
+          <w:tcPr>
+            <w:tcW w:type="dxa" w:w="3370"/>
+            <w:tcMar>
+              <w:top w:w="80" w:type="dxa"/>
+              <w:bottom w:w="80" w:type="dxa"/>
+              <w:start w:w="120" w:type="dxa"/>
+              <w:end w:w="120" w:type="dxa"/>
+            </w:tcMar>
+            <w:vAlign w:val="center"/>
+          </w:tcPr>
+          <w:p>
+            <w:pPr>
+              <w:spacing w:after="0"/>
+            </w:pPr>
+            <w:r>
+              <w:rPr>
+                <w:rFonts w:ascii="Microsoft YaHei" w:hAnsi="Microsoft YaHei" w:eastAsia="Microsoft YaHei" w:cs="Microsoft YaHei"/>
+                <w:b w:val="0"/>
+                <w:color w:val="000000"/>
+                <w:sz w:val="16"/>
+              </w:rPr>
+              <w:t>大集成压力测试</w:t>
+            </w:r>
+          </w:p>
+        </w:tc>
+        <w:tc>
+          <w:tcPr>
+            <w:tcW w:type="dxa" w:w="1404"/>
+            <w:tcMar>
+              <w:top w:w="80" w:type="dxa"/>
+              <w:bottom w:w="80" w:type="dxa"/>
+              <w:start w:w="120" w:type="dxa"/>
+              <w:end w:w="120" w:type="dxa"/>
+            </w:tcMar>
+            <w:vAlign w:val="center"/>
+          </w:tcPr>
+          <w:p>
+            <w:pPr>
+              <w:spacing w:after="0"/>
+            </w:pPr>
+            <w:r>
+              <w:rPr>
+                <w:rFonts w:ascii="Microsoft YaHei" w:hAnsi="Microsoft YaHei" w:eastAsia="Microsoft YaHei" w:cs="Microsoft YaHei"/>
+                <w:b w:val="0"/>
+                <w:color w:val="000000"/>
+                <w:sz w:val="16"/>
+              </w:rPr>
+              <w:t>619 BRAM tile</w:t>
+            </w:r>
+          </w:p>
+        </w:tc>
+        <w:tc>
+          <w:tcPr>
+            <w:tcW w:type="dxa" w:w="1217"/>
+            <w:tcMar>
+              <w:top w:w="80" w:type="dxa"/>
+              <w:bottom w:w="80" w:type="dxa"/>
+              <w:start w:w="120" w:type="dxa"/>
+              <w:end w:w="120" w:type="dxa"/>
+            </w:tcMar>
+            <w:vAlign w:val="center"/>
+          </w:tcPr>
+          <w:p>
+            <w:pPr>
+              <w:spacing w:after="0"/>
+            </w:pPr>
+            <w:r>
+              <w:rPr>
+                <w:rFonts w:ascii="Microsoft YaHei" w:hAnsi="Microsoft YaHei" w:eastAsia="Microsoft YaHei" w:cs="Microsoft YaHei"/>
+                <w:b w:val="0"/>
+                <w:color w:val="000000"/>
+                <w:sz w:val="16"/>
+              </w:rPr>
+              <w:t>不适用</w:t>
+            </w:r>
+          </w:p>
+        </w:tc>
+        <w:tc>
+          <w:tcPr>
+            <w:tcW w:type="dxa" w:w="3369"/>
+            <w:tcMar>
+              <w:top w:w="80" w:type="dxa"/>
+              <w:bottom w:w="80" w:type="dxa"/>
+              <w:start w:w="120" w:type="dxa"/>
+              <w:end w:w="120" w:type="dxa"/>
+            </w:tcMar>
+            <w:vAlign w:val="center"/>
+          </w:tcPr>
+          <w:p>
+            <w:pPr>
+              <w:spacing w:after="0"/>
+            </w:pPr>
+            <w:r>
+              <w:rPr>
+                <w:rFonts w:ascii="Microsoft YaHei" w:hAnsi="Microsoft YaHei" w:eastAsia="Microsoft YaHei" w:cs="Microsoft YaHei"/>
+                <w:b w:val="0"/>
+                <w:color w:val="000000"/>
+                <w:sz w:val="16"/>
+              </w:rPr>
+              <w:t>超过 XC7Z045/ZC706 等效门限且 route 未完成，仅作降资源风险证据</w:t>
+            </w:r>
+          </w:p>
+        </w:tc>
+      </w:tr>
+    </w:tbl>
+    <w:p>
+      <w:r>
+        <w:rPr>
+          <w:rFonts w:ascii="Microsoft YaHei" w:hAnsi="Microsoft YaHei" w:eastAsia="Microsoft YaHei" w:cs="Microsoft YaHei"/>
+          <w:b w:val="0"/>
+          <w:color w:val="000000"/>
+        </w:rPr>
+        <w:t xml:space="preserve">因此，当前可报告的 BRAM 结论是：A4 scheduler OOC 的 </w:t>
+      </w:r>
+      <w:r>
+        <w:rPr>
+          <w:rFonts w:ascii="Consolas" w:hAnsi="Consolas" w:eastAsia="Microsoft YaHei" w:cs="Consolas"/>
+          <w:color w:val="000000"/>
+        </w:rPr>
+        <w:t>BRAM=0</w:t>
+      </w:r>
+      <w:r>
+        <w:rPr>
+          <w:rFonts w:ascii="Microsoft YaHei" w:hAnsi="Microsoft YaHei" w:eastAsia="Microsoft YaHei" w:cs="Microsoft YaHei"/>
+          <w:b w:val="0"/>
+          <w:color w:val="000000"/>
+        </w:rPr>
+        <w:t xml:space="preserve"> 只说明计算调度逻辑本身不占 BRAM；x4 W8A12/F48 在 32x32 tile 下的常量+buffer 逻辑下限约为 </w:t>
+      </w:r>
+      <w:r>
+        <w:rPr>
+          <w:rFonts w:ascii="Consolas" w:hAnsi="Consolas" w:eastAsia="Microsoft YaHei" w:cs="Consolas"/>
+          <w:color w:val="000000"/>
+        </w:rPr>
+        <w:t>119.32 + 142.23 = 261.55</w:t>
+      </w:r>
+      <w:r>
+        <w:rPr>
+          <w:rFonts w:ascii="Microsoft YaHei" w:hAnsi="Microsoft YaHei" w:eastAsia="Microsoft YaHei" w:cs="Microsoft YaHei"/>
+          <w:b w:val="0"/>
+          <w:color w:val="000000"/>
+        </w:rPr>
+        <w:t xml:space="preserve"> BRAM36，真实实现会因 banking、端口、位宽对齐、FIFO、JTAG/PS 壳和调试寄存器增加到 Vivado 报告口径。当前 true2x2/JTAG-W8A12 PPA 口径为 </w:t>
+      </w:r>
+      <w:r>
+        <w:rPr>
+          <w:rFonts w:ascii="Consolas" w:hAnsi="Consolas" w:eastAsia="Microsoft YaHei" w:cs="Consolas"/>
+          <w:color w:val="000000"/>
+        </w:rPr>
+        <w:t>311 / 545 = 57.06%</w:t>
+      </w:r>
+      <w:r>
+        <w:rPr>
+          <w:rFonts w:ascii="Microsoft YaHei" w:hAnsi="Microsoft YaHei" w:eastAsia="Microsoft YaHei" w:cs="Microsoft YaHei"/>
+          <w:b w:val="0"/>
+          <w:color w:val="000000"/>
+        </w:rPr>
+        <w:t xml:space="preserve">，A5 32x32 attempt 口径为 </w:t>
+      </w:r>
+      <w:r>
+        <w:rPr>
+          <w:rFonts w:ascii="Consolas" w:hAnsi="Consolas" w:eastAsia="Microsoft YaHei" w:cs="Consolas"/>
+          <w:color w:val="000000"/>
+        </w:rPr>
+        <w:t>415.5 / 545 = 76.24%</w:t>
+      </w:r>
+      <w:r>
+        <w:rPr>
+          <w:rFonts w:ascii="Microsoft YaHei" w:hAnsi="Microsoft YaHei" w:eastAsia="Microsoft YaHei" w:cs="Microsoft YaHei"/>
+          <w:b w:val="0"/>
+          <w:color w:val="000000"/>
+        </w:rPr>
+        <w:t>，二者均未超过 XC7Z045/ZC706 等效 BRAM 门限。完整 accelerator 的 DDR bandwidth、power 和 board FPS 仍需在完整集成和真实 board validation 后重新统计。</w:t>
       </w:r>
     </w:p>
     <w:p>
@@ -11005,6 +11911,190 @@
           <w:color w:val="000000"/>
           <w:sz w:val="20"/>
         </w:rPr>
+        <w:t xml:space="preserve">最新 dbg6/C1-C2 detail 已补入 </w:t>
+      </w:r>
+      <w:r>
+        <w:rPr>
+          <w:rFonts w:ascii="Consolas" w:hAnsi="Consolas" w:eastAsia="Microsoft YaHei" w:cs="Consolas"/>
+          <w:color w:val="000000"/>
+          <w:sz w:val="20"/>
+        </w:rPr>
+        <w:t>evidence/board_reports/jtag_true2x2_dbg6_c1c2_detail_20260703/analysis.md</w:t>
+      </w:r>
+      <w:r>
+        <w:rPr>
+          <w:rFonts w:ascii="Microsoft YaHei" w:hAnsi="Microsoft YaHei" w:eastAsia="Microsoft YaHei" w:cs="Microsoft YaHei"/>
+          <w:b w:val="0"/>
+          <w:color w:val="000000"/>
+          <w:sz w:val="20"/>
+        </w:rPr>
+        <w:t xml:space="preserve">：RTL raw compare 仍为 </w:t>
+      </w:r>
+      <w:r>
+        <w:rPr>
+          <w:rFonts w:ascii="Consolas" w:hAnsi="Consolas" w:eastAsia="Microsoft YaHei" w:cs="Consolas"/>
+          <w:color w:val="000000"/>
+          <w:sz w:val="20"/>
+        </w:rPr>
+        <w:t>0/192</w:t>
+      </w:r>
+      <w:r>
+        <w:rPr>
+          <w:rFonts w:ascii="Microsoft YaHei" w:hAnsi="Microsoft YaHei" w:eastAsia="Microsoft YaHei" w:cs="Microsoft YaHei"/>
+          <w:b w:val="0"/>
+          <w:color w:val="000000"/>
+          <w:sz w:val="20"/>
+        </w:rPr>
+        <w:t xml:space="preserve"> mismatch，新增 debug bank6 的 RTL 期望值包括 </w:t>
+      </w:r>
+      <w:r>
+        <w:rPr>
+          <w:rFonts w:ascii="Consolas" w:hAnsi="Consolas" w:eastAsia="Microsoft YaHei" w:cs="Consolas"/>
+          <w:color w:val="000000"/>
+          <w:sz w:val="20"/>
+        </w:rPr>
+        <w:t>C1_DETAIL=0x0000200c</w:t>
+      </w:r>
+      <w:r>
+        <w:rPr>
+          <w:rFonts w:ascii="Microsoft YaHei" w:hAnsi="Microsoft YaHei" w:eastAsia="Microsoft YaHei" w:cs="Microsoft YaHei"/>
+          <w:b w:val="0"/>
+          <w:color w:val="000000"/>
+          <w:sz w:val="20"/>
+        </w:rPr>
+        <w:t>、</w:t>
+      </w:r>
+      <w:r>
+        <w:rPr>
+          <w:rFonts w:ascii="Consolas" w:hAnsi="Consolas" w:eastAsia="Microsoft YaHei" w:cs="Consolas"/>
+          <w:color w:val="000000"/>
+          <w:sz w:val="20"/>
+        </w:rPr>
+        <w:t>C1_CORE_DETAIL=0x17c01af5</w:t>
+      </w:r>
+      <w:r>
+        <w:rPr>
+          <w:rFonts w:ascii="Microsoft YaHei" w:hAnsi="Microsoft YaHei" w:eastAsia="Microsoft YaHei" w:cs="Microsoft YaHei"/>
+          <w:b w:val="0"/>
+          <w:color w:val="000000"/>
+          <w:sz w:val="20"/>
+        </w:rPr>
+        <w:t>、</w:t>
+      </w:r>
+      <w:r>
+        <w:rPr>
+          <w:rFonts w:ascii="Consolas" w:hAnsi="Consolas" w:eastAsia="Microsoft YaHei" w:cs="Consolas"/>
+          <w:color w:val="000000"/>
+          <w:sz w:val="20"/>
+        </w:rPr>
+        <w:t>C1_LANE_DETAIL=0x0dbf1af5</w:t>
+      </w:r>
+      <w:r>
+        <w:rPr>
+          <w:rFonts w:ascii="Microsoft YaHei" w:hAnsi="Microsoft YaHei" w:eastAsia="Microsoft YaHei" w:cs="Microsoft YaHei"/>
+          <w:b w:val="0"/>
+          <w:color w:val="000000"/>
+          <w:sz w:val="20"/>
+        </w:rPr>
+        <w:t>、</w:t>
+      </w:r>
+      <w:r>
+        <w:rPr>
+          <w:rFonts w:ascii="Consolas" w:hAnsi="Consolas" w:eastAsia="Microsoft YaHei" w:cs="Consolas"/>
+          <w:color w:val="000000"/>
+          <w:sz w:val="20"/>
+        </w:rPr>
+        <w:t>C1_IO_DETAIL=0x00021403</w:t>
+      </w:r>
+      <w:r>
+        <w:rPr>
+          <w:rFonts w:ascii="Microsoft YaHei" w:hAnsi="Microsoft YaHei" w:eastAsia="Microsoft YaHei" w:cs="Microsoft YaHei"/>
+          <w:b w:val="0"/>
+          <w:color w:val="000000"/>
+          <w:sz w:val="20"/>
+        </w:rPr>
+        <w:t>、</w:t>
+      </w:r>
+      <w:r>
+        <w:rPr>
+          <w:rFonts w:ascii="Consolas" w:hAnsi="Consolas" w:eastAsia="Microsoft YaHei" w:cs="Consolas"/>
+          <w:color w:val="000000"/>
+          <w:sz w:val="20"/>
+        </w:rPr>
+        <w:t>C2_DETAIL=0x0000200c</w:t>
+      </w:r>
+      <w:r>
+        <w:rPr>
+          <w:rFonts w:ascii="Microsoft YaHei" w:hAnsi="Microsoft YaHei" w:eastAsia="Microsoft YaHei" w:cs="Microsoft YaHei"/>
+          <w:b w:val="0"/>
+          <w:color w:val="000000"/>
+          <w:sz w:val="20"/>
+        </w:rPr>
+        <w:t>、</w:t>
+      </w:r>
+      <w:r>
+        <w:rPr>
+          <w:rFonts w:ascii="Consolas" w:hAnsi="Consolas" w:eastAsia="Microsoft YaHei" w:cs="Consolas"/>
+          <w:color w:val="000000"/>
+          <w:sz w:val="20"/>
+        </w:rPr>
+        <w:t>C2_CORE_DETAIL=0x17c01af5</w:t>
+      </w:r>
+      <w:r>
+        <w:rPr>
+          <w:rFonts w:ascii="Microsoft YaHei" w:hAnsi="Microsoft YaHei" w:eastAsia="Microsoft YaHei" w:cs="Microsoft YaHei"/>
+          <w:b w:val="0"/>
+          <w:color w:val="000000"/>
+          <w:sz w:val="20"/>
+        </w:rPr>
+        <w:t>、</w:t>
+      </w:r>
+      <w:r>
+        <w:rPr>
+          <w:rFonts w:ascii="Consolas" w:hAnsi="Consolas" w:eastAsia="Microsoft YaHei" w:cs="Consolas"/>
+          <w:color w:val="000000"/>
+          <w:sz w:val="20"/>
+        </w:rPr>
+        <w:t>C2_LANE_DETAIL=0x0dbf1af5</w:t>
+      </w:r>
+      <w:r>
+        <w:rPr>
+          <w:rFonts w:ascii="Microsoft YaHei" w:hAnsi="Microsoft YaHei" w:eastAsia="Microsoft YaHei" w:cs="Microsoft YaHei"/>
+          <w:b w:val="0"/>
+          <w:color w:val="000000"/>
+          <w:sz w:val="20"/>
+        </w:rPr>
+        <w:t xml:space="preserve">。dbg6 build 已生成 synth/opt checkpoint 和综合资源快照，但尚未生成 </w:t>
+      </w:r>
+      <w:r>
+        <w:rPr>
+          <w:rFonts w:ascii="Consolas" w:hAnsi="Consolas" w:eastAsia="Microsoft YaHei" w:cs="Consolas"/>
+          <w:color w:val="000000"/>
+          <w:sz w:val="20"/>
+        </w:rPr>
+        <w:t>.bit</w:t>
+      </w:r>
+      <w:r>
+        <w:rPr>
+          <w:rFonts w:ascii="Microsoft YaHei" w:hAnsi="Microsoft YaHei" w:eastAsia="Microsoft YaHei" w:cs="Microsoft YaHei"/>
+          <w:b w:val="0"/>
+          <w:color w:val="000000"/>
+          <w:sz w:val="20"/>
+        </w:rPr>
+        <w:t>，因此下一步是从 opt checkpoint 继续 place/route/write_bitstream 或重跑 full bitstream，再上板读取 bank6 与 RTL 期望对比。</w:t>
+      </w:r>
+    </w:p>
+    <w:p>
+      <w:pPr>
+        <w:pStyle w:val="ListBullet"/>
+      </w:pPr>
+      <w:r>
+        <w:rPr>
+          <w:rFonts w:ascii="Microsoft YaHei" w:hAnsi="Microsoft YaHei" w:eastAsia="Microsoft YaHei" w:cs="Microsoft YaHei"/>
+          <w:b w:val="0"/>
+          <w:color w:val="000000"/>
+          <w:sz w:val="20"/>
+        </w:rPr>
         <w:t>32x32/64x64/720p x4 和 720p x2 board validation 均待补。</w:t>
       </w:r>
     </w:p>
@@ -11192,7 +12282,7 @@
           <w:color w:val="000000"/>
           <w:sz w:val="20"/>
         </w:rPr>
-        <w:t>最新 dbg5/count-view 显示 C1 有部分计数，C2/C3/attention 为 0，下一步只挂一个 C1-&gt;C2 ready/valid 或 feature replay ready/valid 探针；</w:t>
+        <w:t>最新 dbg5/count-view 显示 C1 有部分计数，C2/C3/attention 为 0；dbg6 已把 C1/C2 detail bank 接出并通过 RTL raw compare，下一步是生成 dbg6 bitstream 后上板比对 bank6；</w:t>
       </w:r>
     </w:p>
     <w:p>
@@ -12666,7 +13756,7 @@
           <w:b w:val="0"/>
           <w:color w:val="000000"/>
         </w:rPr>
-        <w:t xml:space="preserve">。因此 dbg3 仍是 clean correctness baseline，dbg5 是最新定位证据：下一步排查点为 SPAB block1 C1-&gt;C2 ready/valid 或 feature replay ready/valid。证据见 </w:t>
+        <w:t xml:space="preserve">。因此 dbg3 仍是 clean correctness baseline，dbg5 将排查点压到 SPAB block1 C1-&gt;C2 ready/valid 或 feature replay ready/valid。证据见 </w:t>
       </w:r>
       <w:r>
         <w:rPr>
@@ -12674,6 +13764,271 @@
           <w:color w:val="000000"/>
         </w:rPr>
         <w:t>evidence/board_reports/jtag_true2x2_dbg5_countview_20260703/analysis.md</w:t>
+      </w:r>
+      <w:r>
+        <w:rPr>
+          <w:rFonts w:ascii="Microsoft YaHei" w:hAnsi="Microsoft YaHei" w:eastAsia="Microsoft YaHei" w:cs="Microsoft YaHei"/>
+          <w:b w:val="0"/>
+          <w:color w:val="000000"/>
+        </w:rPr>
+        <w:t>。</w:t>
+      </w:r>
+    </w:p>
+    <w:p>
+      <w:r>
+        <w:rPr>
+          <w:rFonts w:ascii="Microsoft YaHei" w:hAnsi="Microsoft YaHei" w:eastAsia="Microsoft YaHei" w:cs="Microsoft YaHei"/>
+          <w:b w:val="0"/>
+          <w:color w:val="000000"/>
+        </w:rPr>
+        <w:t xml:space="preserve">2026-07-03 进一步补充 </w:t>
+      </w:r>
+      <w:r>
+        <w:rPr>
+          <w:rFonts w:ascii="Consolas" w:hAnsi="Consolas" w:eastAsia="Microsoft YaHei" w:cs="Consolas"/>
+          <w:color w:val="000000"/>
+        </w:rPr>
+        <w:t>dbg6/C1-C2 detail</w:t>
+      </w:r>
+      <w:r>
+        <w:rPr>
+          <w:rFonts w:ascii="Microsoft YaHei" w:hAnsi="Microsoft YaHei" w:eastAsia="Microsoft YaHei" w:cs="Microsoft YaHei"/>
+          <w:b w:val="0"/>
+          <w:color w:val="000000"/>
+        </w:rPr>
+        <w:t xml:space="preserve">。该版本只接出已有 C1/C2 detail 信号到 JTAG debug bank6，行为级 RTL raw compare 仍为 </w:t>
+      </w:r>
+      <w:r>
+        <w:rPr>
+          <w:rFonts w:ascii="Consolas" w:hAnsi="Consolas" w:eastAsia="Microsoft YaHei" w:cs="Consolas"/>
+          <w:color w:val="000000"/>
+        </w:rPr>
+        <w:t>0/192</w:t>
+      </w:r>
+      <w:r>
+        <w:rPr>
+          <w:rFonts w:ascii="Microsoft YaHei" w:hAnsi="Microsoft YaHei" w:eastAsia="Microsoft YaHei" w:cs="Microsoft YaHei"/>
+          <w:b w:val="0"/>
+          <w:color w:val="000000"/>
+        </w:rPr>
+        <w:t xml:space="preserve"> mismatch、max diff 0、PSNR Infinity。RTL 期望 bank6 读数为：</w:t>
+      </w:r>
+      <w:r>
+        <w:rPr>
+          <w:rFonts w:ascii="Consolas" w:hAnsi="Consolas" w:eastAsia="Microsoft YaHei" w:cs="Consolas"/>
+          <w:color w:val="000000"/>
+        </w:rPr>
+        <w:t>C1_DETAIL=0x0000200c</w:t>
+      </w:r>
+      <w:r>
+        <w:rPr>
+          <w:rFonts w:ascii="Microsoft YaHei" w:hAnsi="Microsoft YaHei" w:eastAsia="Microsoft YaHei" w:cs="Microsoft YaHei"/>
+          <w:b w:val="0"/>
+          <w:color w:val="000000"/>
+        </w:rPr>
+        <w:t>、</w:t>
+      </w:r>
+      <w:r>
+        <w:rPr>
+          <w:rFonts w:ascii="Consolas" w:hAnsi="Consolas" w:eastAsia="Microsoft YaHei" w:cs="Consolas"/>
+          <w:color w:val="000000"/>
+        </w:rPr>
+        <w:t>C1_CORE_DETAIL=0x17c01af5</w:t>
+      </w:r>
+      <w:r>
+        <w:rPr>
+          <w:rFonts w:ascii="Microsoft YaHei" w:hAnsi="Microsoft YaHei" w:eastAsia="Microsoft YaHei" w:cs="Microsoft YaHei"/>
+          <w:b w:val="0"/>
+          <w:color w:val="000000"/>
+        </w:rPr>
+        <w:t>、</w:t>
+      </w:r>
+      <w:r>
+        <w:rPr>
+          <w:rFonts w:ascii="Consolas" w:hAnsi="Consolas" w:eastAsia="Microsoft YaHei" w:cs="Consolas"/>
+          <w:color w:val="000000"/>
+        </w:rPr>
+        <w:t>C1_LANE_DETAIL=0x0dbf1af5</w:t>
+      </w:r>
+      <w:r>
+        <w:rPr>
+          <w:rFonts w:ascii="Microsoft YaHei" w:hAnsi="Microsoft YaHei" w:eastAsia="Microsoft YaHei" w:cs="Microsoft YaHei"/>
+          <w:b w:val="0"/>
+          <w:color w:val="000000"/>
+        </w:rPr>
+        <w:t>、</w:t>
+      </w:r>
+      <w:r>
+        <w:rPr>
+          <w:rFonts w:ascii="Consolas" w:hAnsi="Consolas" w:eastAsia="Microsoft YaHei" w:cs="Consolas"/>
+          <w:color w:val="000000"/>
+        </w:rPr>
+        <w:t>C1_IO_DETAIL=0x00021403</w:t>
+      </w:r>
+      <w:r>
+        <w:rPr>
+          <w:rFonts w:ascii="Microsoft YaHei" w:hAnsi="Microsoft YaHei" w:eastAsia="Microsoft YaHei" w:cs="Microsoft YaHei"/>
+          <w:b w:val="0"/>
+          <w:color w:val="000000"/>
+        </w:rPr>
+        <w:t>、</w:t>
+      </w:r>
+      <w:r>
+        <w:rPr>
+          <w:rFonts w:ascii="Consolas" w:hAnsi="Consolas" w:eastAsia="Microsoft YaHei" w:cs="Consolas"/>
+          <w:color w:val="000000"/>
+        </w:rPr>
+        <w:t>C2_DETAIL=0x0000200c</w:t>
+      </w:r>
+      <w:r>
+        <w:rPr>
+          <w:rFonts w:ascii="Microsoft YaHei" w:hAnsi="Microsoft YaHei" w:eastAsia="Microsoft YaHei" w:cs="Microsoft YaHei"/>
+          <w:b w:val="0"/>
+          <w:color w:val="000000"/>
+        </w:rPr>
+        <w:t>、</w:t>
+      </w:r>
+      <w:r>
+        <w:rPr>
+          <w:rFonts w:ascii="Consolas" w:hAnsi="Consolas" w:eastAsia="Microsoft YaHei" w:cs="Consolas"/>
+          <w:color w:val="000000"/>
+        </w:rPr>
+        <w:t>C2_CORE_DETAIL=0x17c01af5</w:t>
+      </w:r>
+      <w:r>
+        <w:rPr>
+          <w:rFonts w:ascii="Microsoft YaHei" w:hAnsi="Microsoft YaHei" w:eastAsia="Microsoft YaHei" w:cs="Microsoft YaHei"/>
+          <w:b w:val="0"/>
+          <w:color w:val="000000"/>
+        </w:rPr>
+        <w:t>、</w:t>
+      </w:r>
+      <w:r>
+        <w:rPr>
+          <w:rFonts w:ascii="Consolas" w:hAnsi="Consolas" w:eastAsia="Microsoft YaHei" w:cs="Consolas"/>
+          <w:color w:val="000000"/>
+        </w:rPr>
+        <w:t>C2_LANE_DETAIL=0x0dbf1af5</w:t>
+      </w:r>
+      <w:r>
+        <w:rPr>
+          <w:rFonts w:ascii="Microsoft YaHei" w:hAnsi="Microsoft YaHei" w:eastAsia="Microsoft YaHei" w:cs="Microsoft YaHei"/>
+          <w:b w:val="0"/>
+          <w:color w:val="000000"/>
+        </w:rPr>
+        <w:t xml:space="preserve">。dbg6 bitstream build 当前为 </w:t>
+      </w:r>
+      <w:r>
+        <w:rPr>
+          <w:rFonts w:ascii="Consolas" w:hAnsi="Consolas" w:eastAsia="Microsoft YaHei" w:cs="Consolas"/>
+          <w:color w:val="000000"/>
+        </w:rPr>
+        <w:t>BUILD_PARTIAL / NO BITSTREAM</w:t>
+      </w:r>
+      <w:r>
+        <w:rPr>
+          <w:rFonts w:ascii="Microsoft YaHei" w:hAnsi="Microsoft YaHei" w:eastAsia="Microsoft YaHei" w:cs="Microsoft YaHei"/>
+          <w:b w:val="0"/>
+          <w:color w:val="000000"/>
+        </w:rPr>
+        <w:t xml:space="preserve">：初次构建推进到 </w:t>
+      </w:r>
+      <w:r>
+        <w:rPr>
+          <w:rFonts w:ascii="Consolas" w:hAnsi="Consolas" w:eastAsia="Microsoft YaHei" w:cs="Consolas"/>
+          <w:color w:val="000000"/>
+        </w:rPr>
+        <w:t>place_design</w:t>
+      </w:r>
+      <w:r>
+        <w:rPr>
+          <w:rFonts w:ascii="Microsoft YaHei" w:hAnsi="Microsoft YaHei" w:eastAsia="Microsoft YaHei" w:cs="Microsoft YaHei"/>
+          <w:b w:val="0"/>
+          <w:color w:val="000000"/>
+        </w:rPr>
+        <w:t xml:space="preserve">，已产生 synth/opt checkpoint 和综合资源快照 </w:t>
+      </w:r>
+      <w:r>
+        <w:rPr>
+          <w:rFonts w:ascii="Consolas" w:hAnsi="Consolas" w:eastAsia="Microsoft YaHei" w:cs="Consolas"/>
+          <w:color w:val="000000"/>
+        </w:rPr>
+        <w:t>LUT 42817、REG 115888、BRAM 311、DSP 126</w:t>
+      </w:r>
+      <w:r>
+        <w:rPr>
+          <w:rFonts w:ascii="Microsoft YaHei" w:hAnsi="Microsoft YaHei" w:eastAsia="Microsoft YaHei" w:cs="Microsoft YaHei"/>
+          <w:b w:val="0"/>
+          <w:color w:val="000000"/>
+        </w:rPr>
+        <w:t xml:space="preserve">；resume from opt checkpoint 在 </w:t>
+      </w:r>
+      <w:r>
+        <w:rPr>
+          <w:rFonts w:ascii="Consolas" w:hAnsi="Consolas" w:eastAsia="Microsoft YaHei" w:cs="Consolas"/>
+          <w:color w:val="000000"/>
+        </w:rPr>
+        <w:t>open_checkpoint</w:t>
+      </w:r>
+      <w:r>
+        <w:rPr>
+          <w:rFonts w:ascii="Microsoft YaHei" w:hAnsi="Microsoft YaHei" w:eastAsia="Microsoft YaHei" w:cs="Microsoft YaHei"/>
+          <w:b w:val="0"/>
+          <w:color w:val="000000"/>
+        </w:rPr>
+        <w:t xml:space="preserve"> 后 Vivado 返回 </w:t>
+      </w:r>
+      <w:r>
+        <w:rPr>
+          <w:rFonts w:ascii="Consolas" w:hAnsi="Consolas" w:eastAsia="Microsoft YaHei" w:cs="Consolas"/>
+          <w:color w:val="000000"/>
+        </w:rPr>
+        <w:t>-1</w:t>
+      </w:r>
+      <w:r>
+        <w:rPr>
+          <w:rFonts w:ascii="Microsoft YaHei" w:hAnsi="Microsoft YaHei" w:eastAsia="Microsoft YaHei" w:cs="Microsoft YaHei"/>
+          <w:b w:val="0"/>
+          <w:color w:val="000000"/>
+        </w:rPr>
+        <w:t xml:space="preserve">，未生成 </w:t>
+      </w:r>
+      <w:r>
+        <w:rPr>
+          <w:rFonts w:ascii="Consolas" w:hAnsi="Consolas" w:eastAsia="Microsoft YaHei" w:cs="Consolas"/>
+          <w:color w:val="000000"/>
+        </w:rPr>
+        <w:t>.bit</w:t>
+      </w:r>
+      <w:r>
+        <w:rPr>
+          <w:rFonts w:ascii="Microsoft YaHei" w:hAnsi="Microsoft YaHei" w:eastAsia="Microsoft YaHei" w:cs="Microsoft YaHei"/>
+          <w:b w:val="0"/>
+          <w:color w:val="000000"/>
+        </w:rPr>
+        <w:t xml:space="preserve">。因此 dbg6 的状态是“RTL 证据已可用、板端读取待 bitstream”，不是 mismatch 修复完成。证据见 </w:t>
+      </w:r>
+      <w:r>
+        <w:rPr>
+          <w:rFonts w:ascii="Consolas" w:hAnsi="Consolas" w:eastAsia="Microsoft YaHei" w:cs="Consolas"/>
+          <w:color w:val="000000"/>
+        </w:rPr>
+        <w:t>evidence/board_reports/jtag_true2x2_dbg6_c1c2_detail_20260703/analysis.md</w:t>
+      </w:r>
+      <w:r>
+        <w:rPr>
+          <w:rFonts w:ascii="Microsoft YaHei" w:hAnsi="Microsoft YaHei" w:eastAsia="Microsoft YaHei" w:cs="Microsoft YaHei"/>
+          <w:b w:val="0"/>
+          <w:color w:val="000000"/>
+        </w:rPr>
+        <w:t xml:space="preserve"> 和 </w:t>
+      </w:r>
+      <w:r>
+        <w:rPr>
+          <w:rFonts w:ascii="Consolas" w:hAnsi="Consolas" w:eastAsia="Microsoft YaHei" w:cs="Consolas"/>
+          <w:color w:val="000000"/>
+        </w:rPr>
+        <w:t>evidence/implementation_runs/jtag_true2x2_dbg6_build_attempt_20260703/summary.md</w:t>
       </w:r>
       <w:r>
         <w:rPr>
@@ -13007,6 +14362,8 @@
         <w:t>python W8A12_3lane\tools\generate_missing_evidence_plan.py</w:t>
         <w:br/>
         <w:t>python W8A12_3lane\tools\collect_submission_package.py</w:t>
+        <w:br/>
+        <w:t>python W8A12_3lane\tools\calc_bram_accounting.py</w:t>
         <w:br/>
         <w:t>python W8A12_3lane\tools\check_contest_scope_readiness.py</w:t>
         <w:br/>
@@ -13907,7 +15264,24 @@
                 <w:color w:val="000000"/>
                 <w:sz w:val="16"/>
               </w:rPr>
-              <w:t>evidence/board_reports/jtag_true2x2_dbg5_countview_20260703/analysis.md</w:t>
+              <w:t>evidence/board_reports/jtag_true2x2_dbg6_c1c2_detail_20260703/analysis.md</w:t>
+            </w:r>
+            <w:r>
+              <w:rPr>
+                <w:rFonts w:ascii="Microsoft YaHei" w:hAnsi="Microsoft YaHei" w:eastAsia="Microsoft YaHei" w:cs="Microsoft YaHei"/>
+                <w:b w:val="0"/>
+                <w:color w:val="000000"/>
+                <w:sz w:val="16"/>
+              </w:rPr>
+              <w:t>、</w:t>
+            </w:r>
+            <w:r>
+              <w:rPr>
+                <w:rFonts w:ascii="Consolas" w:hAnsi="Consolas" w:eastAsia="Microsoft YaHei" w:cs="Consolas"/>
+                <w:color w:val="000000"/>
+                <w:sz w:val="16"/>
+              </w:rPr>
+              <w:t>evidence/implementation_runs/jtag_true2x2_dbg6_build_attempt_20260703/summary.md</w:t>
             </w:r>
           </w:p>
         </w:tc>
@@ -14137,6 +15511,59 @@
                 <w:sz w:val="16"/>
               </w:rPr>
               <w:t>evidence/resource/A4_*_ooc/</w:t>
+            </w:r>
+          </w:p>
+        </w:tc>
+      </w:tr>
+      <w:tr>
+        <w:tc>
+          <w:tcPr>
+            <w:tcW w:type="dxa" w:w="3744"/>
+            <w:tcMar>
+              <w:top w:w="80" w:type="dxa"/>
+              <w:bottom w:w="80" w:type="dxa"/>
+              <w:start w:w="120" w:type="dxa"/>
+              <w:end w:w="120" w:type="dxa"/>
+            </w:tcMar>
+            <w:vAlign w:val="center"/>
+          </w:tcPr>
+          <w:p>
+            <w:pPr>
+              <w:spacing w:after="0"/>
+            </w:pPr>
+            <w:r>
+              <w:rPr>
+                <w:rFonts w:ascii="Microsoft YaHei" w:hAnsi="Microsoft YaHei" w:eastAsia="Microsoft YaHei" w:cs="Microsoft YaHei"/>
+                <w:b w:val="0"/>
+                <w:color w:val="000000"/>
+                <w:sz w:val="16"/>
+              </w:rPr>
+              <w:t>BRAM 消耗计算</w:t>
+            </w:r>
+          </w:p>
+        </w:tc>
+        <w:tc>
+          <w:tcPr>
+            <w:tcW w:type="dxa" w:w="5616"/>
+            <w:tcMar>
+              <w:top w:w="80" w:type="dxa"/>
+              <w:bottom w:w="80" w:type="dxa"/>
+              <w:start w:w="120" w:type="dxa"/>
+              <w:end w:w="120" w:type="dxa"/>
+            </w:tcMar>
+            <w:vAlign w:val="center"/>
+          </w:tcPr>
+          <w:p>
+            <w:pPr>
+              <w:spacing w:after="0"/>
+            </w:pPr>
+            <w:r>
+              <w:rPr>
+                <w:rFonts w:ascii="Consolas" w:hAnsi="Consolas" w:eastAsia="Microsoft YaHei" w:cs="Consolas"/>
+                <w:color w:val="000000"/>
+                <w:sz w:val="16"/>
+              </w:rPr>
+              <w:t>evidence/resource/bram_accounting/summary.md</w:t>
             </w:r>
           </w:p>
         </w:tc>
@@ -14966,14 +16393,14 @@
           <w:b w:val="0"/>
           <w:color w:val="000000"/>
         </w:rPr>
-        <w:t xml:space="preserve"> 仍不匹配。最新 dbg5/count-view 显示 block1 仅 C1 有部分计数，C2/C3/attention 为 0；最新 A5 32x32 attempt 也在 reference/program/DDR 输入均通过后停在 </w:t>
+        <w:t xml:space="preserve"> 仍不匹配。dbg5/count-view 显示 block1 仅 C1 有部分计数，C2/C3/attention 为 0；dbg6 已把 C1/C2 detail bank 接出，RTL 仍为 </w:t>
       </w:r>
       <w:r>
         <w:rPr>
           <w:rFonts w:ascii="Consolas" w:hAnsi="Consolas" w:eastAsia="Microsoft YaHei" w:cs="Consolas"/>
           <w:color w:val="000000"/>
         </w:rPr>
-        <w:t>frame_done=0/output_read_pixels=0</w:t>
+        <w:t>0/192</w:t>
       </w:r>
       <w:r>
         <w:rPr>
@@ -14981,7 +16408,22 @@
           <w:b w:val="0"/>
           <w:color w:val="000000"/>
         </w:rPr>
-        <w:t>。下一步应查 SPAB block1 C1-&gt;C2 ready/valid 和 feature replay ready/valid，并逐步补齐 32x32、64x64、720p x4 和 720p x2 board validation。</w:t>
+        <w:t xml:space="preserve"> mismatch，但 dbg6 bitstream 尚未生成。最新 A5 32x32 attempt 也在 reference/program/DDR 输入均通过后停在 </w:t>
+      </w:r>
+      <w:r>
+        <w:rPr>
+          <w:rFonts w:ascii="Consolas" w:hAnsi="Consolas" w:eastAsia="Microsoft YaHei" w:cs="Consolas"/>
+          <w:color w:val="000000"/>
+        </w:rPr>
+        <w:t>frame_done=0/output_read_pixels=0</w:t>
+      </w:r>
+      <w:r>
+        <w:rPr>
+          <w:rFonts w:ascii="Microsoft YaHei" w:hAnsi="Microsoft YaHei" w:eastAsia="Microsoft YaHei" w:cs="Microsoft YaHei"/>
+          <w:b w:val="0"/>
+          <w:color w:val="000000"/>
+        </w:rPr>
+        <w:t>。下一步应先完成 dbg6 bitstream/上板 bank6 比对，再查 SPAB block1 C1-&gt;C2 ready/valid 和 feature replay ready/valid，并逐步补齐 32x32、64x64、720p x4 和 720p x2 board validation。</w:t>
       </w:r>
     </w:p>
     <w:p>

</xml_diff>